<commit_message>
docs: cập nhật báo cáo, slide số liệu và kết quả kiểm thử (54/54 TC đạt)
- Chuyển script tạo Excel và báo cáo vào docs/tools
- TC-31 push FCM trên iPhone thật đạt, kèm ảnh màn hình khóa; thêm TC-52..54, BUG-17
- Báo cáo: mục âm báo/chuông, hạn chế iOS, số liệu kiểm thử mới; xuất lại docx và PDF
- Thêm docs/API.md

Co-Authored-By: Claude Opus 5.5 <noreply@anthropic.com>
</commit_message>
<xml_diff>
--- a/docs/bao-cao/Bao-cao-CDTN2.docx
+++ b/docs/bao-cao/Bao-cao-CDTN2.docx
@@ -185,9 +185,8 @@
         <w:spacing w:after="240"/>
         <w:jc w:val="center"/>
       </w:pPr>
-      <w:bookmarkStart w:id="0" w:name="_Toc243078166"/>
-      <w:r>
-        <w:lastRenderedPageBreak/>
+      <w:bookmarkStart w:id="0" w:name="_Toc244174617"/>
+      <w:r>
         <w:t>LỜI CẢM ƠN</w:t>
       </w:r>
       <w:bookmarkEnd w:id="0"/>
@@ -232,9 +231,8 @@
         <w:spacing w:after="240"/>
         <w:jc w:val="center"/>
       </w:pPr>
-      <w:bookmarkStart w:id="1" w:name="_Toc243078167"/>
-      <w:r>
-        <w:lastRenderedPageBreak/>
+      <w:bookmarkStart w:id="1" w:name="_Toc244174618"/>
+      <w:r>
         <w:t>MỤC LỤC</w:t>
       </w:r>
       <w:bookmarkEnd w:id="1"/>
@@ -242,7 +240,7 @@
     <w:sdt>
       <w:sdtPr>
         <w:alias w:val="Mục lục"/>
-        <w:id w:val="1580488328"/>
+        <w:id w:val="549574736"/>
       </w:sdtPr>
       <w:sdtEndPr/>
       <w:sdtContent>
@@ -270,7 +268,7 @@
           <w:r>
             <w:fldChar w:fldCharType="separate"/>
           </w:r>
-          <w:hyperlink w:anchor="_Toc243078166" w:history="1">
+          <w:hyperlink w:anchor="_Toc244174617" w:history="1">
             <w:r>
               <w:rPr>
                 <w:rStyle w:val="Hyperlink"/>
@@ -294,7 +292,7 @@
               <w:rPr>
                 <w:noProof/>
               </w:rPr>
-              <w:instrText xml:space="preserve"> PAGEREF _Toc243078166 \h </w:instrText>
+              <w:instrText xml:space="preserve"> PAGEREF _Toc244174617 \h </w:instrText>
             </w:r>
             <w:r>
               <w:rPr>
@@ -336,7 +334,7 @@
               <w14:ligatures w14:val="standardContextual"/>
             </w:rPr>
           </w:pPr>
-          <w:hyperlink w:anchor="_Toc243078167" w:history="1">
+          <w:hyperlink w:anchor="_Toc244174618" w:history="1">
             <w:r>
               <w:rPr>
                 <w:rStyle w:val="Hyperlink"/>
@@ -360,7 +358,7 @@
               <w:rPr>
                 <w:noProof/>
               </w:rPr>
-              <w:instrText xml:space="preserve"> PAGEREF _Toc243078167 \h </w:instrText>
+              <w:instrText xml:space="preserve"> PAGEREF _Toc244174618 \h </w:instrText>
             </w:r>
             <w:r>
               <w:rPr>
@@ -402,7 +400,7 @@
               <w14:ligatures w14:val="standardContextual"/>
             </w:rPr>
           </w:pPr>
-          <w:hyperlink w:anchor="_Toc243078168" w:history="1">
+          <w:hyperlink w:anchor="_Toc244174619" w:history="1">
             <w:r>
               <w:rPr>
                 <w:rStyle w:val="Hyperlink"/>
@@ -426,7 +424,7 @@
               <w:rPr>
                 <w:noProof/>
               </w:rPr>
-              <w:instrText xml:space="preserve"> PAGEREF _Toc243078168 \h </w:instrText>
+              <w:instrText xml:space="preserve"> PAGEREF _Toc244174619 \h </w:instrText>
             </w:r>
             <w:r>
               <w:rPr>
@@ -468,7 +466,7 @@
               <w14:ligatures w14:val="standardContextual"/>
             </w:rPr>
           </w:pPr>
-          <w:hyperlink w:anchor="_Toc243078169" w:history="1">
+          <w:hyperlink w:anchor="_Toc244174620" w:history="1">
             <w:r>
               <w:rPr>
                 <w:rStyle w:val="Hyperlink"/>
@@ -492,7 +490,7 @@
               <w:rPr>
                 <w:noProof/>
               </w:rPr>
-              <w:instrText xml:space="preserve"> PAGEREF _Toc243078169 \h </w:instrText>
+              <w:instrText xml:space="preserve"> PAGEREF _Toc244174620 \h </w:instrText>
             </w:r>
             <w:r>
               <w:rPr>
@@ -534,7 +532,7 @@
               <w14:ligatures w14:val="standardContextual"/>
             </w:rPr>
           </w:pPr>
-          <w:hyperlink w:anchor="_Toc243078170" w:history="1">
+          <w:hyperlink w:anchor="_Toc244174621" w:history="1">
             <w:r>
               <w:rPr>
                 <w:rStyle w:val="Hyperlink"/>
@@ -558,7 +556,7 @@
               <w:rPr>
                 <w:noProof/>
               </w:rPr>
-              <w:instrText xml:space="preserve"> PAGEREF _Toc243078170 \h </w:instrText>
+              <w:instrText xml:space="preserve"> PAGEREF _Toc244174621 \h </w:instrText>
             </w:r>
             <w:r>
               <w:rPr>
@@ -600,7 +598,7 @@
               <w14:ligatures w14:val="standardContextual"/>
             </w:rPr>
           </w:pPr>
-          <w:hyperlink w:anchor="_Toc243078171" w:history="1">
+          <w:hyperlink w:anchor="_Toc244174622" w:history="1">
             <w:r>
               <w:rPr>
                 <w:rStyle w:val="Hyperlink"/>
@@ -624,7 +622,7 @@
               <w:rPr>
                 <w:noProof/>
               </w:rPr>
-              <w:instrText xml:space="preserve"> PAGEREF _Toc243078171 \h </w:instrText>
+              <w:instrText xml:space="preserve"> PAGEREF _Toc244174622 \h </w:instrText>
             </w:r>
             <w:r>
               <w:rPr>
@@ -666,7 +664,7 @@
               <w14:ligatures w14:val="standardContextual"/>
             </w:rPr>
           </w:pPr>
-          <w:hyperlink w:anchor="_Toc243078172" w:history="1">
+          <w:hyperlink w:anchor="_Toc244174623" w:history="1">
             <w:r>
               <w:rPr>
                 <w:rStyle w:val="Hyperlink"/>
@@ -690,7 +688,7 @@
               <w:rPr>
                 <w:noProof/>
               </w:rPr>
-              <w:instrText xml:space="preserve"> PAGEREF _Toc243078172 \h </w:instrText>
+              <w:instrText xml:space="preserve"> PAGEREF _Toc244174623 \h </w:instrText>
             </w:r>
             <w:r>
               <w:rPr>
@@ -732,7 +730,7 @@
               <w14:ligatures w14:val="standardContextual"/>
             </w:rPr>
           </w:pPr>
-          <w:hyperlink w:anchor="_Toc243078173" w:history="1">
+          <w:hyperlink w:anchor="_Toc244174624" w:history="1">
             <w:r>
               <w:rPr>
                 <w:rStyle w:val="Hyperlink"/>
@@ -756,7 +754,7 @@
               <w:rPr>
                 <w:noProof/>
               </w:rPr>
-              <w:instrText xml:space="preserve"> PAGEREF _Toc243078173 \h </w:instrText>
+              <w:instrText xml:space="preserve"> PAGEREF _Toc244174624 \h </w:instrText>
             </w:r>
             <w:r>
               <w:rPr>
@@ -798,7 +796,7 @@
               <w14:ligatures w14:val="standardContextual"/>
             </w:rPr>
           </w:pPr>
-          <w:hyperlink w:anchor="_Toc243078174" w:history="1">
+          <w:hyperlink w:anchor="_Toc244174625" w:history="1">
             <w:r>
               <w:rPr>
                 <w:rStyle w:val="Hyperlink"/>
@@ -822,7 +820,7 @@
               <w:rPr>
                 <w:noProof/>
               </w:rPr>
-              <w:instrText xml:space="preserve"> PAGEREF _Toc243078174 \h </w:instrText>
+              <w:instrText xml:space="preserve"> PAGEREF _Toc244174625 \h </w:instrText>
             </w:r>
             <w:r>
               <w:rPr>
@@ -864,7 +862,7 @@
               <w14:ligatures w14:val="standardContextual"/>
             </w:rPr>
           </w:pPr>
-          <w:hyperlink w:anchor="_Toc243078175" w:history="1">
+          <w:hyperlink w:anchor="_Toc244174626" w:history="1">
             <w:r>
               <w:rPr>
                 <w:rStyle w:val="Hyperlink"/>
@@ -888,7 +886,7 @@
               <w:rPr>
                 <w:noProof/>
               </w:rPr>
-              <w:instrText xml:space="preserve"> PAGEREF _Toc243078175 \h </w:instrText>
+              <w:instrText xml:space="preserve"> PAGEREF _Toc244174626 \h </w:instrText>
             </w:r>
             <w:r>
               <w:rPr>
@@ -930,7 +928,7 @@
               <w14:ligatures w14:val="standardContextual"/>
             </w:rPr>
           </w:pPr>
-          <w:hyperlink w:anchor="_Toc243078176" w:history="1">
+          <w:hyperlink w:anchor="_Toc244174627" w:history="1">
             <w:r>
               <w:rPr>
                 <w:rStyle w:val="Hyperlink"/>
@@ -954,7 +952,7 @@
               <w:rPr>
                 <w:noProof/>
               </w:rPr>
-              <w:instrText xml:space="preserve"> PAGEREF _Toc243078176 \h </w:instrText>
+              <w:instrText xml:space="preserve"> PAGEREF _Toc244174627 \h </w:instrText>
             </w:r>
             <w:r>
               <w:rPr>
@@ -996,7 +994,7 @@
               <w14:ligatures w14:val="standardContextual"/>
             </w:rPr>
           </w:pPr>
-          <w:hyperlink w:anchor="_Toc243078177" w:history="1">
+          <w:hyperlink w:anchor="_Toc244174628" w:history="1">
             <w:r>
               <w:rPr>
                 <w:rStyle w:val="Hyperlink"/>
@@ -1020,7 +1018,7 @@
               <w:rPr>
                 <w:noProof/>
               </w:rPr>
-              <w:instrText xml:space="preserve"> PAGEREF _Toc243078177 \h </w:instrText>
+              <w:instrText xml:space="preserve"> PAGEREF _Toc244174628 \h </w:instrText>
             </w:r>
             <w:r>
               <w:rPr>
@@ -1062,7 +1060,7 @@
               <w14:ligatures w14:val="standardContextual"/>
             </w:rPr>
           </w:pPr>
-          <w:hyperlink w:anchor="_Toc243078178" w:history="1">
+          <w:hyperlink w:anchor="_Toc244174629" w:history="1">
             <w:r>
               <w:rPr>
                 <w:rStyle w:val="Hyperlink"/>
@@ -1086,7 +1084,7 @@
               <w:rPr>
                 <w:noProof/>
               </w:rPr>
-              <w:instrText xml:space="preserve"> PAGEREF _Toc243078178 \h </w:instrText>
+              <w:instrText xml:space="preserve"> PAGEREF _Toc244174629 \h </w:instrText>
             </w:r>
             <w:r>
               <w:rPr>
@@ -1128,7 +1126,7 @@
               <w14:ligatures w14:val="standardContextual"/>
             </w:rPr>
           </w:pPr>
-          <w:hyperlink w:anchor="_Toc243078179" w:history="1">
+          <w:hyperlink w:anchor="_Toc244174630" w:history="1">
             <w:r>
               <w:rPr>
                 <w:rStyle w:val="Hyperlink"/>
@@ -1152,7 +1150,7 @@
               <w:rPr>
                 <w:noProof/>
               </w:rPr>
-              <w:instrText xml:space="preserve"> PAGEREF _Toc243078179 \h </w:instrText>
+              <w:instrText xml:space="preserve"> PAGEREF _Toc244174630 \h </w:instrText>
             </w:r>
             <w:r>
               <w:rPr>
@@ -1194,7 +1192,7 @@
               <w14:ligatures w14:val="standardContextual"/>
             </w:rPr>
           </w:pPr>
-          <w:hyperlink w:anchor="_Toc243078180" w:history="1">
+          <w:hyperlink w:anchor="_Toc244174631" w:history="1">
             <w:r>
               <w:rPr>
                 <w:rStyle w:val="Hyperlink"/>
@@ -1218,7 +1216,7 @@
               <w:rPr>
                 <w:noProof/>
               </w:rPr>
-              <w:instrText xml:space="preserve"> PAGEREF _Toc243078180 \h </w:instrText>
+              <w:instrText xml:space="preserve"> PAGEREF _Toc244174631 \h </w:instrText>
             </w:r>
             <w:r>
               <w:rPr>
@@ -1260,7 +1258,7 @@
               <w14:ligatures w14:val="standardContextual"/>
             </w:rPr>
           </w:pPr>
-          <w:hyperlink w:anchor="_Toc243078181" w:history="1">
+          <w:hyperlink w:anchor="_Toc244174632" w:history="1">
             <w:r>
               <w:rPr>
                 <w:rStyle w:val="Hyperlink"/>
@@ -1284,7 +1282,7 @@
               <w:rPr>
                 <w:noProof/>
               </w:rPr>
-              <w:instrText xml:space="preserve"> PAGEREF _Toc243078181 \h </w:instrText>
+              <w:instrText xml:space="preserve"> PAGEREF _Toc244174632 \h </w:instrText>
             </w:r>
             <w:r>
               <w:rPr>
@@ -1326,7 +1324,7 @@
               <w14:ligatures w14:val="standardContextual"/>
             </w:rPr>
           </w:pPr>
-          <w:hyperlink w:anchor="_Toc243078182" w:history="1">
+          <w:hyperlink w:anchor="_Toc244174633" w:history="1">
             <w:r>
               <w:rPr>
                 <w:rStyle w:val="Hyperlink"/>
@@ -1350,7 +1348,7 @@
               <w:rPr>
                 <w:noProof/>
               </w:rPr>
-              <w:instrText xml:space="preserve"> PAGEREF _Toc243078182 \h </w:instrText>
+              <w:instrText xml:space="preserve"> PAGEREF _Toc244174633 \h </w:instrText>
             </w:r>
             <w:r>
               <w:rPr>
@@ -1367,7 +1365,7 @@
               <w:rPr>
                 <w:noProof/>
               </w:rPr>
-              <w:t>10</w:t>
+              <w:t>11</w:t>
             </w:r>
             <w:r>
               <w:rPr>
@@ -1392,13 +1390,13 @@
               <w14:ligatures w14:val="standardContextual"/>
             </w:rPr>
           </w:pPr>
-          <w:hyperlink w:anchor="_Toc243078183" w:history="1">
+          <w:hyperlink w:anchor="_Toc244174634" w:history="1">
             <w:r>
               <w:rPr>
                 <w:rStyle w:val="Hyperlink"/>
                 <w:noProof/>
               </w:rPr>
-              <w:t>UC-01. Cấp mã theo dõi cho người nhà</w:t>
+              <w:t>UC-01. Đăng ký người nhà được theo dõi</w:t>
             </w:r>
             <w:r>
               <w:rPr>
@@ -1416,7 +1414,7 @@
               <w:rPr>
                 <w:noProof/>
               </w:rPr>
-              <w:instrText xml:space="preserve"> PAGEREF _Toc243078183 \h </w:instrText>
+              <w:instrText xml:space="preserve"> PAGEREF _Toc244174634 \h </w:instrText>
             </w:r>
             <w:r>
               <w:rPr>
@@ -1433,7 +1431,7 @@
               <w:rPr>
                 <w:noProof/>
               </w:rPr>
-              <w:t>10</w:t>
+              <w:t>11</w:t>
             </w:r>
             <w:r>
               <w:rPr>
@@ -1458,13 +1456,13 @@
               <w14:ligatures w14:val="standardContextual"/>
             </w:rPr>
           </w:pPr>
-          <w:hyperlink w:anchor="_Toc243078184" w:history="1">
+          <w:hyperlink w:anchor="_Toc244174635" w:history="1">
             <w:r>
               <w:rPr>
                 <w:rStyle w:val="Hyperlink"/>
                 <w:noProof/>
               </w:rPr>
-              <w:t>UC-02. Liên kết người nhà với bệnh nhân</w:t>
+              <w:t>UC-02. Người nhà vào xem</w:t>
             </w:r>
             <w:r>
               <w:rPr>
@@ -1482,7 +1480,7 @@
               <w:rPr>
                 <w:noProof/>
               </w:rPr>
-              <w:instrText xml:space="preserve"> PAGEREF _Toc243078184 \h </w:instrText>
+              <w:instrText xml:space="preserve"> PAGEREF _Toc244174635 \h </w:instrText>
             </w:r>
             <w:r>
               <w:rPr>
@@ -1524,7 +1522,7 @@
               <w14:ligatures w14:val="standardContextual"/>
             </w:rPr>
           </w:pPr>
-          <w:hyperlink w:anchor="_Toc243078185" w:history="1">
+          <w:hyperlink w:anchor="_Toc244174636" w:history="1">
             <w:r>
               <w:rPr>
                 <w:rStyle w:val="Hyperlink"/>
@@ -1548,7 +1546,7 @@
               <w:rPr>
                 <w:noProof/>
               </w:rPr>
-              <w:instrText xml:space="preserve"> PAGEREF _Toc243078185 \h </w:instrText>
+              <w:instrText xml:space="preserve"> PAGEREF _Toc244174636 \h </w:instrText>
             </w:r>
             <w:r>
               <w:rPr>
@@ -1590,7 +1588,7 @@
               <w14:ligatures w14:val="standardContextual"/>
             </w:rPr>
           </w:pPr>
-          <w:hyperlink w:anchor="_Toc243078186" w:history="1">
+          <w:hyperlink w:anchor="_Toc244174637" w:history="1">
             <w:r>
               <w:rPr>
                 <w:rStyle w:val="Hyperlink"/>
@@ -1614,7 +1612,7 @@
               <w:rPr>
                 <w:noProof/>
               </w:rPr>
-              <w:instrText xml:space="preserve"> PAGEREF _Toc243078186 \h </w:instrText>
+              <w:instrText xml:space="preserve"> PAGEREF _Toc244174637 \h </w:instrText>
             </w:r>
             <w:r>
               <w:rPr>
@@ -1656,7 +1654,7 @@
               <w14:ligatures w14:val="standardContextual"/>
             </w:rPr>
           </w:pPr>
-          <w:hyperlink w:anchor="_Toc243078187" w:history="1">
+          <w:hyperlink w:anchor="_Toc244174638" w:history="1">
             <w:r>
               <w:rPr>
                 <w:rStyle w:val="Hyperlink"/>
@@ -1680,7 +1678,7 @@
               <w:rPr>
                 <w:noProof/>
               </w:rPr>
-              <w:instrText xml:space="preserve"> PAGEREF _Toc243078187 \h </w:instrText>
+              <w:instrText xml:space="preserve"> PAGEREF _Toc244174638 \h </w:instrText>
             </w:r>
             <w:r>
               <w:rPr>
@@ -1722,7 +1720,7 @@
               <w14:ligatures w14:val="standardContextual"/>
             </w:rPr>
           </w:pPr>
-          <w:hyperlink w:anchor="_Toc243078188" w:history="1">
+          <w:hyperlink w:anchor="_Toc244174639" w:history="1">
             <w:r>
               <w:rPr>
                 <w:rStyle w:val="Hyperlink"/>
@@ -1746,7 +1744,7 @@
               <w:rPr>
                 <w:noProof/>
               </w:rPr>
-              <w:instrText xml:space="preserve"> PAGEREF _Toc243078188 \h </w:instrText>
+              <w:instrText xml:space="preserve"> PAGEREF _Toc244174639 \h </w:instrText>
             </w:r>
             <w:r>
               <w:rPr>
@@ -1788,7 +1786,7 @@
               <w14:ligatures w14:val="standardContextual"/>
             </w:rPr>
           </w:pPr>
-          <w:hyperlink w:anchor="_Toc243078189" w:history="1">
+          <w:hyperlink w:anchor="_Toc244174640" w:history="1">
             <w:r>
               <w:rPr>
                 <w:rStyle w:val="Hyperlink"/>
@@ -1812,7 +1810,7 @@
               <w:rPr>
                 <w:noProof/>
               </w:rPr>
-              <w:instrText xml:space="preserve"> PAGEREF _Toc243078189 \h </w:instrText>
+              <w:instrText xml:space="preserve"> PAGEREF _Toc244174640 \h </w:instrText>
             </w:r>
             <w:r>
               <w:rPr>
@@ -1854,7 +1852,7 @@
               <w14:ligatures w14:val="standardContextual"/>
             </w:rPr>
           </w:pPr>
-          <w:hyperlink w:anchor="_Toc243078190" w:history="1">
+          <w:hyperlink w:anchor="_Toc244174641" w:history="1">
             <w:r>
               <w:rPr>
                 <w:rStyle w:val="Hyperlink"/>
@@ -1878,7 +1876,7 @@
               <w:rPr>
                 <w:noProof/>
               </w:rPr>
-              <w:instrText xml:space="preserve"> PAGEREF _Toc243078190 \h </w:instrText>
+              <w:instrText xml:space="preserve"> PAGEREF _Toc244174641 \h </w:instrText>
             </w:r>
             <w:r>
               <w:rPr>
@@ -1920,7 +1918,7 @@
               <w14:ligatures w14:val="standardContextual"/>
             </w:rPr>
           </w:pPr>
-          <w:hyperlink w:anchor="_Toc243078191" w:history="1">
+          <w:hyperlink w:anchor="_Toc244174642" w:history="1">
             <w:r>
               <w:rPr>
                 <w:rStyle w:val="Hyperlink"/>
@@ -1944,7 +1942,7 @@
               <w:rPr>
                 <w:noProof/>
               </w:rPr>
-              <w:instrText xml:space="preserve"> PAGEREF _Toc243078191 \h </w:instrText>
+              <w:instrText xml:space="preserve"> PAGEREF _Toc244174642 \h </w:instrText>
             </w:r>
             <w:r>
               <w:rPr>
@@ -1986,7 +1984,7 @@
               <w14:ligatures w14:val="standardContextual"/>
             </w:rPr>
           </w:pPr>
-          <w:hyperlink w:anchor="_Toc243078192" w:history="1">
+          <w:hyperlink w:anchor="_Toc244174643" w:history="1">
             <w:r>
               <w:rPr>
                 <w:rStyle w:val="Hyperlink"/>
@@ -2010,7 +2008,7 @@
               <w:rPr>
                 <w:noProof/>
               </w:rPr>
-              <w:instrText xml:space="preserve"> PAGEREF _Toc243078192 \h </w:instrText>
+              <w:instrText xml:space="preserve"> PAGEREF _Toc244174643 \h </w:instrText>
             </w:r>
             <w:r>
               <w:rPr>
@@ -2052,7 +2050,7 @@
               <w14:ligatures w14:val="standardContextual"/>
             </w:rPr>
           </w:pPr>
-          <w:hyperlink w:anchor="_Toc243078193" w:history="1">
+          <w:hyperlink w:anchor="_Toc244174644" w:history="1">
             <w:r>
               <w:rPr>
                 <w:rStyle w:val="Hyperlink"/>
@@ -2076,7 +2074,7 @@
               <w:rPr>
                 <w:noProof/>
               </w:rPr>
-              <w:instrText xml:space="preserve"> PAGEREF _Toc243078193 \h </w:instrText>
+              <w:instrText xml:space="preserve"> PAGEREF _Toc244174644 \h </w:instrText>
             </w:r>
             <w:r>
               <w:rPr>
@@ -2118,7 +2116,7 @@
               <w14:ligatures w14:val="standardContextual"/>
             </w:rPr>
           </w:pPr>
-          <w:hyperlink w:anchor="_Toc243078194" w:history="1">
+          <w:hyperlink w:anchor="_Toc244174645" w:history="1">
             <w:r>
               <w:rPr>
                 <w:rStyle w:val="Hyperlink"/>
@@ -2142,7 +2140,7 @@
               <w:rPr>
                 <w:noProof/>
               </w:rPr>
-              <w:instrText xml:space="preserve"> PAGEREF _Toc243078194 \h </w:instrText>
+              <w:instrText xml:space="preserve"> PAGEREF _Toc244174645 \h </w:instrText>
             </w:r>
             <w:r>
               <w:rPr>
@@ -2184,7 +2182,7 @@
               <w14:ligatures w14:val="standardContextual"/>
             </w:rPr>
           </w:pPr>
-          <w:hyperlink w:anchor="_Toc243078195" w:history="1">
+          <w:hyperlink w:anchor="_Toc244174646" w:history="1">
             <w:r>
               <w:rPr>
                 <w:rStyle w:val="Hyperlink"/>
@@ -2208,7 +2206,7 @@
               <w:rPr>
                 <w:noProof/>
               </w:rPr>
-              <w:instrText xml:space="preserve"> PAGEREF _Toc243078195 \h </w:instrText>
+              <w:instrText xml:space="preserve"> PAGEREF _Toc244174646 \h </w:instrText>
             </w:r>
             <w:r>
               <w:rPr>
@@ -2250,7 +2248,7 @@
               <w14:ligatures w14:val="standardContextual"/>
             </w:rPr>
           </w:pPr>
-          <w:hyperlink w:anchor="_Toc243078196" w:history="1">
+          <w:hyperlink w:anchor="_Toc244174647" w:history="1">
             <w:r>
               <w:rPr>
                 <w:rStyle w:val="Hyperlink"/>
@@ -2274,7 +2272,7 @@
               <w:rPr>
                 <w:noProof/>
               </w:rPr>
-              <w:instrText xml:space="preserve"> PAGEREF _Toc243078196 \h </w:instrText>
+              <w:instrText xml:space="preserve"> PAGEREF _Toc244174647 \h </w:instrText>
             </w:r>
             <w:r>
               <w:rPr>
@@ -2316,7 +2314,7 @@
               <w14:ligatures w14:val="standardContextual"/>
             </w:rPr>
           </w:pPr>
-          <w:hyperlink w:anchor="_Toc243078197" w:history="1">
+          <w:hyperlink w:anchor="_Toc244174648" w:history="1">
             <w:r>
               <w:rPr>
                 <w:rStyle w:val="Hyperlink"/>
@@ -2340,7 +2338,7 @@
               <w:rPr>
                 <w:noProof/>
               </w:rPr>
-              <w:instrText xml:space="preserve"> PAGEREF _Toc243078197 \h </w:instrText>
+              <w:instrText xml:space="preserve"> PAGEREF _Toc244174648 \h </w:instrText>
             </w:r>
             <w:r>
               <w:rPr>
@@ -2357,7 +2355,7 @@
               <w:rPr>
                 <w:noProof/>
               </w:rPr>
-              <w:t>16</w:t>
+              <w:t>17</w:t>
             </w:r>
             <w:r>
               <w:rPr>
@@ -2382,7 +2380,7 @@
               <w14:ligatures w14:val="standardContextual"/>
             </w:rPr>
           </w:pPr>
-          <w:hyperlink w:anchor="_Toc243078198" w:history="1">
+          <w:hyperlink w:anchor="_Toc244174649" w:history="1">
             <w:r>
               <w:rPr>
                 <w:rStyle w:val="Hyperlink"/>
@@ -2406,7 +2404,7 @@
               <w:rPr>
                 <w:noProof/>
               </w:rPr>
-              <w:instrText xml:space="preserve"> PAGEREF _Toc243078198 \h </w:instrText>
+              <w:instrText xml:space="preserve"> PAGEREF _Toc244174649 \h </w:instrText>
             </w:r>
             <w:r>
               <w:rPr>
@@ -2448,7 +2446,7 @@
               <w14:ligatures w14:val="standardContextual"/>
             </w:rPr>
           </w:pPr>
-          <w:hyperlink w:anchor="_Toc243078199" w:history="1">
+          <w:hyperlink w:anchor="_Toc244174650" w:history="1">
             <w:r>
               <w:rPr>
                 <w:rStyle w:val="Hyperlink"/>
@@ -2472,7 +2470,7 @@
               <w:rPr>
                 <w:noProof/>
               </w:rPr>
-              <w:instrText xml:space="preserve"> PAGEREF _Toc243078199 \h </w:instrText>
+              <w:instrText xml:space="preserve"> PAGEREF _Toc244174650 \h </w:instrText>
             </w:r>
             <w:r>
               <w:rPr>
@@ -2514,7 +2512,7 @@
               <w14:ligatures w14:val="standardContextual"/>
             </w:rPr>
           </w:pPr>
-          <w:hyperlink w:anchor="_Toc243078200" w:history="1">
+          <w:hyperlink w:anchor="_Toc244174651" w:history="1">
             <w:r>
               <w:rPr>
                 <w:rStyle w:val="Hyperlink"/>
@@ -2538,7 +2536,7 @@
               <w:rPr>
                 <w:noProof/>
               </w:rPr>
-              <w:instrText xml:space="preserve"> PAGEREF _Toc243078200 \h </w:instrText>
+              <w:instrText xml:space="preserve"> PAGEREF _Toc244174651 \h </w:instrText>
             </w:r>
             <w:r>
               <w:rPr>
@@ -2580,7 +2578,7 @@
               <w14:ligatures w14:val="standardContextual"/>
             </w:rPr>
           </w:pPr>
-          <w:hyperlink w:anchor="_Toc243078201" w:history="1">
+          <w:hyperlink w:anchor="_Toc244174652" w:history="1">
             <w:r>
               <w:rPr>
                 <w:rStyle w:val="Hyperlink"/>
@@ -2604,7 +2602,7 @@
               <w:rPr>
                 <w:noProof/>
               </w:rPr>
-              <w:instrText xml:space="preserve"> PAGEREF _Toc243078201 \h </w:instrText>
+              <w:instrText xml:space="preserve"> PAGEREF _Toc244174652 \h </w:instrText>
             </w:r>
             <w:r>
               <w:rPr>
@@ -2646,7 +2644,7 @@
               <w14:ligatures w14:val="standardContextual"/>
             </w:rPr>
           </w:pPr>
-          <w:hyperlink w:anchor="_Toc243078202" w:history="1">
+          <w:hyperlink w:anchor="_Toc244174653" w:history="1">
             <w:r>
               <w:rPr>
                 <w:rStyle w:val="Hyperlink"/>
@@ -2670,7 +2668,7 @@
               <w:rPr>
                 <w:noProof/>
               </w:rPr>
-              <w:instrText xml:space="preserve"> PAGEREF _Toc243078202 \h </w:instrText>
+              <w:instrText xml:space="preserve"> PAGEREF _Toc244174653 \h </w:instrText>
             </w:r>
             <w:r>
               <w:rPr>
@@ -2712,7 +2710,7 @@
               <w14:ligatures w14:val="standardContextual"/>
             </w:rPr>
           </w:pPr>
-          <w:hyperlink w:anchor="_Toc243078203" w:history="1">
+          <w:hyperlink w:anchor="_Toc244174654" w:history="1">
             <w:r>
               <w:rPr>
                 <w:rStyle w:val="Hyperlink"/>
@@ -2736,7 +2734,7 @@
               <w:rPr>
                 <w:noProof/>
               </w:rPr>
-              <w:instrText xml:space="preserve"> PAGEREF _Toc243078203 \h </w:instrText>
+              <w:instrText xml:space="preserve"> PAGEREF _Toc244174654 \h </w:instrText>
             </w:r>
             <w:r>
               <w:rPr>
@@ -2778,7 +2776,7 @@
               <w14:ligatures w14:val="standardContextual"/>
             </w:rPr>
           </w:pPr>
-          <w:hyperlink w:anchor="_Toc243078204" w:history="1">
+          <w:hyperlink w:anchor="_Toc244174655" w:history="1">
             <w:r>
               <w:rPr>
                 <w:rStyle w:val="Hyperlink"/>
@@ -2802,7 +2800,7 @@
               <w:rPr>
                 <w:noProof/>
               </w:rPr>
-              <w:instrText xml:space="preserve"> PAGEREF _Toc243078204 \h </w:instrText>
+              <w:instrText xml:space="preserve"> PAGEREF _Toc244174655 \h </w:instrText>
             </w:r>
             <w:r>
               <w:rPr>
@@ -2844,13 +2842,13 @@
               <w14:ligatures w14:val="standardContextual"/>
             </w:rPr>
           </w:pPr>
-          <w:hyperlink w:anchor="_Toc243078205" w:history="1">
+          <w:hyperlink w:anchor="_Toc244174656" w:history="1">
             <w:r>
               <w:rPr>
                 <w:rStyle w:val="Hyperlink"/>
                 <w:noProof/>
               </w:rPr>
-              <w:t>Cấp mã theo dõi và QR</w:t>
+              <w:t>Đăng ký người nhà được theo dõi</w:t>
             </w:r>
             <w:r>
               <w:rPr>
@@ -2868,7 +2866,7 @@
               <w:rPr>
                 <w:noProof/>
               </w:rPr>
-              <w:instrText xml:space="preserve"> PAGEREF _Toc243078205 \h </w:instrText>
+              <w:instrText xml:space="preserve"> PAGEREF _Toc244174656 \h </w:instrText>
             </w:r>
             <w:r>
               <w:rPr>
@@ -2910,7 +2908,7 @@
               <w14:ligatures w14:val="standardContextual"/>
             </w:rPr>
           </w:pPr>
-          <w:hyperlink w:anchor="_Toc243078206" w:history="1">
+          <w:hyperlink w:anchor="_Toc244174657" w:history="1">
             <w:r>
               <w:rPr>
                 <w:rStyle w:val="Hyperlink"/>
@@ -2934,7 +2932,7 @@
               <w:rPr>
                 <w:noProof/>
               </w:rPr>
-              <w:instrText xml:space="preserve"> PAGEREF _Toc243078206 \h </w:instrText>
+              <w:instrText xml:space="preserve"> PAGEREF _Toc244174657 \h </w:instrText>
             </w:r>
             <w:r>
               <w:rPr>
@@ -2976,7 +2974,7 @@
               <w14:ligatures w14:val="standardContextual"/>
             </w:rPr>
           </w:pPr>
-          <w:hyperlink w:anchor="_Toc243078207" w:history="1">
+          <w:hyperlink w:anchor="_Toc244174658" w:history="1">
             <w:r>
               <w:rPr>
                 <w:rStyle w:val="Hyperlink"/>
@@ -3000,7 +2998,7 @@
               <w:rPr>
                 <w:noProof/>
               </w:rPr>
-              <w:instrText xml:space="preserve"> PAGEREF _Toc243078207 \h </w:instrText>
+              <w:instrText xml:space="preserve"> PAGEREF _Toc244174658 \h </w:instrText>
             </w:r>
             <w:r>
               <w:rPr>
@@ -3017,7 +3015,7 @@
               <w:rPr>
                 <w:noProof/>
               </w:rPr>
-              <w:t>27</w:t>
+              <w:t>30</w:t>
             </w:r>
             <w:r>
               <w:rPr>
@@ -3042,7 +3040,7 @@
               <w14:ligatures w14:val="standardContextual"/>
             </w:rPr>
           </w:pPr>
-          <w:hyperlink w:anchor="_Toc243078208" w:history="1">
+          <w:hyperlink w:anchor="_Toc244174659" w:history="1">
             <w:r>
               <w:rPr>
                 <w:rStyle w:val="Hyperlink"/>
@@ -3066,7 +3064,7 @@
               <w:rPr>
                 <w:noProof/>
               </w:rPr>
-              <w:instrText xml:space="preserve"> PAGEREF _Toc243078208 \h </w:instrText>
+              <w:instrText xml:space="preserve"> PAGEREF _Toc244174659 \h </w:instrText>
             </w:r>
             <w:r>
               <w:rPr>
@@ -3083,7 +3081,7 @@
               <w:rPr>
                 <w:noProof/>
               </w:rPr>
-              <w:t>29</w:t>
+              <w:t>32</w:t>
             </w:r>
             <w:r>
               <w:rPr>
@@ -3108,7 +3106,7 @@
               <w14:ligatures w14:val="standardContextual"/>
             </w:rPr>
           </w:pPr>
-          <w:hyperlink w:anchor="_Toc243078209" w:history="1">
+          <w:hyperlink w:anchor="_Toc244174660" w:history="1">
             <w:r>
               <w:rPr>
                 <w:rStyle w:val="Hyperlink"/>
@@ -3132,7 +3130,7 @@
               <w:rPr>
                 <w:noProof/>
               </w:rPr>
-              <w:instrText xml:space="preserve"> PAGEREF _Toc243078209 \h </w:instrText>
+              <w:instrText xml:space="preserve"> PAGEREF _Toc244174660 \h </w:instrText>
             </w:r>
             <w:r>
               <w:rPr>
@@ -3149,7 +3147,7 @@
               <w:rPr>
                 <w:noProof/>
               </w:rPr>
-              <w:t>30</w:t>
+              <w:t>33</w:t>
             </w:r>
             <w:r>
               <w:rPr>
@@ -3174,7 +3172,7 @@
               <w14:ligatures w14:val="standardContextual"/>
             </w:rPr>
           </w:pPr>
-          <w:hyperlink w:anchor="_Toc243078210" w:history="1">
+          <w:hyperlink w:anchor="_Toc244174661" w:history="1">
             <w:r>
               <w:rPr>
                 <w:rStyle w:val="Hyperlink"/>
@@ -3198,7 +3196,7 @@
               <w:rPr>
                 <w:noProof/>
               </w:rPr>
-              <w:instrText xml:space="preserve"> PAGEREF _Toc243078210 \h </w:instrText>
+              <w:instrText xml:space="preserve"> PAGEREF _Toc244174661 \h </w:instrText>
             </w:r>
             <w:r>
               <w:rPr>
@@ -3215,7 +3213,7 @@
               <w:rPr>
                 <w:noProof/>
               </w:rPr>
-              <w:t>30</w:t>
+              <w:t>33</w:t>
             </w:r>
             <w:r>
               <w:rPr>
@@ -3240,7 +3238,7 @@
               <w14:ligatures w14:val="standardContextual"/>
             </w:rPr>
           </w:pPr>
-          <w:hyperlink w:anchor="_Toc243078211" w:history="1">
+          <w:hyperlink w:anchor="_Toc244174662" w:history="1">
             <w:r>
               <w:rPr>
                 <w:rStyle w:val="Hyperlink"/>
@@ -3264,7 +3262,7 @@
               <w:rPr>
                 <w:noProof/>
               </w:rPr>
-              <w:instrText xml:space="preserve"> PAGEREF _Toc243078211 \h </w:instrText>
+              <w:instrText xml:space="preserve"> PAGEREF _Toc244174662 \h </w:instrText>
             </w:r>
             <w:r>
               <w:rPr>
@@ -3281,7 +3279,7 @@
               <w:rPr>
                 <w:noProof/>
               </w:rPr>
-              <w:t>30</w:t>
+              <w:t>33</w:t>
             </w:r>
             <w:r>
               <w:rPr>
@@ -3306,7 +3304,7 @@
               <w14:ligatures w14:val="standardContextual"/>
             </w:rPr>
           </w:pPr>
-          <w:hyperlink w:anchor="_Toc243078212" w:history="1">
+          <w:hyperlink w:anchor="_Toc244174663" w:history="1">
             <w:r>
               <w:rPr>
                 <w:rStyle w:val="Hyperlink"/>
@@ -3330,7 +3328,7 @@
               <w:rPr>
                 <w:noProof/>
               </w:rPr>
-              <w:instrText xml:space="preserve"> PAGEREF _Toc243078212 \h </w:instrText>
+              <w:instrText xml:space="preserve"> PAGEREF _Toc244174663 \h </w:instrText>
             </w:r>
             <w:r>
               <w:rPr>
@@ -3347,7 +3345,7 @@
               <w:rPr>
                 <w:noProof/>
               </w:rPr>
-              <w:t>31</w:t>
+              <w:t>34</w:t>
             </w:r>
             <w:r>
               <w:rPr>
@@ -3372,7 +3370,7 @@
               <w14:ligatures w14:val="standardContextual"/>
             </w:rPr>
           </w:pPr>
-          <w:hyperlink w:anchor="_Toc243078213" w:history="1">
+          <w:hyperlink w:anchor="_Toc244174664" w:history="1">
             <w:r>
               <w:rPr>
                 <w:rStyle w:val="Hyperlink"/>
@@ -3396,7 +3394,7 @@
               <w:rPr>
                 <w:noProof/>
               </w:rPr>
-              <w:instrText xml:space="preserve"> PAGEREF _Toc243078213 \h </w:instrText>
+              <w:instrText xml:space="preserve"> PAGEREF _Toc244174664 \h </w:instrText>
             </w:r>
             <w:r>
               <w:rPr>
@@ -3413,7 +3411,7 @@
               <w:rPr>
                 <w:noProof/>
               </w:rPr>
-              <w:t>32</w:t>
+              <w:t>35</w:t>
             </w:r>
             <w:r>
               <w:rPr>
@@ -3438,7 +3436,7 @@
               <w14:ligatures w14:val="standardContextual"/>
             </w:rPr>
           </w:pPr>
-          <w:hyperlink w:anchor="_Toc243078214" w:history="1">
+          <w:hyperlink w:anchor="_Toc244174665" w:history="1">
             <w:r>
               <w:rPr>
                 <w:rStyle w:val="Hyperlink"/>
@@ -3462,7 +3460,7 @@
               <w:rPr>
                 <w:noProof/>
               </w:rPr>
-              <w:instrText xml:space="preserve"> PAGEREF _Toc243078214 \h </w:instrText>
+              <w:instrText xml:space="preserve"> PAGEREF _Toc244174665 \h </w:instrText>
             </w:r>
             <w:r>
               <w:rPr>
@@ -3479,7 +3477,7 @@
               <w:rPr>
                 <w:noProof/>
               </w:rPr>
-              <w:t>33</w:t>
+              <w:t>36</w:t>
             </w:r>
             <w:r>
               <w:rPr>
@@ -3504,7 +3502,7 @@
               <w14:ligatures w14:val="standardContextual"/>
             </w:rPr>
           </w:pPr>
-          <w:hyperlink w:anchor="_Toc243078215" w:history="1">
+          <w:hyperlink w:anchor="_Toc244174666" w:history="1">
             <w:r>
               <w:rPr>
                 <w:rStyle w:val="Hyperlink"/>
@@ -3528,7 +3526,7 @@
               <w:rPr>
                 <w:noProof/>
               </w:rPr>
-              <w:instrText xml:space="preserve"> PAGEREF _Toc243078215 \h </w:instrText>
+              <w:instrText xml:space="preserve"> PAGEREF _Toc244174666 \h </w:instrText>
             </w:r>
             <w:r>
               <w:rPr>
@@ -3545,7 +3543,7 @@
               <w:rPr>
                 <w:noProof/>
               </w:rPr>
-              <w:t>34</w:t>
+              <w:t>37</w:t>
             </w:r>
             <w:r>
               <w:rPr>
@@ -3570,7 +3568,7 @@
               <w14:ligatures w14:val="standardContextual"/>
             </w:rPr>
           </w:pPr>
-          <w:hyperlink w:anchor="_Toc243078216" w:history="1">
+          <w:hyperlink w:anchor="_Toc244174667" w:history="1">
             <w:r>
               <w:rPr>
                 <w:rStyle w:val="Hyperlink"/>
@@ -3594,7 +3592,7 @@
               <w:rPr>
                 <w:noProof/>
               </w:rPr>
-              <w:instrText xml:space="preserve"> PAGEREF _Toc243078216 \h </w:instrText>
+              <w:instrText xml:space="preserve"> PAGEREF _Toc244174667 \h </w:instrText>
             </w:r>
             <w:r>
               <w:rPr>
@@ -3611,7 +3609,7 @@
               <w:rPr>
                 <w:noProof/>
               </w:rPr>
-              <w:t>35</w:t>
+              <w:t>38</w:t>
             </w:r>
             <w:r>
               <w:rPr>
@@ -3636,7 +3634,7 @@
               <w14:ligatures w14:val="standardContextual"/>
             </w:rPr>
           </w:pPr>
-          <w:hyperlink w:anchor="_Toc243078217" w:history="1">
+          <w:hyperlink w:anchor="_Toc244174668" w:history="1">
             <w:r>
               <w:rPr>
                 <w:rStyle w:val="Hyperlink"/>
@@ -3660,7 +3658,7 @@
               <w:rPr>
                 <w:noProof/>
               </w:rPr>
-              <w:instrText xml:space="preserve"> PAGEREF _Toc243078217 \h </w:instrText>
+              <w:instrText xml:space="preserve"> PAGEREF _Toc244174668 \h </w:instrText>
             </w:r>
             <w:r>
               <w:rPr>
@@ -3677,7 +3675,7 @@
               <w:rPr>
                 <w:noProof/>
               </w:rPr>
-              <w:t>35</w:t>
+              <w:t>38</w:t>
             </w:r>
             <w:r>
               <w:rPr>
@@ -3702,7 +3700,7 @@
               <w14:ligatures w14:val="standardContextual"/>
             </w:rPr>
           </w:pPr>
-          <w:hyperlink w:anchor="_Toc243078218" w:history="1">
+          <w:hyperlink w:anchor="_Toc244174669" w:history="1">
             <w:r>
               <w:rPr>
                 <w:rStyle w:val="Hyperlink"/>
@@ -3726,7 +3724,7 @@
               <w:rPr>
                 <w:noProof/>
               </w:rPr>
-              <w:instrText xml:space="preserve"> PAGEREF _Toc243078218 \h </w:instrText>
+              <w:instrText xml:space="preserve"> PAGEREF _Toc244174669 \h </w:instrText>
             </w:r>
             <w:r>
               <w:rPr>
@@ -3743,7 +3741,7 @@
               <w:rPr>
                 <w:noProof/>
               </w:rPr>
-              <w:t>35</w:t>
+              <w:t>38</w:t>
             </w:r>
             <w:r>
               <w:rPr>
@@ -3768,7 +3766,7 @@
               <w14:ligatures w14:val="standardContextual"/>
             </w:rPr>
           </w:pPr>
-          <w:hyperlink w:anchor="_Toc243078219" w:history="1">
+          <w:hyperlink w:anchor="_Toc244174670" w:history="1">
             <w:r>
               <w:rPr>
                 <w:rStyle w:val="Hyperlink"/>
@@ -3792,7 +3790,7 @@
               <w:rPr>
                 <w:noProof/>
               </w:rPr>
-              <w:instrText xml:space="preserve"> PAGEREF _Toc243078219 \h </w:instrText>
+              <w:instrText xml:space="preserve"> PAGEREF _Toc244174670 \h </w:instrText>
             </w:r>
             <w:r>
               <w:rPr>
@@ -3809,7 +3807,7 @@
               <w:rPr>
                 <w:noProof/>
               </w:rPr>
-              <w:t>36</w:t>
+              <w:t>39</w:t>
             </w:r>
             <w:r>
               <w:rPr>
@@ -3834,7 +3832,7 @@
               <w14:ligatures w14:val="standardContextual"/>
             </w:rPr>
           </w:pPr>
-          <w:hyperlink w:anchor="_Toc243078220" w:history="1">
+          <w:hyperlink w:anchor="_Toc244174671" w:history="1">
             <w:r>
               <w:rPr>
                 <w:rStyle w:val="Hyperlink"/>
@@ -3858,7 +3856,7 @@
               <w:rPr>
                 <w:noProof/>
               </w:rPr>
-              <w:instrText xml:space="preserve"> PAGEREF _Toc243078220 \h </w:instrText>
+              <w:instrText xml:space="preserve"> PAGEREF _Toc244174671 \h </w:instrText>
             </w:r>
             <w:r>
               <w:rPr>
@@ -3875,7 +3873,7 @@
               <w:rPr>
                 <w:noProof/>
               </w:rPr>
-              <w:t>36</w:t>
+              <w:t>39</w:t>
             </w:r>
             <w:r>
               <w:rPr>
@@ -3900,7 +3898,7 @@
               <w14:ligatures w14:val="standardContextual"/>
             </w:rPr>
           </w:pPr>
-          <w:hyperlink w:anchor="_Toc243078221" w:history="1">
+          <w:hyperlink w:anchor="_Toc244174672" w:history="1">
             <w:r>
               <w:rPr>
                 <w:rStyle w:val="Hyperlink"/>
@@ -3924,7 +3922,7 @@
               <w:rPr>
                 <w:noProof/>
               </w:rPr>
-              <w:instrText xml:space="preserve"> PAGEREF _Toc243078221 \h </w:instrText>
+              <w:instrText xml:space="preserve"> PAGEREF _Toc244174672 \h </w:instrText>
             </w:r>
             <w:r>
               <w:rPr>
@@ -3941,7 +3939,7 @@
               <w:rPr>
                 <w:noProof/>
               </w:rPr>
-              <w:t>37</w:t>
+              <w:t>40</w:t>
             </w:r>
             <w:r>
               <w:rPr>
@@ -3966,7 +3964,7 @@
               <w14:ligatures w14:val="standardContextual"/>
             </w:rPr>
           </w:pPr>
-          <w:hyperlink w:anchor="_Toc243078222" w:history="1">
+          <w:hyperlink w:anchor="_Toc244174673" w:history="1">
             <w:r>
               <w:rPr>
                 <w:rStyle w:val="Hyperlink"/>
@@ -3990,7 +3988,7 @@
               <w:rPr>
                 <w:noProof/>
               </w:rPr>
-              <w:instrText xml:space="preserve"> PAGEREF _Toc243078222 \h </w:instrText>
+              <w:instrText xml:space="preserve"> PAGEREF _Toc244174673 \h </w:instrText>
             </w:r>
             <w:r>
               <w:rPr>
@@ -4007,7 +4005,7 @@
               <w:rPr>
                 <w:noProof/>
               </w:rPr>
-              <w:t>37</w:t>
+              <w:t>40</w:t>
             </w:r>
             <w:r>
               <w:rPr>
@@ -4032,7 +4030,7 @@
               <w14:ligatures w14:val="standardContextual"/>
             </w:rPr>
           </w:pPr>
-          <w:hyperlink w:anchor="_Toc243078223" w:history="1">
+          <w:hyperlink w:anchor="_Toc244174674" w:history="1">
             <w:r>
               <w:rPr>
                 <w:rStyle w:val="Hyperlink"/>
@@ -4056,7 +4054,7 @@
               <w:rPr>
                 <w:noProof/>
               </w:rPr>
-              <w:instrText xml:space="preserve"> PAGEREF _Toc243078223 \h </w:instrText>
+              <w:instrText xml:space="preserve"> PAGEREF _Toc244174674 \h </w:instrText>
             </w:r>
             <w:r>
               <w:rPr>
@@ -4073,7 +4071,7 @@
               <w:rPr>
                 <w:noProof/>
               </w:rPr>
-              <w:t>37</w:t>
+              <w:t>40</w:t>
             </w:r>
             <w:r>
               <w:rPr>
@@ -4098,7 +4096,7 @@
               <w14:ligatures w14:val="standardContextual"/>
             </w:rPr>
           </w:pPr>
-          <w:hyperlink w:anchor="_Toc243078224" w:history="1">
+          <w:hyperlink w:anchor="_Toc244174675" w:history="1">
             <w:r>
               <w:rPr>
                 <w:rStyle w:val="Hyperlink"/>
@@ -4122,7 +4120,7 @@
               <w:rPr>
                 <w:noProof/>
               </w:rPr>
-              <w:instrText xml:space="preserve"> PAGEREF _Toc243078224 \h </w:instrText>
+              <w:instrText xml:space="preserve"> PAGEREF _Toc244174675 \h </w:instrText>
             </w:r>
             <w:r>
               <w:rPr>
@@ -4139,7 +4137,7 @@
               <w:rPr>
                 <w:noProof/>
               </w:rPr>
-              <w:t>37</w:t>
+              <w:t>40</w:t>
             </w:r>
             <w:r>
               <w:rPr>
@@ -4164,7 +4162,7 @@
               <w14:ligatures w14:val="standardContextual"/>
             </w:rPr>
           </w:pPr>
-          <w:hyperlink w:anchor="_Toc243078225" w:history="1">
+          <w:hyperlink w:anchor="_Toc244174676" w:history="1">
             <w:r>
               <w:rPr>
                 <w:rStyle w:val="Hyperlink"/>
@@ -4188,7 +4186,7 @@
               <w:rPr>
                 <w:noProof/>
               </w:rPr>
-              <w:instrText xml:space="preserve"> PAGEREF _Toc243078225 \h </w:instrText>
+              <w:instrText xml:space="preserve"> PAGEREF _Toc244174676 \h </w:instrText>
             </w:r>
             <w:r>
               <w:rPr>
@@ -4205,7 +4203,7 @@
               <w:rPr>
                 <w:noProof/>
               </w:rPr>
-              <w:t>38</w:t>
+              <w:t>41</w:t>
             </w:r>
             <w:r>
               <w:rPr>
@@ -4230,7 +4228,7 @@
               <w14:ligatures w14:val="standardContextual"/>
             </w:rPr>
           </w:pPr>
-          <w:hyperlink w:anchor="_Toc243078226" w:history="1">
+          <w:hyperlink w:anchor="_Toc244174677" w:history="1">
             <w:r>
               <w:rPr>
                 <w:rStyle w:val="Hyperlink"/>
@@ -4254,7 +4252,7 @@
               <w:rPr>
                 <w:noProof/>
               </w:rPr>
-              <w:instrText xml:space="preserve"> PAGEREF _Toc243078226 \h </w:instrText>
+              <w:instrText xml:space="preserve"> PAGEREF _Toc244174677 \h </w:instrText>
             </w:r>
             <w:r>
               <w:rPr>
@@ -4271,7 +4269,7 @@
               <w:rPr>
                 <w:noProof/>
               </w:rPr>
-              <w:t>39</w:t>
+              <w:t>42</w:t>
             </w:r>
             <w:r>
               <w:rPr>
@@ -4295,9 +4293,8 @@
         <w:spacing w:after="240"/>
         <w:jc w:val="center"/>
       </w:pPr>
-      <w:bookmarkStart w:id="2" w:name="_Toc243078168"/>
-      <w:r>
-        <w:lastRenderedPageBreak/>
+      <w:bookmarkStart w:id="2" w:name="_Toc244174619"/>
+      <w:r>
         <w:t>DANH MỤC TỪ VIẾT TẮT</w:t>
       </w:r>
       <w:bookmarkEnd w:id="2"/>
@@ -4485,10 +4482,10 @@
           <w:b/>
           <w:bCs/>
         </w:rPr>
-        <w:t>QR</w:t>
-      </w:r>
-      <w:r>
-        <w:t xml:space="preserve"> – Quick Response code, mã vạch hai chiều</w:t>
+        <w:t>SSE</w:t>
+      </w:r>
+      <w:r>
+        <w:t xml:space="preserve"> – Server-Sent Events, kênh máy chủ đẩy dữ liệu tới trình duyệt</w:t>
       </w:r>
     </w:p>
     <w:p>
@@ -4506,10 +4503,10 @@
           <w:b/>
           <w:bCs/>
         </w:rPr>
-        <w:t>SSE</w:t>
-      </w:r>
-      <w:r>
-        <w:t xml:space="preserve"> – Server-Sent Events, kênh máy chủ đẩy dữ liệu tới trình duyệt</w:t>
+        <w:t>TC</w:t>
+      </w:r>
+      <w:r>
+        <w:t xml:space="preserve"> – Test case, kịch bản kiểm thử</w:t>
       </w:r>
     </w:p>
     <w:p>
@@ -4527,11 +4524,78 @@
           <w:b/>
           <w:bCs/>
         </w:rPr>
-        <w:t>TC</w:t>
-      </w:r>
-      <w:r>
-        <w:t xml:space="preserve"> – Test case, kịch bản kiểm thử</w:t>
-      </w:r>
+        <w:t>UC</w:t>
+      </w:r>
+      <w:r>
+        <w:t xml:space="preserve"> – Use case, ca sử dụng</w:t>
+      </w:r>
+    </w:p>
+    <w:p>
+      <w:pPr>
+        <w:pStyle w:val="Heading1"/>
+        <w:pageBreakBefore/>
+        <w:spacing w:after="240"/>
+        <w:jc w:val="center"/>
+      </w:pPr>
+      <w:bookmarkStart w:id="3" w:name="_Toc244174620"/>
+      <w:r>
+        <w:t>CHƯƠNG 1. MỞ ĐẦU</w:t>
+      </w:r>
+      <w:bookmarkEnd w:id="3"/>
+    </w:p>
+    <w:p>
+      <w:pPr>
+        <w:pStyle w:val="Heading2"/>
+        <w:keepNext/>
+        <w:spacing w:before="240" w:after="120"/>
+      </w:pPr>
+      <w:bookmarkStart w:id="4" w:name="_Toc244174621"/>
+      <w:r>
+        <w:t>1.1. Lý do chọn đề tài</w:t>
+      </w:r>
+      <w:bookmarkEnd w:id="4"/>
+    </w:p>
+    <w:p>
+      <w:pPr>
+        <w:spacing w:before="60" w:after="100" w:line="340" w:lineRule="auto"/>
+        <w:ind w:firstLine="567"/>
+        <w:jc w:val="both"/>
+      </w:pPr>
+      <w:r>
+        <w:t>Tại các bệnh viện, tình trạng ca phẫu thuật thường được hiển thị trên một số màn hình TV chung đặt trước khu phẫu thuật. Số màn hình có hạn, trong khi ở bệnh viện lớn lượng người nhà rất đông, dẫn đến ùn tắc và mất trật tự tại khu vực chờ. Người nhà phải đứng chờ nhiều giờ hoặc liên tục quay lại chỉ để biết một trạng thái đơn giản như ca mổ đã bắt đầu hay đã xong; nhân viên y tế cũng phải trả lời lặp đi lặp lại cùng một câu hỏi.</w:t>
+      </w:r>
+    </w:p>
+    <w:p>
+      <w:pPr>
+        <w:spacing w:before="60" w:after="100" w:line="340" w:lineRule="auto"/>
+        <w:ind w:firstLine="567"/>
+        <w:jc w:val="both"/>
+      </w:pPr>
+      <w:r>
+        <w:t xml:space="preserve">Hầu hết người nhà đều có điện thoại thông minh. Nếu thông tin trạng thái được đưa trực tiếp tới điện thoại của đúng người được phép theo dõi, người nhà có thể rời khu vực chờ mà vẫn nắm được tình hình, còn bệnh viện giảm được áp lực và giữ trật tự. Đó là lý do nhóm chọn đề tài </w:t>
+      </w:r>
+      <w:r>
+        <w:rPr>
+          <w:b/>
+          <w:bCs/>
+        </w:rPr>
+        <w:t>“Hệ thống Theo dõi và Thông báo tình trạng bệnh nhân”</w:t>
+      </w:r>
+      <w:r>
+        <w:t>.</w:t>
+      </w:r>
+    </w:p>
+    <w:p>
+      <w:pPr>
+        <w:pStyle w:val="Heading2"/>
+        <w:keepNext/>
+        <w:spacing w:before="240" w:after="120"/>
+      </w:pPr>
+      <w:bookmarkStart w:id="5" w:name="_Toc244174622"/>
+      <w:r>
+        <w:t>1.2. Mục tiêu</w:t>
+      </w:r>
+      <w:bookmarkEnd w:id="5"/>
     </w:p>
     <w:p>
       <w:pPr>
@@ -4548,79 +4612,11 @@
           <w:b/>
           <w:bCs/>
         </w:rPr>
-        <w:t>UC</w:t>
-      </w:r>
-      <w:r>
-        <w:t xml:space="preserve"> – Use case, ca sử dụng</w:t>
-      </w:r>
-    </w:p>
-    <w:p>
-      <w:pPr>
-        <w:pStyle w:val="Heading1"/>
-        <w:pageBreakBefore/>
-        <w:spacing w:after="240"/>
-        <w:jc w:val="center"/>
-      </w:pPr>
-      <w:bookmarkStart w:id="3" w:name="_Toc243078169"/>
-      <w:r>
-        <w:lastRenderedPageBreak/>
-        <w:t>CHƯƠNG 1. MỞ ĐẦU</w:t>
-      </w:r>
-      <w:bookmarkEnd w:id="3"/>
-    </w:p>
-    <w:p>
-      <w:pPr>
-        <w:pStyle w:val="Heading2"/>
-        <w:keepNext/>
-        <w:spacing w:before="240" w:after="120"/>
-      </w:pPr>
-      <w:bookmarkStart w:id="4" w:name="_Toc243078170"/>
-      <w:r>
-        <w:t>1.1. Lý do chọn đề tài</w:t>
-      </w:r>
-      <w:bookmarkEnd w:id="4"/>
-    </w:p>
-    <w:p>
-      <w:pPr>
-        <w:spacing w:before="60" w:after="100" w:line="340" w:lineRule="auto"/>
-        <w:ind w:firstLine="567"/>
-        <w:jc w:val="both"/>
-      </w:pPr>
-      <w:r>
-        <w:t>Tại các bệnh viện, tình trạng ca phẫu thuật thường được hiển thị trên một số màn hình TV chung đặt trước khu phẫu thuật. Số màn hình có hạn, trong khi ở bệnh viện lớn lượng người nhà rất đông, dẫn đến ùn tắc và mất trật tự tại khu vực chờ. Người nhà phải đứng chờ nhiều giờ hoặc liên tục quay lại chỉ để biết một trạng thái đơn giản như ca mổ đã bắt đầu hay đã xong; nhân viên y tế cũng phải trả lời lặp đi lặp lại cùng một câu hỏi.</w:t>
-      </w:r>
-    </w:p>
-    <w:p>
-      <w:pPr>
-        <w:spacing w:before="60" w:after="100" w:line="340" w:lineRule="auto"/>
-        <w:ind w:firstLine="567"/>
-        <w:jc w:val="both"/>
-      </w:pPr>
-      <w:r>
-        <w:t xml:space="preserve">Hầu hết người nhà đều có điện thoại thông minh. Nếu thông tin trạng thái được đưa trực tiếp tới điện thoại của đúng người được phép theo dõi, người nhà có thể rời khu vực chờ mà vẫn nắm được tình hình, còn bệnh viện giảm được áp lực và giữ trật tự. Đó là lý do nhóm chọn đề tài </w:t>
-      </w:r>
-      <w:r>
-        <w:rPr>
-          <w:b/>
-          <w:bCs/>
-        </w:rPr>
-        <w:t>“Hệ thống Theo dõi và Thông báo tình trạng bệnh nhân”</w:t>
-      </w:r>
-      <w:r>
-        <w:t>.</w:t>
-      </w:r>
-    </w:p>
-    <w:p>
-      <w:pPr>
-        <w:pStyle w:val="Heading2"/>
-        <w:keepNext/>
-        <w:spacing w:before="240" w:after="120"/>
-      </w:pPr>
-      <w:bookmarkStart w:id="5" w:name="_Toc243078171"/>
-      <w:r>
-        <w:t>1.2. Mục tiêu</w:t>
-      </w:r>
-      <w:bookmarkEnd w:id="5"/>
+        <w:t>Cá nhân hóa thông tin:</w:t>
+      </w:r>
+      <w:r>
+        <w:t xml:space="preserve"> mỗi người nhà chỉ xem được bệnh nhân mình được bệnh viện cấp quyền.</w:t>
+      </w:r>
     </w:p>
     <w:p>
       <w:pPr>
@@ -4637,10 +4633,10 @@
           <w:b/>
           <w:bCs/>
         </w:rPr>
-        <w:t>Cá nhân hóa thông tin:</w:t>
-      </w:r>
-      <w:r>
-        <w:t xml:space="preserve"> mỗi người nhà chỉ xem được bệnh nhân mình được bệnh viện cấp quyền.</w:t>
+        <w:t>Cập nhật tức thời:</w:t>
+      </w:r>
+      <w:r>
+        <w:t xml:space="preserve"> người nhà nhận thông báo ngay khi trạng thái thay đổi (mục tiêu dưới 5 giây).</w:t>
       </w:r>
     </w:p>
     <w:p>
@@ -4658,10 +4654,10 @@
           <w:b/>
           <w:bCs/>
         </w:rPr>
-        <w:t>Cập nhật tức thời:</w:t>
-      </w:r>
-      <w:r>
-        <w:t xml:space="preserve"> người nhà nhận thông báo ngay khi trạng thái thay đổi (mục tiêu dưới 5 giây).</w:t>
+        <w:t>Giảm tập trung tại khu vực chờ</w:t>
+      </w:r>
+      <w:r>
+        <w:t xml:space="preserve"> và giảm số câu hỏi lặp lại cho nhân viên.</w:t>
       </w:r>
     </w:p>
     <w:p>
@@ -4679,10 +4675,10 @@
           <w:b/>
           <w:bCs/>
         </w:rPr>
-        <w:t>Giảm tập trung tại khu vực chờ</w:t>
-      </w:r>
-      <w:r>
-        <w:t xml:space="preserve"> và giảm số câu hỏi lặp lại cho nhân viên.</w:t>
+        <w:t>Bảo vệ quyền riêng tư:</w:t>
+      </w:r>
+      <w:r>
+        <w:t xml:space="preserve"> chỉ người nhà được nhân viên đăng ký mới xem được, không tra cứu tự do, nội dung thông báo kín đáo.</w:t>
       </w:r>
     </w:p>
     <w:p>
@@ -4700,27 +4696,6 @@
           <w:b/>
           <w:bCs/>
         </w:rPr>
-        <w:t>Bảo vệ quyền riêng tư:</w:t>
-      </w:r>
-      <w:r>
-        <w:t xml:space="preserve"> cấp quyền bằng mã/QR có hạn, không tra cứu tự do, nội dung thông báo kín đáo.</w:t>
-      </w:r>
-    </w:p>
-    <w:p>
-      <w:pPr>
-        <w:pStyle w:val="ListParagraph"/>
-        <w:numPr>
-          <w:ilvl w:val="0"/>
-          <w:numId w:val="2"/>
-        </w:numPr>
-        <w:spacing w:after="60" w:line="320" w:lineRule="auto"/>
-        <w:jc w:val="both"/>
-      </w:pPr>
-      <w:r>
-        <w:rPr>
-          <w:b/>
-          <w:bCs/>
-        </w:rPr>
         <w:t>Nền tảng mở rộng được</w:t>
       </w:r>
       <w:r>
@@ -4733,7 +4708,7 @@
         <w:keepNext/>
         <w:spacing w:before="240" w:after="120"/>
       </w:pPr>
-      <w:bookmarkStart w:id="6" w:name="_Toc243078172"/>
+      <w:bookmarkStart w:id="6" w:name="_Toc244174623"/>
       <w:r>
         <w:t>1.3. Phạm vi</w:t>
       </w:r>
@@ -5046,7 +5021,7 @@
                 <w:sz w:val="22"/>
                 <w:szCs w:val="22"/>
               </w:rPr>
-              <w:t>Mã theo dõi / QR cho người nhà</w:t>
+              <w:t>Nhân viên đăng ký người nhà được theo dõi</w:t>
             </w:r>
           </w:p>
         </w:tc>
@@ -5178,7 +5153,6 @@
                 <w:sz w:val="22"/>
                 <w:szCs w:val="22"/>
               </w:rPr>
-              <w:lastRenderedPageBreak/>
               <w:t>Thông báo đẩy và cập nhật thời gian thực</w:t>
             </w:r>
           </w:p>
@@ -5291,7 +5265,7 @@
         <w:keepNext/>
         <w:spacing w:before="240" w:after="120"/>
       </w:pPr>
-      <w:bookmarkStart w:id="7" w:name="_Toc243078173"/>
+      <w:bookmarkStart w:id="7" w:name="_Toc244174624"/>
       <w:r>
         <w:t>1.4. Đối tượng sử dụng</w:t>
       </w:r>
@@ -5315,7 +5289,7 @@
         <w:t>Người nhà bệnh nhân:</w:t>
       </w:r>
       <w:r>
-        <w:t xml:space="preserve"> liên kết với bệnh nhân bằng mã/QR, xem trạng thái, lịch sử và nhận thông báo.</w:t>
+        <w:t xml:space="preserve"> không cần tài khoản; vào xem bằng số điện thoại, họ tên mình và họ tên bệnh nhân; xem trạng thái, lịch sử và nhận thông báo.</w:t>
       </w:r>
     </w:p>
     <w:p>
@@ -5336,7 +5310,7 @@
         <w:t>Nhân viên y tế:</w:t>
       </w:r>
       <w:r>
-        <w:t xml:space="preserve"> tạo bệnh nhân và ca, cập nhật trạng thái, cấp mã theo dõi cho người nhà.</w:t>
+        <w:t xml:space="preserve"> tạo bệnh nhân và ca, cập nhật trạng thái, đăng ký số điện thoại và họ tên người nhà được theo dõi.</w:t>
       </w:r>
     </w:p>
     <w:p>
@@ -5366,7 +5340,7 @@
         <w:keepNext/>
         <w:spacing w:before="240" w:after="120"/>
       </w:pPr>
-      <w:bookmarkStart w:id="8" w:name="_Toc243078174"/>
+      <w:bookmarkStart w:id="8" w:name="_Toc244174625"/>
       <w:r>
         <w:t>1.5. Phương pháp thực hiện</w:t>
       </w:r>
@@ -5458,7 +5432,7 @@
         <w:keepNext/>
         <w:spacing w:before="240" w:after="120"/>
       </w:pPr>
-      <w:bookmarkStart w:id="9" w:name="_Toc243078175"/>
+      <w:bookmarkStart w:id="9" w:name="_Toc244174626"/>
       <w:r>
         <w:t>1.6. Bố cục báo cáo</w:t>
       </w:r>
@@ -5481,9 +5455,8 @@
         <w:spacing w:after="240"/>
         <w:jc w:val="center"/>
       </w:pPr>
-      <w:bookmarkStart w:id="10" w:name="_Toc243078176"/>
-      <w:r>
-        <w:lastRenderedPageBreak/>
+      <w:bookmarkStart w:id="10" w:name="_Toc244174627"/>
+      <w:r>
         <w:t>CHƯƠNG 2. PHÂN TÍCH YÊU CẦU</w:t>
       </w:r>
       <w:bookmarkEnd w:id="10"/>
@@ -5504,7 +5477,7 @@
         <w:keepNext/>
         <w:spacing w:before="240" w:after="120"/>
       </w:pPr>
-      <w:bookmarkStart w:id="11" w:name="_Toc243078177"/>
+      <w:bookmarkStart w:id="11" w:name="_Toc244174628"/>
       <w:r>
         <w:t>2.1. Tác nhân và ma trận quyền</w:t>
       </w:r>
@@ -5855,7 +5828,7 @@
                 <w:sz w:val="22"/>
                 <w:szCs w:val="22"/>
               </w:rPr>
-              <w:t>Liên kết bệnh nhân bằng mã/QR</w:t>
+              <w:t>Vào xem bằng SĐT + họ tên + tên bệnh nhân</w:t>
             </w:r>
           </w:p>
         </w:tc>
@@ -6351,7 +6324,7 @@
                 <w:sz w:val="22"/>
                 <w:szCs w:val="22"/>
               </w:rPr>
-              <w:t>Sinh mã theo dõi / QR</w:t>
+              <w:t>Đăng ký / gỡ người nhà của ca</w:t>
             </w:r>
           </w:p>
         </w:tc>
@@ -6703,7 +6676,7 @@
         <w:keepNext/>
         <w:spacing w:before="240" w:after="120"/>
       </w:pPr>
-      <w:bookmarkStart w:id="12" w:name="_Toc243078178"/>
+      <w:bookmarkStart w:id="12" w:name="_Toc244174629"/>
       <w:r>
         <w:t>2.2. Vòng đời trạng thái ca phẫu thuật</w:t>
       </w:r>
@@ -6729,9 +6702,8 @@
         <w:rPr>
           <w:noProof/>
         </w:rPr>
-        <w:lastRenderedPageBreak/>
         <w:drawing>
-          <wp:inline distT="0" distB="0" distL="0" distR="0" wp14:anchorId="56CD0CA6" wp14:editId="136B0D61">
+          <wp:inline distT="0" distB="0" distL="0" distR="0" wp14:anchorId="409C4821" wp14:editId="4687E464">
             <wp:extent cx="5038725" cy="3333750"/>
             <wp:effectExtent l="0" t="0" r="0" b="0"/>
             <wp:docPr id="1" name="Picture 1"/>
@@ -6802,7 +6774,7 @@
         <w:keepNext/>
         <w:spacing w:before="240" w:after="120"/>
       </w:pPr>
-      <w:bookmarkStart w:id="13" w:name="_Toc243078179"/>
+      <w:bookmarkStart w:id="13" w:name="_Toc244174630"/>
       <w:r>
         <w:t>2.3. Yêu cầu chức năng</w:t>
       </w:r>
@@ -7678,7 +7650,7 @@
                 <w:sz w:val="22"/>
                 <w:szCs w:val="22"/>
               </w:rPr>
-              <w:t>Mã theo dõi / QR có hạn, thu hồi được</w:t>
+              <w:t>Nhân viên đăng ký người nhà được theo dõi (SĐT + họ tên), gỡ được</w:t>
             </w:r>
           </w:p>
         </w:tc>
@@ -7802,7 +7774,7 @@
                 <w:sz w:val="22"/>
                 <w:szCs w:val="22"/>
               </w:rPr>
-              <w:t>Người nhà liên kết bằng mã/QR</w:t>
+              <w:t>Người nhà vào xem bằng SĐT + họ tên + tên bệnh nhân, không mật khẩu</w:t>
             </w:r>
           </w:p>
         </w:tc>
@@ -8745,7 +8717,7 @@
         <w:keepNext/>
         <w:spacing w:before="240" w:after="120"/>
       </w:pPr>
-      <w:bookmarkStart w:id="14" w:name="_Toc243078180"/>
+      <w:bookmarkStart w:id="14" w:name="_Toc244174631"/>
       <w:r>
         <w:t>2.4. Yêu cầu phi chức năng</w:t>
       </w:r>
@@ -10192,7 +10164,7 @@
         <w:keepNext/>
         <w:spacing w:before="240" w:after="120"/>
       </w:pPr>
-      <w:bookmarkStart w:id="15" w:name="_Toc243078181"/>
+      <w:bookmarkStart w:id="15" w:name="_Toc244174632"/>
       <w:r>
         <w:t>2.5. Quy tắc nghiệp vụ</w:t>
       </w:r>
@@ -10237,7 +10209,7 @@
         <w:t>BR-02:</w:t>
       </w:r>
       <w:r>
-        <w:t xml:space="preserve"> một mã theo dõi chỉ gắn với một ca và có thời hạn hiệu lực.</w:t>
+        <w:t xml:space="preserve"> người nhà chỉ được xem ca mà nhân viên đã đăng ký số điện thoại của họ; quyền xem hết hiệu lực khi ca kết thúc.</w:t>
       </w:r>
     </w:p>
     <w:p>
@@ -10258,7 +10230,7 @@
         <w:t>BR-03:</w:t>
       </w:r>
       <w:r>
-        <w:t xml:space="preserve"> người nhà chỉ xem được bệnh nhân đã liên kết, không tìm kiếm theo tên.</w:t>
+        <w:t xml:space="preserve"> người nhà không tìm kiếm bệnh nhân theo tên; tên bệnh nhân chỉ dùng để đối chiếu với đăng ký của nhân viên.</w:t>
       </w:r>
     </w:p>
     <w:p>
@@ -10309,7 +10281,7 @@
         <w:keepNext/>
         <w:spacing w:before="240" w:after="120"/>
       </w:pPr>
-      <w:bookmarkStart w:id="16" w:name="_Toc243078182"/>
+      <w:bookmarkStart w:id="16" w:name="_Toc244174633"/>
       <w:r>
         <w:t>2.6. Use case chính</w:t>
       </w:r>
@@ -10321,9 +10293,9 @@
         <w:keepNext/>
         <w:spacing w:before="180" w:after="80"/>
       </w:pPr>
-      <w:bookmarkStart w:id="17" w:name="_Toc243078183"/>
-      <w:r>
-        <w:t>UC-01. Cấp mã theo dõi cho người nhà</w:t>
+      <w:bookmarkStart w:id="17" w:name="_Toc244174634"/>
+      <w:r>
+        <w:t>UC-01. Đăng ký người nhà được theo dõi</w:t>
       </w:r>
       <w:bookmarkEnd w:id="17"/>
     </w:p>
@@ -10334,7 +10306,7 @@
         <w:jc w:val="both"/>
       </w:pPr>
       <w:r>
-        <w:t>Nhân viên chọn ca → tạo mã theo dõi → hệ thống sinh mã 8 ký tự kèm QR có thời hạn → nhân viên đưa mã hoặc QR cho người nhà. Ngoại lệ: ca đã kết thúc thì không cho tạo mã mới.</w:t>
+        <w:t>Nhân viên mở ca → nhập số điện thoại và họ tên người nhà → hệ thống lưu người nhà vào ca (tạo hồ sơ người nhà nếu số điện thoại chưa có, không cần mật khẩu) → nhân viên dặn người nhà mở ứng dụng. Ngoại lệ: ca đã hủy hoặc kết thúc thì không cho đăng ký; số điện thoại thuộc tài khoản nhân viên bị từ chối.</w:t>
       </w:r>
     </w:p>
     <w:p>
@@ -10343,10 +10315,9 @@
         <w:keepNext/>
         <w:spacing w:before="180" w:after="80"/>
       </w:pPr>
-      <w:bookmarkStart w:id="18" w:name="_Toc243078184"/>
-      <w:r>
-        <w:lastRenderedPageBreak/>
-        <w:t>UC-02. Liên kết người nhà với bệnh nhân</w:t>
+      <w:bookmarkStart w:id="18" w:name="_Toc244174635"/>
+      <w:r>
+        <w:t>UC-02. Người nhà vào xem</w:t>
       </w:r>
       <w:bookmarkEnd w:id="18"/>
     </w:p>
@@ -10357,7 +10328,7 @@
         <w:jc w:val="both"/>
       </w:pPr>
       <w:r>
-        <w:t>Người nhà quét QR (mở thẳng trang liên kết với mã điền sẵn) hoặc nhập mã → hệ thống kiểm tra mã còn hiệu lực → tạo liên kết. Ngoại lệ: mã sai, hết hạn, đã thu hồi thì báo lỗi; nhập sai quá 5 lần thì tạm khóa 15 phút.</w:t>
+        <w:t>Người nhà mở trang “Theo dõi người thân” → nhập số điện thoại, họ tên mình và họ tên bệnh nhân (có dấu hay không dấu đều được) → hệ thống đối chiếu với đăng ký của nhân viên → nếu khớp thì vào thẳng danh sách ca, phiên được nhớ tới khi ca kết thúc. Không cần email, mật khẩu hay mã xác nhận. Ngoại lệ: thông tin không khớp thì báo lỗi; nhập sai 5 lần với cùng số điện thoại thì tạm khóa 15 phút.</w:t>
       </w:r>
     </w:p>
     <w:p>
@@ -10366,7 +10337,7 @@
         <w:keepNext/>
         <w:spacing w:before="180" w:after="80"/>
       </w:pPr>
-      <w:bookmarkStart w:id="19" w:name="_Toc243078185"/>
+      <w:bookmarkStart w:id="19" w:name="_Toc244174636"/>
       <w:r>
         <w:t>UC-03. Cập nhật trạng thái ca phẫu thuật</w:t>
       </w:r>
@@ -10388,7 +10359,7 @@
         <w:keepNext/>
         <w:spacing w:before="180" w:after="80"/>
       </w:pPr>
-      <w:bookmarkStart w:id="20" w:name="_Toc243078186"/>
+      <w:bookmarkStart w:id="20" w:name="_Toc244174637"/>
       <w:r>
         <w:t>UC-04. Theo dõi trạng thái và nhận thông báo</w:t>
       </w:r>
@@ -10411,9 +10382,8 @@
         <w:spacing w:after="240"/>
         <w:jc w:val="center"/>
       </w:pPr>
-      <w:bookmarkStart w:id="21" w:name="_Toc243078187"/>
-      <w:r>
-        <w:lastRenderedPageBreak/>
+      <w:bookmarkStart w:id="21" w:name="_Toc244174638"/>
+      <w:r>
         <w:t>CHƯƠNG 3. KẾ HOẠCH DỰ ÁN</w:t>
       </w:r>
       <w:bookmarkEnd w:id="21"/>
@@ -10424,7 +10394,7 @@
         <w:keepNext/>
         <w:spacing w:before="240" w:after="120"/>
       </w:pPr>
-      <w:bookmarkStart w:id="22" w:name="_Toc243078188"/>
+      <w:bookmarkStart w:id="22" w:name="_Toc244174639"/>
       <w:r>
         <w:t>3.1. Mô hình quản lý</w:t>
       </w:r>
@@ -10530,7 +10500,7 @@
         <w:keepNext/>
         <w:spacing w:before="240" w:after="120"/>
       </w:pPr>
-      <w:bookmarkStart w:id="23" w:name="_Toc243078189"/>
+      <w:bookmarkStart w:id="23" w:name="_Toc244174640"/>
       <w:r>
         <w:t>3.2. Kế hoạch sprint</w:t>
       </w:r>
@@ -10939,7 +10909,7 @@
                 <w:sz w:val="22"/>
                 <w:szCs w:val="22"/>
               </w:rPr>
-              <w:t>Luồng cốt lõi: xác thực, ca mổ, trạng thái, mã/QR, liên kết</w:t>
+              <w:t>Luồng cốt lõi: xác thực, ca mổ, trạng thái, liên kết người nhà</w:t>
             </w:r>
           </w:p>
         </w:tc>
@@ -10968,7 +10938,7 @@
                 <w:sz w:val="22"/>
                 <w:szCs w:val="22"/>
               </w:rPr>
-              <w:t>25 unit + 30 e2e test, chạy được luồng QR trên trình duyệt</w:t>
+              <w:t>25 unit + 30 e2e test, chạy được luồng người nhà trên trình duyệt</w:t>
             </w:r>
           </w:p>
         </w:tc>
@@ -11311,7 +11281,7 @@
                 <w:sz w:val="22"/>
                 <w:szCs w:val="22"/>
               </w:rPr>
-              <w:t>Minh chứng, báo cáo, slide, tổng duyệt</w:t>
+              <w:t>Minh chứng, báo cáo, slide; đổi cách người nhà vào xem</w:t>
             </w:r>
           </w:p>
         </w:tc>
@@ -11340,7 +11310,7 @@
                 <w:sz w:val="22"/>
                 <w:szCs w:val="22"/>
               </w:rPr>
-              <w:t>20 kịch bản giao diện tự động, ảnh minh chứng, báo cáo</w:t>
+              <w:t>19 kịch bản giao diện tự động, ảnh minh chứng, báo cáo; người nhà vào xem không cần tài khoản</w:t>
             </w:r>
           </w:p>
         </w:tc>
@@ -11357,7 +11327,7 @@
         <w:keepNext/>
         <w:spacing w:before="240" w:after="120"/>
       </w:pPr>
-      <w:bookmarkStart w:id="24" w:name="_Toc243078190"/>
+      <w:bookmarkStart w:id="24" w:name="_Toc244174641"/>
       <w:r>
         <w:t>3.3. Phân công</w:t>
       </w:r>
@@ -11911,9 +11881,8 @@
         <w:keepNext/>
         <w:spacing w:before="240" w:after="120"/>
       </w:pPr>
-      <w:bookmarkStart w:id="25" w:name="_Toc243078191"/>
-      <w:r>
-        <w:lastRenderedPageBreak/>
+      <w:bookmarkStart w:id="25" w:name="_Toc244174642"/>
+      <w:r>
         <w:t>3.4. Rủi ro và hướng xử lý</w:t>
       </w:r>
       <w:bookmarkEnd w:id="25"/>
@@ -12164,7 +12133,7 @@
                 <w:sz w:val="22"/>
                 <w:szCs w:val="22"/>
               </w:rPr>
-              <w:t>Phân quyền ở máy chủ cho mọi API, mã theo dõi có hạn và chỉ lưu bản băm, ẩn bớt tên, nhật ký truy cập</w:t>
+              <w:t>Phân quyền ở máy chủ cho mọi API, chỉ người nhà được nhân viên đăng ký mới vào xem, khóa khi nhập sai nhiều lần, ẩn bớt tên, nhật ký truy cập</w:t>
             </w:r>
           </w:p>
         </w:tc>
@@ -12449,7 +12418,7 @@
                 <w:sz w:val="22"/>
                 <w:szCs w:val="22"/>
               </w:rPr>
-              <w:t>QR mở thẳng trang liên kết với mã điền sẵn, chữ lớn, tối đa 2 thao tác để xem trạng thái</w:t>
+              <w:t>Không cần tạo tài khoản hay nhớ mật khẩu: chỉ nhập số điện thoại, họ tên, tên bệnh nhân (gõ không dấu cũng được); chữ lớn</w:t>
             </w:r>
           </w:p>
         </w:tc>
@@ -12562,9 +12531,8 @@
         <w:spacing w:after="240"/>
         <w:jc w:val="center"/>
       </w:pPr>
-      <w:bookmarkStart w:id="26" w:name="_Toc243078192"/>
-      <w:r>
-        <w:lastRenderedPageBreak/>
+      <w:bookmarkStart w:id="26" w:name="_Toc244174643"/>
+      <w:r>
         <w:t>CHƯƠNG 4. THIẾT KẾ HỆ THỐNG</w:t>
       </w:r>
       <w:bookmarkEnd w:id="26"/>
@@ -12575,7 +12543,7 @@
         <w:keepNext/>
         <w:spacing w:before="240" w:after="120"/>
       </w:pPr>
-      <w:bookmarkStart w:id="27" w:name="_Toc243078193"/>
+      <w:bookmarkStart w:id="27" w:name="_Toc244174644"/>
       <w:r>
         <w:t>4.1. Kiến trúc tổng thể</w:t>
       </w:r>
@@ -12612,10 +12580,10 @@
           <w:noProof/>
         </w:rPr>
         <w:drawing>
-          <wp:inline distT="0" distB="0" distL="0" distR="0" wp14:anchorId="0CED0A3F" wp14:editId="7CAEDBB7">
+          <wp:inline distT="0" distB="0" distL="0" distR="0" wp14:anchorId="6651B854" wp14:editId="68194CD9">
             <wp:extent cx="5581650" cy="2447925"/>
             <wp:effectExtent l="0" t="0" r="0" b="0"/>
-            <wp:docPr id="1255356245" name="Picture 1255356245"/>
+            <wp:docPr id="815868866" name="Picture 815868866"/>
             <wp:cNvGraphicFramePr>
               <a:graphicFrameLocks xmlns:a="http://schemas.openxmlformats.org/drawingml/2006/main" noChangeAspect="1"/>
             </wp:cNvGraphicFramePr>
@@ -12683,7 +12651,7 @@
         <w:keepNext/>
         <w:spacing w:before="240" w:after="120"/>
       </w:pPr>
-      <w:bookmarkStart w:id="28" w:name="_Toc243078194"/>
+      <w:bookmarkStart w:id="28" w:name="_Toc244174645"/>
       <w:r>
         <w:t>4.2. Lựa chọn công nghệ</w:t>
       </w:r>
@@ -13447,7 +13415,6 @@
                 <w:sz w:val="22"/>
                 <w:szCs w:val="22"/>
               </w:rPr>
-              <w:lastRenderedPageBreak/>
               <w:t>Triển khai</w:t>
             </w:r>
           </w:p>
@@ -13618,7 +13585,7 @@
         <w:keepNext/>
         <w:spacing w:before="240" w:after="120"/>
       </w:pPr>
-      <w:bookmarkStart w:id="29" w:name="_Toc243078195"/>
+      <w:bookmarkStart w:id="29" w:name="_Toc244174646"/>
       <w:r>
         <w:t>4.3. Tổ chức mã nguồn</w:t>
       </w:r>
@@ -13642,7 +13609,7 @@
         <w:t>apps/api</w:t>
       </w:r>
       <w:r>
-        <w:t xml:space="preserve"> – NestJS: các module auth, patients, surgeries (kèm đổi trạng thái), tracking-codes, links, my (API cho người nhà), notifications, events (SSE), devices, admin, audit; khoảng 3 900 dòng mã và 1 200 dòng test e2e.</w:t>
+        <w:t xml:space="preserve"> – NestJS: các module auth, patients, surgeries (kèm đổi trạng thái), family (người nhà vào xem, nhân viên đăng ký người nhà), links, my (API cho người nhà), notifications, events (SSE), devices, admin, audit; khoảng 3 900 dòng mã và 1 200 dòng test e2e.</w:t>
       </w:r>
     </w:p>
     <w:p>
@@ -13663,7 +13630,7 @@
         <w:t>apps/web</w:t>
       </w:r>
       <w:r>
-        <w:t xml:space="preserve"> – Next.js: trang người nhà (/theo-doi, /lien-ket, /thong-bao, /cai-dat), nhân viên (/staff), quản trị (/admin); khoảng 2 300 dòng.</w:t>
+        <w:t xml:space="preserve"> – Next.js: trang người nhà (/nguoi-nha, /theo-doi, /thong-bao, /cai-dat), nhân viên (/staff), quản trị (/admin); khoảng 2 300 dòng.</w:t>
       </w:r>
     </w:p>
     <w:p>
@@ -13744,7 +13711,7 @@
         <w:keepNext/>
         <w:spacing w:before="240" w:after="120"/>
       </w:pPr>
-      <w:bookmarkStart w:id="30" w:name="_Toc243078196"/>
+      <w:bookmarkStart w:id="30" w:name="_Toc244174647"/>
       <w:r>
         <w:t>4.4. Thiết kế cơ sở dữ liệu</w:t>
       </w:r>
@@ -13757,7 +13724,7 @@
         <w:jc w:val="both"/>
       </w:pPr>
       <w:r>
-        <w:t>Mô hình quan hệ gồm 11 bảng. Điểm then chốt là bảng status_history chỉ thêm mới (không sửa, không xóa) và bảng family_links nối người nhà với ca. Cột trạng thái hiện tại của surgeries được cập nhật cùng lúc với việc thêm bản ghi lịch sử trong một giao dịch; điều kiện cập nhật kèm trạng thái cũ để hai nhân viên bấm cùng lúc không làm lệch dữ liệu.</w:t>
+        <w:t>Mô hình quan hệ gồm 10 bảng (bảng tracking_codes của luồng mã/QR cũ đã được xóa bằng migration ngày 17/10/2026). Điểm then chốt là bảng status_history chỉ thêm mới (không sửa, không xóa) và bảng family_links nối người nhà với ca. Cột trạng thái hiện tại của surgeries được cập nhật cùng lúc với việc thêm bản ghi lịch sử trong một giao dịch; điều kiện cập nhật kèm trạng thái cũ để hai nhân viên bấm cùng lúc không làm lệch dữ liệu.</w:t>
       </w:r>
     </w:p>
     <w:p>
@@ -13770,12 +13737,11 @@
         <w:rPr>
           <w:noProof/>
         </w:rPr>
-        <w:lastRenderedPageBreak/>
         <w:drawing>
-          <wp:inline distT="0" distB="0" distL="0" distR="0" wp14:anchorId="5B2FEA99" wp14:editId="5847D7CE">
-            <wp:extent cx="5581650" cy="2486025"/>
+          <wp:inline distT="0" distB="0" distL="0" distR="0" wp14:anchorId="2DA614F9" wp14:editId="577F5CC3">
+            <wp:extent cx="5581650" cy="2771775"/>
             <wp:effectExtent l="0" t="0" r="0" b="0"/>
-            <wp:docPr id="2026219343" name="Picture 2026219343"/>
+            <wp:docPr id="1369081909" name="Picture 1369081909"/>
             <wp:cNvGraphicFramePr>
               <a:graphicFrameLocks xmlns:a="http://schemas.openxmlformats.org/drawingml/2006/main" noChangeAspect="1"/>
             </wp:cNvGraphicFramePr>
@@ -13798,7 +13764,7 @@
                   <pic:spPr bwMode="auto">
                     <a:xfrm>
                       <a:off x="0" y="0"/>
-                      <a:ext cx="5581650" cy="2486025"/>
+                      <a:ext cx="5581650" cy="2771775"/>
                     </a:xfrm>
                     <a:prstGeom prst="rect">
                       <a:avLst/>
@@ -14083,7 +14049,7 @@
                 <w:sz w:val="22"/>
                 <w:szCs w:val="22"/>
               </w:rPr>
-              <w:t>role, status, password_hash (argon2), token_version</w:t>
+              <w:t>role, status, phone (duy nhất), password_hash (argon2; để trống với người nhà), token_version</w:t>
             </w:r>
           </w:p>
         </w:tc>
@@ -14595,7 +14561,7 @@
                 <w:sz w:val="22"/>
                 <w:szCs w:val="22"/>
               </w:rPr>
-              <w:t>tracking_codes</w:t>
+              <w:t>family_links</w:t>
             </w:r>
           </w:p>
         </w:tc>
@@ -14624,7 +14590,7 @@
                 <w:sz w:val="22"/>
                 <w:szCs w:val="22"/>
               </w:rPr>
-              <w:t>Mã theo dõi/QR</w:t>
+              <w:t>Người nhà được nhân viên đăng ký cho ca</w:t>
             </w:r>
           </w:p>
         </w:tc>
@@ -14653,7 +14619,7 @@
                 <w:sz w:val="22"/>
                 <w:szCs w:val="22"/>
               </w:rPr>
-              <w:t>code_hash (HMAC, duy nhất), expires_at, status</w:t>
+              <w:t>contact_name (họ tên để đối chiếu), added_by (nhân viên), status, revoked_at; duy nhất (người nhà, ca)</w:t>
             </w:r>
           </w:p>
         </w:tc>
@@ -14690,7 +14656,7 @@
                 <w:sz w:val="22"/>
                 <w:szCs w:val="22"/>
               </w:rPr>
-              <w:t>family_links</w:t>
+              <w:t>notifications</w:t>
             </w:r>
           </w:p>
         </w:tc>
@@ -14719,7 +14685,7 @@
                 <w:sz w:val="22"/>
                 <w:szCs w:val="22"/>
               </w:rPr>
-              <w:t>Liên kết người nhà – ca</w:t>
+              <w:t>Thông báo đã gửi</w:t>
             </w:r>
           </w:p>
         </w:tc>
@@ -14748,7 +14714,7 @@
                 <w:sz w:val="22"/>
                 <w:szCs w:val="22"/>
               </w:rPr>
-              <w:t>status, linked_at, revoked_at; duy nhất (user, ca)</w:t>
+              <w:t>content, channel, status, attempts, last_error, read_at</w:t>
             </w:r>
           </w:p>
         </w:tc>
@@ -14785,7 +14751,7 @@
                 <w:sz w:val="22"/>
                 <w:szCs w:val="22"/>
               </w:rPr>
-              <w:t>notifications</w:t>
+              <w:t>device_tokens</w:t>
             </w:r>
           </w:p>
         </w:tc>
@@ -14814,7 +14780,7 @@
                 <w:sz w:val="22"/>
                 <w:szCs w:val="22"/>
               </w:rPr>
-              <w:t>Thông báo đã gửi</w:t>
+              <w:t>Token thiết bị nhận push</w:t>
             </w:r>
           </w:p>
         </w:tc>
@@ -14843,7 +14809,7 @@
                 <w:sz w:val="22"/>
                 <w:szCs w:val="22"/>
               </w:rPr>
-              <w:t>content, channel, status, attempts, last_error, read_at</w:t>
+              <w:t>token (duy nhất), platform</w:t>
             </w:r>
           </w:p>
         </w:tc>
@@ -14880,101 +14846,6 @@
                 <w:sz w:val="22"/>
                 <w:szCs w:val="22"/>
               </w:rPr>
-              <w:t>device_tokens</w:t>
-            </w:r>
-          </w:p>
-        </w:tc>
-        <w:tc>
-          <w:tcPr>
-            <w:tcW w:w="2791" w:type="dxa"/>
-            <w:tcBorders>
-              <w:top w:val="single" w:sz="4" w:space="0" w:color="8A94A6"/>
-              <w:left w:val="single" w:sz="4" w:space="0" w:color="8A94A6"/>
-              <w:bottom w:val="single" w:sz="4" w:space="0" w:color="8A94A6"/>
-              <w:right w:val="single" w:sz="4" w:space="0" w:color="8A94A6"/>
-            </w:tcBorders>
-            <w:tcMar>
-              <w:top w:w="40" w:type="dxa"/>
-              <w:left w:w="80" w:type="dxa"/>
-              <w:bottom w:w="40" w:type="dxa"/>
-              <w:right w:w="80" w:type="dxa"/>
-            </w:tcMar>
-          </w:tcPr>
-          <w:p>
-            <w:pPr>
-              <w:spacing w:line="276" w:lineRule="auto"/>
-            </w:pPr>
-            <w:r>
-              <w:rPr>
-                <w:sz w:val="22"/>
-                <w:szCs w:val="22"/>
-              </w:rPr>
-              <w:t>Token thiết bị nhận push</w:t>
-            </w:r>
-          </w:p>
-        </w:tc>
-        <w:tc>
-          <w:tcPr>
-            <w:tcW w:w="4187" w:type="dxa"/>
-            <w:tcBorders>
-              <w:top w:val="single" w:sz="4" w:space="0" w:color="8A94A6"/>
-              <w:left w:val="single" w:sz="4" w:space="0" w:color="8A94A6"/>
-              <w:bottom w:val="single" w:sz="4" w:space="0" w:color="8A94A6"/>
-              <w:right w:val="single" w:sz="4" w:space="0" w:color="8A94A6"/>
-            </w:tcBorders>
-            <w:tcMar>
-              <w:top w:w="40" w:type="dxa"/>
-              <w:left w:w="80" w:type="dxa"/>
-              <w:bottom w:w="40" w:type="dxa"/>
-              <w:right w:w="80" w:type="dxa"/>
-            </w:tcMar>
-          </w:tcPr>
-          <w:p>
-            <w:pPr>
-              <w:spacing w:line="276" w:lineRule="auto"/>
-            </w:pPr>
-            <w:r>
-              <w:rPr>
-                <w:sz w:val="22"/>
-                <w:szCs w:val="22"/>
-              </w:rPr>
-              <w:t>token (duy nhất), platform</w:t>
-            </w:r>
-          </w:p>
-        </w:tc>
-      </w:tr>
-      <w:tr>
-        <w:tblPrEx>
-          <w:tblCellMar>
-            <w:top w:w="0" w:type="dxa"/>
-            <w:bottom w:w="0" w:type="dxa"/>
-          </w:tblCellMar>
-        </w:tblPrEx>
-        <w:tc>
-          <w:tcPr>
-            <w:tcW w:w="2093" w:type="dxa"/>
-            <w:tcBorders>
-              <w:top w:val="single" w:sz="4" w:space="0" w:color="8A94A6"/>
-              <w:left w:val="single" w:sz="4" w:space="0" w:color="8A94A6"/>
-              <w:bottom w:val="single" w:sz="4" w:space="0" w:color="8A94A6"/>
-              <w:right w:val="single" w:sz="4" w:space="0" w:color="8A94A6"/>
-            </w:tcBorders>
-            <w:tcMar>
-              <w:top w:w="40" w:type="dxa"/>
-              <w:left w:w="80" w:type="dxa"/>
-              <w:bottom w:w="40" w:type="dxa"/>
-              <w:right w:w="80" w:type="dxa"/>
-            </w:tcMar>
-          </w:tcPr>
-          <w:p>
-            <w:pPr>
-              <w:spacing w:line="276" w:lineRule="auto"/>
-            </w:pPr>
-            <w:r>
-              <w:rPr>
-                <w:sz w:val="22"/>
-                <w:szCs w:val="22"/>
-              </w:rPr>
               <w:t>audit_logs</w:t>
             </w:r>
           </w:p>
@@ -15050,7 +14921,7 @@
         <w:keepNext/>
         <w:spacing w:before="240" w:after="120"/>
       </w:pPr>
-      <w:bookmarkStart w:id="31" w:name="_Toc243078197"/>
+      <w:bookmarkStart w:id="31" w:name="_Toc244174648"/>
       <w:r>
         <w:t>4.5. Thiết kế API</w:t>
       </w:r>
@@ -15081,7 +14952,6 @@
           <w:sz w:val="24"/>
           <w:szCs w:val="24"/>
         </w:rPr>
-        <w:lastRenderedPageBreak/>
         <w:t xml:space="preserve">Bảng 4.3. </w:t>
       </w:r>
       <w:r>
@@ -15255,7 +15125,7 @@
                 <w:sz w:val="22"/>
                 <w:szCs w:val="22"/>
               </w:rPr>
-              <w:t>POST /auth/register, /auth/login, /auth/logout; PUT /auth/password</w:t>
+              <w:t>POST /auth/login, /auth/logout; PUT /auth/password</w:t>
             </w:r>
           </w:p>
         </w:tc>
@@ -15284,7 +15154,7 @@
                 <w:sz w:val="22"/>
                 <w:szCs w:val="22"/>
               </w:rPr>
-              <w:t>Đăng ký, đăng nhập, đăng xuất, đổi mật khẩu</w:t>
+              <w:t>Đăng nhập bằng email + mật khẩu, đăng xuất, đổi mật khẩu</w:t>
             </w:r>
           </w:p>
         </w:tc>
@@ -15313,7 +15183,7 @@
                 <w:sz w:val="22"/>
                 <w:szCs w:val="22"/>
               </w:rPr>
-              <w:t>Tất cả</w:t>
+              <w:t>Nhân viên, Quản trị</w:t>
             </w:r>
           </w:p>
         </w:tc>
@@ -15350,7 +15220,7 @@
                 <w:sz w:val="22"/>
                 <w:szCs w:val="22"/>
               </w:rPr>
-              <w:t>POST/GET/PUT /patients</w:t>
+              <w:t>POST /auth/family-access</w:t>
             </w:r>
           </w:p>
         </w:tc>
@@ -15379,7 +15249,7 @@
                 <w:sz w:val="22"/>
                 <w:szCs w:val="22"/>
               </w:rPr>
-              <w:t>Tạo, tìm, sửa bệnh nhân</w:t>
+              <w:t>Người nhà vào xem bằng SĐT + họ tên + họ tên bệnh nhân (không mật khẩu)</w:t>
             </w:r>
           </w:p>
         </w:tc>
@@ -15408,7 +15278,7 @@
                 <w:sz w:val="22"/>
                 <w:szCs w:val="22"/>
               </w:rPr>
-              <w:t>Nhân viên, Quản trị</w:t>
+              <w:t>Công khai</w:t>
             </w:r>
           </w:p>
         </w:tc>
@@ -15445,7 +15315,7 @@
                 <w:sz w:val="22"/>
                 <w:szCs w:val="22"/>
               </w:rPr>
-              <w:t>POST/GET/PUT /surgeries; POST /surgeries/{id}/cancel</w:t>
+              <w:t>POST/GET /surgeries/{id}/family-contacts</w:t>
             </w:r>
           </w:p>
         </w:tc>
@@ -15474,7 +15344,7 @@
                 <w:sz w:val="22"/>
                 <w:szCs w:val="22"/>
               </w:rPr>
-              <w:t>Tạo, lọc, sửa, hủy ca</w:t>
+              <w:t>Đăng ký người nhà (SĐT + họ tên), xem danh sách</w:t>
             </w:r>
           </w:p>
         </w:tc>
@@ -15540,7 +15410,7 @@
                 <w:sz w:val="22"/>
                 <w:szCs w:val="22"/>
               </w:rPr>
-              <w:t>POST /surgeries/{id}/status</w:t>
+              <w:t>POST/GET/PUT /patients</w:t>
             </w:r>
           </w:p>
         </w:tc>
@@ -15569,7 +15439,7 @@
                 <w:sz w:val="22"/>
                 <w:szCs w:val="22"/>
               </w:rPr>
-              <w:t>Đổi trạng thái</w:t>
+              <w:t>Tạo, tìm, sửa bệnh nhân</w:t>
             </w:r>
           </w:p>
         </w:tc>
@@ -15598,7 +15468,7 @@
                 <w:sz w:val="22"/>
                 <w:szCs w:val="22"/>
               </w:rPr>
-              <w:t>Nhân viên</w:t>
+              <w:t>Nhân viên, Quản trị</w:t>
             </w:r>
           </w:p>
         </w:tc>
@@ -15635,7 +15505,7 @@
                 <w:sz w:val="22"/>
                 <w:szCs w:val="22"/>
               </w:rPr>
-              <w:t>GET /surgeries/{id}/history</w:t>
+              <w:t>POST/GET/PUT /surgeries; POST /surgeries/{id}/cancel</w:t>
             </w:r>
           </w:p>
         </w:tc>
@@ -15664,7 +15534,7 @@
                 <w:sz w:val="22"/>
                 <w:szCs w:val="22"/>
               </w:rPr>
-              <w:t>Lịch sử trạng thái</w:t>
+              <w:t>Tạo, lọc, sửa, hủy ca</w:t>
             </w:r>
           </w:p>
         </w:tc>
@@ -15693,7 +15563,7 @@
                 <w:sz w:val="22"/>
                 <w:szCs w:val="22"/>
               </w:rPr>
-              <w:t>Người có quyền xem ca</w:t>
+              <w:t>Nhân viên, Quản trị</w:t>
             </w:r>
           </w:p>
         </w:tc>
@@ -15730,7 +15600,7 @@
                 <w:sz w:val="22"/>
                 <w:szCs w:val="22"/>
               </w:rPr>
-              <w:t>POST /surgeries/{id}/tracking-codes; DELETE /tracking-codes/{id}</w:t>
+              <w:t>POST /surgeries/{id}/status</w:t>
             </w:r>
           </w:p>
         </w:tc>
@@ -15759,7 +15629,7 @@
                 <w:sz w:val="22"/>
                 <w:szCs w:val="22"/>
               </w:rPr>
-              <w:t>Cấp mã/QR, thu hồi mã</w:t>
+              <w:t>Đổi trạng thái</w:t>
             </w:r>
           </w:p>
         </w:tc>
@@ -15788,7 +15658,7 @@
                 <w:sz w:val="22"/>
                 <w:szCs w:val="22"/>
               </w:rPr>
-              <w:t>Nhân viên, Quản trị</w:t>
+              <w:t>Nhân viên</w:t>
             </w:r>
           </w:p>
         </w:tc>
@@ -15825,7 +15695,7 @@
                 <w:sz w:val="22"/>
                 <w:szCs w:val="22"/>
               </w:rPr>
-              <w:t>POST/GET/DELETE /links</w:t>
+              <w:t>GET /surgeries/{id}/history</w:t>
             </w:r>
           </w:p>
         </w:tc>
@@ -15854,7 +15724,7 @@
                 <w:sz w:val="22"/>
                 <w:szCs w:val="22"/>
               </w:rPr>
-              <w:t>Liên kết, xem, hủy liên kết</w:t>
+              <w:t>Lịch sử trạng thái</w:t>
             </w:r>
           </w:p>
         </w:tc>
@@ -15883,7 +15753,7 @@
                 <w:sz w:val="22"/>
                 <w:szCs w:val="22"/>
               </w:rPr>
-              <w:t>Người nhà, Quản trị</w:t>
+              <w:t>Người có quyền xem ca</w:t>
             </w:r>
           </w:p>
         </w:tc>
@@ -15920,7 +15790,7 @@
                 <w:sz w:val="22"/>
                 <w:szCs w:val="22"/>
               </w:rPr>
-              <w:t>GET /my/surgeries, /my/surgeries/{id}, /my/notifications</w:t>
+              <w:t>GET/DELETE /links</w:t>
             </w:r>
           </w:p>
         </w:tc>
@@ -15949,7 +15819,7 @@
                 <w:sz w:val="22"/>
                 <w:szCs w:val="22"/>
               </w:rPr>
-              <w:t>Ca đã liên kết, chi tiết, thông báo</w:t>
+              <w:t>Xem, gỡ quyền theo dõi</w:t>
             </w:r>
           </w:p>
         </w:tc>
@@ -15978,7 +15848,7 @@
                 <w:sz w:val="22"/>
                 <w:szCs w:val="22"/>
               </w:rPr>
-              <w:t>Người nhà</w:t>
+              <w:t>Người nhà (của mình), Nhân viên, Quản trị</w:t>
             </w:r>
           </w:p>
         </w:tc>
@@ -16015,7 +15885,7 @@
                 <w:sz w:val="22"/>
                 <w:szCs w:val="22"/>
               </w:rPr>
-              <w:t>POST/DELETE /devices</w:t>
+              <w:t>GET /my/surgeries, /my/surgeries/{id}, /my/notifications</w:t>
             </w:r>
           </w:p>
         </w:tc>
@@ -16044,7 +15914,7 @@
                 <w:sz w:val="22"/>
                 <w:szCs w:val="22"/>
               </w:rPr>
-              <w:t>Đăng ký/xóa token nhận push</w:t>
+              <w:t>Ca được đăng ký, chi tiết, thông báo</w:t>
             </w:r>
           </w:p>
         </w:tc>
@@ -16110,7 +15980,7 @@
                 <w:sz w:val="22"/>
                 <w:szCs w:val="22"/>
               </w:rPr>
-              <w:t>GET /events</w:t>
+              <w:t>POST/DELETE /devices</w:t>
             </w:r>
           </w:p>
         </w:tc>
@@ -16139,7 +16009,7 @@
                 <w:sz w:val="22"/>
                 <w:szCs w:val="22"/>
               </w:rPr>
-              <w:t>Kênh SSE cập nhật thời gian thực</w:t>
+              <w:t>Đăng ký/xóa token nhận push</w:t>
             </w:r>
           </w:p>
         </w:tc>
@@ -16168,7 +16038,7 @@
                 <w:sz w:val="22"/>
                 <w:szCs w:val="22"/>
               </w:rPr>
-              <w:t>Đã đăng nhập</w:t>
+              <w:t>Người nhà</w:t>
             </w:r>
           </w:p>
         </w:tc>
@@ -16205,6 +16075,101 @@
                 <w:sz w:val="22"/>
                 <w:szCs w:val="22"/>
               </w:rPr>
+              <w:t>GET /events</w:t>
+            </w:r>
+          </w:p>
+        </w:tc>
+        <w:tc>
+          <w:tcPr>
+            <w:tcW w:w="3201" w:type="dxa"/>
+            <w:tcBorders>
+              <w:top w:val="single" w:sz="4" w:space="0" w:color="8A94A6"/>
+              <w:left w:val="single" w:sz="4" w:space="0" w:color="8A94A6"/>
+              <w:bottom w:val="single" w:sz="4" w:space="0" w:color="8A94A6"/>
+              <w:right w:val="single" w:sz="4" w:space="0" w:color="8A94A6"/>
+            </w:tcBorders>
+            <w:tcMar>
+              <w:top w:w="40" w:type="dxa"/>
+              <w:left w:w="80" w:type="dxa"/>
+              <w:bottom w:w="40" w:type="dxa"/>
+              <w:right w:w="80" w:type="dxa"/>
+            </w:tcMar>
+          </w:tcPr>
+          <w:p>
+            <w:pPr>
+              <w:spacing w:line="276" w:lineRule="auto"/>
+            </w:pPr>
+            <w:r>
+              <w:rPr>
+                <w:sz w:val="22"/>
+                <w:szCs w:val="22"/>
+              </w:rPr>
+              <w:t>Kênh SSE cập nhật thời gian thực</w:t>
+            </w:r>
+          </w:p>
+        </w:tc>
+        <w:tc>
+          <w:tcPr>
+            <w:tcW w:w="1958" w:type="dxa"/>
+            <w:tcBorders>
+              <w:top w:val="single" w:sz="4" w:space="0" w:color="8A94A6"/>
+              <w:left w:val="single" w:sz="4" w:space="0" w:color="8A94A6"/>
+              <w:bottom w:val="single" w:sz="4" w:space="0" w:color="8A94A6"/>
+              <w:right w:val="single" w:sz="4" w:space="0" w:color="8A94A6"/>
+            </w:tcBorders>
+            <w:tcMar>
+              <w:top w:w="40" w:type="dxa"/>
+              <w:left w:w="80" w:type="dxa"/>
+              <w:bottom w:w="40" w:type="dxa"/>
+              <w:right w:w="80" w:type="dxa"/>
+            </w:tcMar>
+          </w:tcPr>
+          <w:p>
+            <w:pPr>
+              <w:spacing w:line="276" w:lineRule="auto"/>
+            </w:pPr>
+            <w:r>
+              <w:rPr>
+                <w:sz w:val="22"/>
+                <w:szCs w:val="22"/>
+              </w:rPr>
+              <w:t>Đã đăng nhập</w:t>
+            </w:r>
+          </w:p>
+        </w:tc>
+      </w:tr>
+      <w:tr>
+        <w:tblPrEx>
+          <w:tblCellMar>
+            <w:top w:w="0" w:type="dxa"/>
+            <w:bottom w:w="0" w:type="dxa"/>
+          </w:tblCellMar>
+        </w:tblPrEx>
+        <w:tc>
+          <w:tcPr>
+            <w:tcW w:w="3912" w:type="dxa"/>
+            <w:tcBorders>
+              <w:top w:val="single" w:sz="4" w:space="0" w:color="8A94A6"/>
+              <w:left w:val="single" w:sz="4" w:space="0" w:color="8A94A6"/>
+              <w:bottom w:val="single" w:sz="4" w:space="0" w:color="8A94A6"/>
+              <w:right w:val="single" w:sz="4" w:space="0" w:color="8A94A6"/>
+            </w:tcBorders>
+            <w:tcMar>
+              <w:top w:w="40" w:type="dxa"/>
+              <w:left w:w="80" w:type="dxa"/>
+              <w:bottom w:w="40" w:type="dxa"/>
+              <w:right w:w="80" w:type="dxa"/>
+            </w:tcMar>
+          </w:tcPr>
+          <w:p>
+            <w:pPr>
+              <w:spacing w:line="276" w:lineRule="auto"/>
+            </w:pPr>
+            <w:r>
+              <w:rPr>
+                <w:sz w:val="22"/>
+                <w:szCs w:val="22"/>
+              </w:rPr>
               <w:t>/admin/users, /admin/rooms, /admin/statuses, /admin/audit-logs</w:t>
             </w:r>
           </w:p>
@@ -16280,7 +16245,7 @@
         <w:keepNext/>
         <w:spacing w:before="240" w:after="120"/>
       </w:pPr>
-      <w:bookmarkStart w:id="32" w:name="_Toc243078198"/>
+      <w:bookmarkStart w:id="32" w:name="_Toc244174649"/>
       <w:r>
         <w:t>4.6. Luồng gửi thông báo</w:t>
       </w:r>
@@ -16307,10 +16272,10 @@
           <w:noProof/>
         </w:rPr>
         <w:drawing>
-          <wp:inline distT="0" distB="0" distL="0" distR="0" wp14:anchorId="572EED13" wp14:editId="3E49D9AE">
+          <wp:inline distT="0" distB="0" distL="0" distR="0" wp14:anchorId="4C16898B" wp14:editId="17A77822">
             <wp:extent cx="5581650" cy="2657475"/>
             <wp:effectExtent l="0" t="0" r="0" b="0"/>
-            <wp:docPr id="1924317521" name="Picture 1924317521"/>
+            <wp:docPr id="905761092" name="Picture 905761092"/>
             <wp:cNvGraphicFramePr>
               <a:graphicFrameLocks xmlns:a="http://schemas.openxmlformats.org/drawingml/2006/main" noChangeAspect="1"/>
             </wp:cNvGraphicFramePr>
@@ -16378,9 +16343,8 @@
         <w:keepNext/>
         <w:spacing w:before="240" w:after="120"/>
       </w:pPr>
-      <w:bookmarkStart w:id="33" w:name="_Toc243078199"/>
-      <w:r>
-        <w:lastRenderedPageBreak/>
+      <w:bookmarkStart w:id="33" w:name="_Toc244174650"/>
+      <w:r>
         <w:t>4.7. Thiết kế bảo mật và quyền riêng tư</w:t>
       </w:r>
       <w:bookmarkEnd w:id="33"/>
@@ -16569,7 +16533,7 @@
                 <w:sz w:val="22"/>
                 <w:szCs w:val="22"/>
               </w:rPr>
-              <w:t>Người nhà không có chức năng tìm bệnh nhân; chỉ liên kết bằng mã do bệnh viện cấp; ca chưa liên kết trả 404 để không lộ sự tồn tại</w:t>
+              <w:t>Người nhà không có chức năng tìm bệnh nhân; chỉ vào xem được ca mà nhân viên đã đăng ký số điện thoại của họ; ca khác trả 404 để không lộ sự tồn tại</w:t>
             </w:r>
           </w:p>
         </w:tc>
@@ -16606,7 +16570,7 @@
                 <w:sz w:val="22"/>
                 <w:szCs w:val="22"/>
               </w:rPr>
-              <w:t>Mã theo dõi an toàn</w:t>
+              <w:t>Người nhà vào xem</w:t>
             </w:r>
           </w:p>
         </w:tc>
@@ -16635,7 +16599,7 @@
                 <w:sz w:val="22"/>
                 <w:szCs w:val="22"/>
               </w:rPr>
-              <w:t>8 ký tự ngẫu nhiên (bỏ ký tự dễ nhầm), dùng một lần, hết hạn sau 24 giờ, chỉ lưu bản băm HMAC; sai 5 lần khóa 15 phút</w:t>
+              <w:t>Không mật khẩu, email hay mã xác nhận (theo yêu cầu). Phải khớp cả 3 thông tin với đăng ký của nhân viên (bỏ dấu, không phân biệt hoa thường); sai 5 lần với cùng SĐT khóa 15 phút; ghi nhật ký FAMILY_ACCESS</w:t>
             </w:r>
           </w:p>
         </w:tc>
@@ -16833,7 +16797,7 @@
                 <w:sz w:val="22"/>
                 <w:szCs w:val="22"/>
               </w:rPr>
-              <w:t>Giới hạn 10 lần/phút theo tài khoản (không phụ thuộc IP nên không né được bằng IP giả)</w:t>
+              <w:t>Giới hạn 10 lần/phút theo tài khoản (nhân viên) hoặc theo số điện thoại (người nhà), không phụ thuộc IP nên không né được bằng IP giả</w:t>
             </w:r>
           </w:p>
         </w:tc>
@@ -17031,7 +16995,7 @@
                 <w:sz w:val="22"/>
                 <w:szCs w:val="22"/>
               </w:rPr>
-              <w:t>Không liên kết được ca đã kết thúc; liên kết tự thu hồi 24 giờ sau khi ca kết thúc</w:t>
+              <w:t>Không đăng ký thêm người nhà cho ca đã kết thúc; quyền xem tự thu hồi 24 giờ sau khi ca kết thúc, phiên người nhà kết thúc theo</w:t>
             </w:r>
           </w:p>
         </w:tc>
@@ -17115,9 +17079,8 @@
         <w:spacing w:after="240"/>
         <w:jc w:val="center"/>
       </w:pPr>
-      <w:bookmarkStart w:id="34" w:name="_Toc243078200"/>
-      <w:r>
-        <w:lastRenderedPageBreak/>
+      <w:bookmarkStart w:id="34" w:name="_Toc244174651"/>
+      <w:r>
         <w:t>CHƯƠNG 5. XÂY DỰNG SẢN PHẨM</w:t>
       </w:r>
       <w:bookmarkEnd w:id="34"/>
@@ -17138,7 +17101,7 @@
         <w:keepNext/>
         <w:spacing w:before="240" w:after="120"/>
       </w:pPr>
-      <w:bookmarkStart w:id="35" w:name="_Toc243078201"/>
+      <w:bookmarkStart w:id="35" w:name="_Toc244174652"/>
       <w:r>
         <w:t>5.1. Trang chủ và đăng nhập</w:t>
       </w:r>
@@ -17165,10 +17128,10 @@
           <w:noProof/>
         </w:rPr>
         <w:drawing>
-          <wp:inline distT="0" distB="0" distL="0" distR="0" wp14:anchorId="3230B1A4" wp14:editId="111BBAB8">
+          <wp:inline distT="0" distB="0" distL="0" distR="0" wp14:anchorId="0EB873A4" wp14:editId="55391266">
             <wp:extent cx="4324350" cy="3629025"/>
             <wp:effectExtent l="0" t="0" r="0" b="0"/>
-            <wp:docPr id="731343316" name="Picture 731343316"/>
+            <wp:docPr id="74332817" name="Picture 74332817"/>
             <wp:cNvGraphicFramePr>
               <a:graphicFrameLocks xmlns:a="http://schemas.openxmlformats.org/drawingml/2006/main" noChangeAspect="1"/>
             </wp:cNvGraphicFramePr>
@@ -17236,7 +17199,7 @@
         <w:keepNext/>
         <w:spacing w:before="240" w:after="120"/>
       </w:pPr>
-      <w:bookmarkStart w:id="36" w:name="_Toc243078202"/>
+      <w:bookmarkStart w:id="36" w:name="_Toc244174653"/>
       <w:r>
         <w:t>5.2. Chức năng của nhân viên y tế</w:t>
       </w:r>
@@ -17248,7 +17211,7 @@
         <w:keepNext/>
         <w:spacing w:before="180" w:after="80"/>
       </w:pPr>
-      <w:bookmarkStart w:id="37" w:name="_Toc243078203"/>
+      <w:bookmarkStart w:id="37" w:name="_Toc244174654"/>
       <w:r>
         <w:t>Danh sách ca và tạo ca</w:t>
       </w:r>
@@ -17274,12 +17237,11 @@
         <w:rPr>
           <w:noProof/>
         </w:rPr>
-        <w:lastRenderedPageBreak/>
         <w:drawing>
-          <wp:inline distT="0" distB="0" distL="0" distR="0" wp14:anchorId="6FD6EC06" wp14:editId="23299173">
-            <wp:extent cx="5581650" cy="4486275"/>
+          <wp:inline distT="0" distB="0" distL="0" distR="0" wp14:anchorId="0983B943" wp14:editId="1D66E987">
+            <wp:extent cx="5581650" cy="3752850"/>
             <wp:effectExtent l="0" t="0" r="0" b="0"/>
-            <wp:docPr id="20527593" name="Picture 20527593"/>
+            <wp:docPr id="2106151516" name="Picture 2106151516"/>
             <wp:cNvGraphicFramePr>
               <a:graphicFrameLocks xmlns:a="http://schemas.openxmlformats.org/drawingml/2006/main" noChangeAspect="1"/>
             </wp:cNvGraphicFramePr>
@@ -17302,7 +17264,7 @@
                   <pic:spPr bwMode="auto">
                     <a:xfrm>
                       <a:off x="0" y="0"/>
-                      <a:ext cx="5581650" cy="4486275"/>
+                      <a:ext cx="5581650" cy="3752850"/>
                     </a:xfrm>
                     <a:prstGeom prst="rect">
                       <a:avLst/>
@@ -17347,7 +17309,7 @@
         <w:keepNext/>
         <w:spacing w:before="180" w:after="80"/>
       </w:pPr>
-      <w:bookmarkStart w:id="38" w:name="_Toc243078204"/>
+      <w:bookmarkStart w:id="38" w:name="_Toc244174655"/>
       <w:r>
         <w:t>Cập nhật trạng thái</w:t>
       </w:r>
@@ -17373,12 +17335,11 @@
         <w:rPr>
           <w:noProof/>
         </w:rPr>
-        <w:lastRenderedPageBreak/>
         <w:drawing>
-          <wp:inline distT="0" distB="0" distL="0" distR="0" wp14:anchorId="0CBDB894" wp14:editId="655ECA66">
-            <wp:extent cx="4324350" cy="5476875"/>
+          <wp:inline distT="0" distB="0" distL="0" distR="0" wp14:anchorId="10199DA3" wp14:editId="41C13588">
+            <wp:extent cx="4324350" cy="5572125"/>
             <wp:effectExtent l="0" t="0" r="0" b="0"/>
-            <wp:docPr id="1278905293" name="Picture 1278905293"/>
+            <wp:docPr id="99191572" name="Picture 99191572"/>
             <wp:cNvGraphicFramePr>
               <a:graphicFrameLocks xmlns:a="http://schemas.openxmlformats.org/drawingml/2006/main" noChangeAspect="1"/>
             </wp:cNvGraphicFramePr>
@@ -17401,7 +17362,7 @@
                   <pic:spPr bwMode="auto">
                     <a:xfrm>
                       <a:off x="0" y="0"/>
-                      <a:ext cx="4324350" cy="5476875"/>
+                      <a:ext cx="4324350" cy="5572125"/>
                     </a:xfrm>
                     <a:prstGeom prst="rect">
                       <a:avLst/>
@@ -17446,9 +17407,9 @@
         <w:keepNext/>
         <w:spacing w:before="180" w:after="80"/>
       </w:pPr>
-      <w:bookmarkStart w:id="39" w:name="_Toc243078205"/>
-      <w:r>
-        <w:t>Cấp mã theo dõi và QR</w:t>
+      <w:bookmarkStart w:id="39" w:name="_Toc244174656"/>
+      <w:r>
+        <w:t>Đăng ký người nhà được theo dõi</w:t>
       </w:r>
       <w:bookmarkEnd w:id="39"/>
     </w:p>
@@ -17459,7 +17420,7 @@
         <w:jc w:val="both"/>
       </w:pPr>
       <w:r>
-        <w:t>Nhân viên bấm “Cấp mã theo dõi mới” để sinh mã 8 ký tự kèm QR. QR chứa đường dẫn tới trang liên kết với mã điền sẵn, nên người nhà chỉ cần mở camera điện thoại. Mã chỉ hiển thị một lần; danh sách bên dưới cho biết trạng thái từng mã (chờ dùng, đã dùng, hết hạn, đã thu hồi) và cho phép thu hồi mã chưa dùng.</w:t>
+        <w:t>Trong chi tiết ca, nhân viên nhập số điện thoại và họ tên người nhà rồi bấm “Đăng ký”. Người nhà không cần tạo tài khoản. Danh sách bên dưới cho biết ai đã được đăng ký, lúc nào, do nhân viên nào; nhân viên có thể gỡ quyền theo dõi bất cứ lúc nào.</w:t>
       </w:r>
     </w:p>
     <w:p>
@@ -17472,12 +17433,11 @@
         <w:rPr>
           <w:noProof/>
         </w:rPr>
-        <w:lastRenderedPageBreak/>
         <w:drawing>
-          <wp:inline distT="0" distB="0" distL="0" distR="0" wp14:anchorId="00879395" wp14:editId="6C357D83">
-            <wp:extent cx="4324350" cy="6657975"/>
+          <wp:inline distT="0" distB="0" distL="0" distR="0" wp14:anchorId="2C2F688A" wp14:editId="31CA5093">
+            <wp:extent cx="4324350" cy="5676900"/>
             <wp:effectExtent l="0" t="0" r="0" b="0"/>
-            <wp:docPr id="1252852835" name="Picture 1252852835"/>
+            <wp:docPr id="1921934048" name="Picture 1921934048"/>
             <wp:cNvGraphicFramePr>
               <a:graphicFrameLocks xmlns:a="http://schemas.openxmlformats.org/drawingml/2006/main" noChangeAspect="1"/>
             </wp:cNvGraphicFramePr>
@@ -17500,7 +17460,7 @@
                   <pic:spPr bwMode="auto">
                     <a:xfrm>
                       <a:off x="0" y="0"/>
-                      <a:ext cx="4324350" cy="6657975"/>
+                      <a:ext cx="4324350" cy="5676900"/>
                     </a:xfrm>
                     <a:prstGeom prst="rect">
                       <a:avLst/>
@@ -17536,7 +17496,7 @@
           <w:sz w:val="24"/>
           <w:szCs w:val="24"/>
         </w:rPr>
-        <w:t>Mã theo dõi và QR cấp cho người nhà</w:t>
+        <w:t>Nhân viên đăng ký người nhà cho ca phẫu thuật</w:t>
       </w:r>
     </w:p>
     <w:p>
@@ -17545,7 +17505,7 @@
         <w:keepNext/>
         <w:spacing w:before="240" w:after="120"/>
       </w:pPr>
-      <w:bookmarkStart w:id="40" w:name="_Toc243078206"/>
+      <w:bookmarkStart w:id="40" w:name="_Toc244174657"/>
       <w:r>
         <w:t>5.3. Ứng dụng của người nhà</w:t>
       </w:r>
@@ -17558,7 +17518,7 @@
         <w:jc w:val="both"/>
       </w:pPr>
       <w:r>
-        <w:t>Từ lúc mở ứng dụng, người nhà xem được trạng thái hiện tại sau tối đa 2 thao tác (mở danh sách → chọn bệnh nhân), đạt yêu cầu NFR-08 (tối đa 3 thao tác). Màn hình nhận cập nhật qua SSE nên đổi ngay khi nhân viên bấm nút, không cần tải lại.</w:t>
+        <w:t>Từ lúc mở ứng dụng, người nhà xem được trạng thái hiện tại sau tối đa 2 thao tác (mở danh sách → chọn bệnh nhân), đạt yêu cầu NFR-08 (tối đa 3 thao tác). Người nhà vào xem bằng số điện thoại, họ tên mình và họ tên bệnh nhân, không cần email hay mật khẩu; phiên được nhớ cho tới khi ca kết thúc. Màn hình nhận cập nhật qua SSE nên đổi ngay khi nhân viên bấm nút, không cần tải lại.</w:t>
       </w:r>
     </w:p>
     <w:p>
@@ -17571,12 +17531,11 @@
         <w:rPr>
           <w:noProof/>
         </w:rPr>
-        <w:lastRenderedPageBreak/>
         <w:drawing>
-          <wp:inline distT="0" distB="0" distL="0" distR="0" wp14:anchorId="5B1D083F" wp14:editId="03D22F6F">
+          <wp:inline distT="0" distB="0" distL="0" distR="0" wp14:anchorId="3981D418" wp14:editId="44B27B81">
             <wp:extent cx="2343150" cy="5067300"/>
             <wp:effectExtent l="0" t="0" r="0" b="0"/>
-            <wp:docPr id="1496557688" name="Picture 1496557688"/>
+            <wp:docPr id="1775861573" name="Picture 1775861573"/>
             <wp:cNvGraphicFramePr>
               <a:graphicFrameLocks xmlns:a="http://schemas.openxmlformats.org/drawingml/2006/main" noChangeAspect="1"/>
             </wp:cNvGraphicFramePr>
@@ -17648,12 +17607,11 @@
         <w:rPr>
           <w:noProof/>
         </w:rPr>
-        <w:lastRenderedPageBreak/>
         <w:drawing>
-          <wp:inline distT="0" distB="0" distL="0" distR="0" wp14:anchorId="317260EF" wp14:editId="0BFD7FBA">
-            <wp:extent cx="2343150" cy="7134225"/>
+          <wp:inline distT="0" distB="0" distL="0" distR="0" wp14:anchorId="0E38D517" wp14:editId="355382F0">
+            <wp:extent cx="2343150" cy="7010400"/>
             <wp:effectExtent l="0" t="0" r="0" b="0"/>
-            <wp:docPr id="262218270" name="Picture 262218270"/>
+            <wp:docPr id="1880339110" name="Picture 1880339110"/>
             <wp:cNvGraphicFramePr>
               <a:graphicFrameLocks xmlns:a="http://schemas.openxmlformats.org/drawingml/2006/main" noChangeAspect="1"/>
             </wp:cNvGraphicFramePr>
@@ -17676,7 +17634,7 @@
                   <pic:spPr bwMode="auto">
                     <a:xfrm>
                       <a:off x="0" y="0"/>
-                      <a:ext cx="2343150" cy="7134225"/>
+                      <a:ext cx="2343150" cy="7010400"/>
                     </a:xfrm>
                     <a:prstGeom prst="rect">
                       <a:avLst/>
@@ -17725,12 +17683,11 @@
         <w:rPr>
           <w:noProof/>
         </w:rPr>
-        <w:lastRenderedPageBreak/>
         <w:drawing>
-          <wp:inline distT="0" distB="0" distL="0" distR="0" wp14:anchorId="1719C050" wp14:editId="51F38A50">
+          <wp:inline distT="0" distB="0" distL="0" distR="0" wp14:anchorId="5FD2F1C6" wp14:editId="3A9228CC">
             <wp:extent cx="2343150" cy="5067300"/>
             <wp:effectExtent l="0" t="0" r="0" b="0"/>
-            <wp:docPr id="491216103" name="Picture 491216103"/>
+            <wp:docPr id="1469038681" name="Picture 1469038681"/>
             <wp:cNvGraphicFramePr>
               <a:graphicFrameLocks xmlns:a="http://schemas.openxmlformats.org/drawingml/2006/main" noChangeAspect="1"/>
             </wp:cNvGraphicFramePr>
@@ -17789,7 +17746,7 @@
           <w:sz w:val="24"/>
           <w:szCs w:val="24"/>
         </w:rPr>
-        <w:t>Mở QR khi chưa có tài khoản: sau khi đăng ký, mã được điền sẵn</w:t>
+        <w:t>Người nhà vào xem bằng SĐT + họ tên + họ tên bệnh nhân</w:t>
       </w:r>
     </w:p>
     <w:p>
@@ -17802,12 +17759,11 @@
         <w:rPr>
           <w:noProof/>
         </w:rPr>
-        <w:lastRenderedPageBreak/>
         <w:drawing>
-          <wp:inline distT="0" distB="0" distL="0" distR="0" wp14:anchorId="070E0352" wp14:editId="3FA2159D">
-            <wp:extent cx="2343150" cy="5495925"/>
+          <wp:inline distT="0" distB="0" distL="0" distR="0" wp14:anchorId="1433FB38" wp14:editId="29395668">
+            <wp:extent cx="2343150" cy="5067300"/>
             <wp:effectExtent l="0" t="0" r="0" b="0"/>
-            <wp:docPr id="784407782" name="Picture 784407782"/>
+            <wp:docPr id="1181807354" name="Picture 1181807354"/>
             <wp:cNvGraphicFramePr>
               <a:graphicFrameLocks xmlns:a="http://schemas.openxmlformats.org/drawingml/2006/main" noChangeAspect="1"/>
             </wp:cNvGraphicFramePr>
@@ -17830,7 +17786,7 @@
                   <pic:spPr bwMode="auto">
                     <a:xfrm>
                       <a:off x="0" y="0"/>
-                      <a:ext cx="2343150" cy="5495925"/>
+                      <a:ext cx="2343150" cy="5067300"/>
                     </a:xfrm>
                     <a:prstGeom prst="rect">
                       <a:avLst/>
@@ -17879,12 +17835,11 @@
         <w:rPr>
           <w:noProof/>
         </w:rPr>
-        <w:lastRenderedPageBreak/>
         <w:drawing>
-          <wp:inline distT="0" distB="0" distL="0" distR="0" wp14:anchorId="4824040C" wp14:editId="28BC1C4C">
-            <wp:extent cx="2343150" cy="6067425"/>
+          <wp:inline distT="0" distB="0" distL="0" distR="0" wp14:anchorId="17B49D10" wp14:editId="06FA3B05">
+            <wp:extent cx="2343150" cy="5067300"/>
             <wp:effectExtent l="0" t="0" r="0" b="0"/>
-            <wp:docPr id="804396299" name="Picture 804396299"/>
+            <wp:docPr id="292334328" name="Picture 292334328"/>
             <wp:cNvGraphicFramePr>
               <a:graphicFrameLocks xmlns:a="http://schemas.openxmlformats.org/drawingml/2006/main" noChangeAspect="1"/>
             </wp:cNvGraphicFramePr>
@@ -17907,7 +17862,7 @@
                   <pic:spPr bwMode="auto">
                     <a:xfrm>
                       <a:off x="0" y="0"/>
-                      <a:ext cx="2343150" cy="6067425"/>
+                      <a:ext cx="2343150" cy="5067300"/>
                     </a:xfrm>
                     <a:prstGeom prst="rect">
                       <a:avLst/>
@@ -17948,77 +17903,12 @@
     </w:p>
     <w:p>
       <w:pPr>
-        <w:pStyle w:val="Heading2"/>
-        <w:keepNext/>
-        <w:spacing w:before="240" w:after="120"/>
-      </w:pPr>
-      <w:bookmarkStart w:id="41" w:name="_Toc243078207"/>
-      <w:r>
-        <w:t>5.4. Trang quản trị</w:t>
-      </w:r>
-      <w:bookmarkEnd w:id="41"/>
-    </w:p>
-    <w:p>
-      <w:pPr>
-        <w:pStyle w:val="ListParagraph"/>
-        <w:numPr>
-          <w:ilvl w:val="0"/>
-          <w:numId w:val="2"/>
-        </w:numPr>
-        <w:spacing w:after="60" w:line="320" w:lineRule="auto"/>
+        <w:spacing w:before="60" w:after="100" w:line="340" w:lineRule="auto"/>
+        <w:ind w:firstLine="567"/>
         <w:jc w:val="both"/>
       </w:pPr>
       <w:r>
-        <w:rPr>
-          <w:b/>
-          <w:bCs/>
-        </w:rPr>
-        <w:t>Tài khoản:</w:t>
-      </w:r>
-      <w:r>
-        <w:t xml:space="preserve"> tạo tài khoản nhân viên/quản trị, đổi vai trò, khóa/mở khóa (khóa sẽ thu hồi phiên đang mở); quản trị viên không tự khóa được mình.</w:t>
-      </w:r>
-    </w:p>
-    <w:p>
-      <w:pPr>
-        <w:pStyle w:val="ListParagraph"/>
-        <w:numPr>
-          <w:ilvl w:val="0"/>
-          <w:numId w:val="2"/>
-        </w:numPr>
-        <w:spacing w:after="60" w:line="320" w:lineRule="auto"/>
-        <w:jc w:val="both"/>
-      </w:pPr>
-      <w:r>
-        <w:rPr>
-          <w:b/>
-          <w:bCs/>
-        </w:rPr>
-        <w:t>Phòng và trạng thái:</w:t>
-      </w:r>
-      <w:r>
-        <w:t xml:space="preserve"> thêm phòng, ngừng sử dụng phòng; sửa tên hiển thị và nội dung thông báo của từng trạng thái (áp dụng ngay cho lần đổi trạng thái tiếp theo).</w:t>
-      </w:r>
-    </w:p>
-    <w:p>
-      <w:pPr>
-        <w:pStyle w:val="ListParagraph"/>
-        <w:numPr>
-          <w:ilvl w:val="0"/>
-          <w:numId w:val="2"/>
-        </w:numPr>
-        <w:spacing w:after="60" w:line="320" w:lineRule="auto"/>
-        <w:jc w:val="both"/>
-      </w:pPr>
-      <w:r>
-        <w:rPr>
-          <w:b/>
-          <w:bCs/>
-        </w:rPr>
-        <w:t>Nhật ký truy cập:</w:t>
-      </w:r>
-      <w:r>
-        <w:t xml:space="preserve"> lọc theo người dùng, hành động, khoảng ngày; có phân trang.</w:t>
+        <w:t>Khi ứng dụng đang mở, mỗi lần ca chuyển sang giai đoạn mới điện thoại kêu một âm báo ngắn và rung nhẹ. Khi ca chuyển sang “Đã hoàn tất”, chuông reo và máy rung lặp lại cho tới khi người nhà bấm “Tắt chuông”; mục Cài đặt có nút để thử âm báo và chuông. Khi ứng dụng đang đóng hoặc tắt màn hình, thông báo đẩy vẫn hiện trên màn hình khóa; thông báo kết thúc ca được giữ lại tới khi người dùng tắt (Android rung dài, iPhone phát âm thông báo mặc định của máy).</w:t>
       </w:r>
     </w:p>
     <w:p>
@@ -18031,12 +17921,11 @@
         <w:rPr>
           <w:noProof/>
         </w:rPr>
-        <w:lastRenderedPageBreak/>
         <w:drawing>
-          <wp:inline distT="0" distB="0" distL="0" distR="0" wp14:anchorId="53966494" wp14:editId="4B9D5ADB">
-            <wp:extent cx="5581650" cy="6515100"/>
+          <wp:inline distT="0" distB="0" distL="0" distR="0" wp14:anchorId="48B6D7E0" wp14:editId="29849AE5">
+            <wp:extent cx="2343150" cy="5067300"/>
             <wp:effectExtent l="0" t="0" r="0" b="0"/>
-            <wp:docPr id="821289225" name="Picture 821289225"/>
+            <wp:docPr id="251124989" name="Picture 251124989"/>
             <wp:cNvGraphicFramePr>
               <a:graphicFrameLocks xmlns:a="http://schemas.openxmlformats.org/drawingml/2006/main" noChangeAspect="1"/>
             </wp:cNvGraphicFramePr>
@@ -18059,7 +17948,7 @@
                   <pic:spPr bwMode="auto">
                     <a:xfrm>
                       <a:off x="0" y="0"/>
-                      <a:ext cx="5581650" cy="6515100"/>
+                      <a:ext cx="2343150" cy="5067300"/>
                     </a:xfrm>
                     <a:prstGeom prst="rect">
                       <a:avLst/>
@@ -18095,7 +17984,7 @@
           <w:sz w:val="24"/>
           <w:szCs w:val="24"/>
         </w:rPr>
-        <w:t>Quản lý tài khoản (tài khoản vừa tạo đã bị khóa)</w:t>
+        <w:t>Thông báo đẩy trên màn hình khóa iPhone khi đổi giai đoạn</w:t>
       </w:r>
     </w:p>
     <w:p>
@@ -18108,12 +17997,11 @@
         <w:rPr>
           <w:noProof/>
         </w:rPr>
-        <w:lastRenderedPageBreak/>
         <w:drawing>
-          <wp:inline distT="0" distB="0" distL="0" distR="0" wp14:anchorId="6EB35C45" wp14:editId="71E7C5AA">
-            <wp:extent cx="5581650" cy="6362700"/>
+          <wp:inline distT="0" distB="0" distL="0" distR="0" wp14:anchorId="5F3719F5" wp14:editId="5FEBB2E1">
+            <wp:extent cx="2343150" cy="5067300"/>
             <wp:effectExtent l="0" t="0" r="0" b="0"/>
-            <wp:docPr id="1989913228" name="Picture 1989913228"/>
+            <wp:docPr id="2121432387" name="Picture 2121432387"/>
             <wp:cNvGraphicFramePr>
               <a:graphicFrameLocks xmlns:a="http://schemas.openxmlformats.org/drawingml/2006/main" noChangeAspect="1"/>
             </wp:cNvGraphicFramePr>
@@ -18136,7 +18024,7 @@
                   <pic:spPr bwMode="auto">
                     <a:xfrm>
                       <a:off x="0" y="0"/>
-                      <a:ext cx="5581650" cy="6362700"/>
+                      <a:ext cx="2343150" cy="5067300"/>
                     </a:xfrm>
                     <a:prstGeom prst="rect">
                       <a:avLst/>
@@ -18172,7 +18060,83 @@
           <w:sz w:val="24"/>
           <w:szCs w:val="24"/>
         </w:rPr>
-        <w:t>Nhật ký truy cập lọc theo hành động</w:t>
+        <w:t>Thông báo kết thúc ca trên màn hình khóa iPhone</w:t>
+      </w:r>
+    </w:p>
+    <w:p>
+      <w:pPr>
+        <w:keepNext/>
+        <w:spacing w:before="120"/>
+        <w:jc w:val="center"/>
+      </w:pPr>
+      <w:r>
+        <w:rPr>
+          <w:noProof/>
+        </w:rPr>
+        <w:drawing>
+          <wp:inline distT="0" distB="0" distL="0" distR="0" wp14:anchorId="703A4AA3" wp14:editId="074E3472">
+            <wp:extent cx="2343150" cy="5067300"/>
+            <wp:effectExtent l="0" t="0" r="0" b="0"/>
+            <wp:docPr id="416729527" name="Picture 416729527"/>
+            <wp:cNvGraphicFramePr>
+              <a:graphicFrameLocks xmlns:a="http://schemas.openxmlformats.org/drawingml/2006/main" noChangeAspect="1"/>
+            </wp:cNvGraphicFramePr>
+            <a:graphic xmlns:a="http://schemas.openxmlformats.org/drawingml/2006/main">
+              <a:graphicData uri="http://schemas.openxmlformats.org/drawingml/2006/picture">
+                <pic:pic xmlns:pic="http://schemas.openxmlformats.org/drawingml/2006/picture">
+                  <pic:nvPicPr>
+                    <pic:cNvPr id="0" name=""/>
+                    <pic:cNvPicPr>
+                      <a:picLocks noChangeAspect="1" noChangeArrowheads="1"/>
+                    </pic:cNvPicPr>
+                  </pic:nvPicPr>
+                  <pic:blipFill>
+                    <a:blip r:embed="rId22"/>
+                    <a:srcRect/>
+                    <a:stretch>
+                      <a:fillRect/>
+                    </a:stretch>
+                  </pic:blipFill>
+                  <pic:spPr bwMode="auto">
+                    <a:xfrm>
+                      <a:off x="0" y="0"/>
+                      <a:ext cx="2343150" cy="5067300"/>
+                    </a:xfrm>
+                    <a:prstGeom prst="rect">
+                      <a:avLst/>
+                    </a:prstGeom>
+                  </pic:spPr>
+                </pic:pic>
+              </a:graphicData>
+            </a:graphic>
+          </wp:inline>
+        </w:drawing>
+      </w:r>
+    </w:p>
+    <w:p>
+      <w:pPr>
+        <w:spacing w:before="60" w:after="200"/>
+        <w:jc w:val="center"/>
+      </w:pPr>
+      <w:r>
+        <w:rPr>
+          <w:b/>
+          <w:bCs/>
+          <w:i/>
+          <w:iCs/>
+          <w:sz w:val="24"/>
+          <w:szCs w:val="24"/>
+        </w:rPr>
+        <w:t xml:space="preserve">Hình 5.12. </w:t>
+      </w:r>
+      <w:r>
+        <w:rPr>
+          <w:i/>
+          <w:iCs/>
+          <w:sz w:val="24"/>
+          <w:szCs w:val="24"/>
+        </w:rPr>
+        <w:t>Chuông báo ca phẫu thuật đã hoàn tất, reo tới khi bấm “Tắt chuông”</w:t>
       </w:r>
     </w:p>
     <w:p>
@@ -18181,7 +18145,234 @@
         <w:keepNext/>
         <w:spacing w:before="240" w:after="120"/>
       </w:pPr>
-      <w:bookmarkStart w:id="42" w:name="_Toc243078208"/>
+      <w:bookmarkStart w:id="41" w:name="_Toc244174658"/>
+      <w:r>
+        <w:t>5.4. Trang quản trị</w:t>
+      </w:r>
+      <w:bookmarkEnd w:id="41"/>
+    </w:p>
+    <w:p>
+      <w:pPr>
+        <w:pStyle w:val="ListParagraph"/>
+        <w:numPr>
+          <w:ilvl w:val="0"/>
+          <w:numId w:val="2"/>
+        </w:numPr>
+        <w:spacing w:after="60" w:line="320" w:lineRule="auto"/>
+        <w:jc w:val="both"/>
+      </w:pPr>
+      <w:r>
+        <w:rPr>
+          <w:b/>
+          <w:bCs/>
+        </w:rPr>
+        <w:t>Tài khoản:</w:t>
+      </w:r>
+      <w:r>
+        <w:t xml:space="preserve"> tạo tài khoản nhân viên/quản trị, đổi vai trò, khóa/mở khóa (khóa sẽ thu hồi phiên đang mở); quản trị viên không tự khóa được mình.</w:t>
+      </w:r>
+    </w:p>
+    <w:p>
+      <w:pPr>
+        <w:pStyle w:val="ListParagraph"/>
+        <w:numPr>
+          <w:ilvl w:val="0"/>
+          <w:numId w:val="2"/>
+        </w:numPr>
+        <w:spacing w:after="60" w:line="320" w:lineRule="auto"/>
+        <w:jc w:val="both"/>
+      </w:pPr>
+      <w:r>
+        <w:rPr>
+          <w:b/>
+          <w:bCs/>
+        </w:rPr>
+        <w:t>Phòng và trạng thái:</w:t>
+      </w:r>
+      <w:r>
+        <w:t xml:space="preserve"> thêm phòng, ngừng sử dụng phòng; sửa tên hiển thị và nội dung thông báo của từng trạng thái (áp dụng ngay cho lần đổi trạng thái tiếp theo).</w:t>
+      </w:r>
+    </w:p>
+    <w:p>
+      <w:pPr>
+        <w:pStyle w:val="ListParagraph"/>
+        <w:numPr>
+          <w:ilvl w:val="0"/>
+          <w:numId w:val="2"/>
+        </w:numPr>
+        <w:spacing w:after="60" w:line="320" w:lineRule="auto"/>
+        <w:jc w:val="both"/>
+      </w:pPr>
+      <w:r>
+        <w:rPr>
+          <w:b/>
+          <w:bCs/>
+        </w:rPr>
+        <w:t>Nhật ký truy cập:</w:t>
+      </w:r>
+      <w:r>
+        <w:t xml:space="preserve"> lọc theo người dùng, hành động, khoảng ngày; có phân trang.</w:t>
+      </w:r>
+    </w:p>
+    <w:p>
+      <w:pPr>
+        <w:keepNext/>
+        <w:spacing w:before="120"/>
+        <w:jc w:val="center"/>
+      </w:pPr>
+      <w:r>
+        <w:rPr>
+          <w:noProof/>
+        </w:rPr>
+        <w:drawing>
+          <wp:inline distT="0" distB="0" distL="0" distR="0" wp14:anchorId="5E3EBC2C" wp14:editId="27C5DE1F">
+            <wp:extent cx="5581650" cy="4714875"/>
+            <wp:effectExtent l="0" t="0" r="0" b="0"/>
+            <wp:docPr id="1095091099" name="Picture 1095091099"/>
+            <wp:cNvGraphicFramePr>
+              <a:graphicFrameLocks xmlns:a="http://schemas.openxmlformats.org/drawingml/2006/main" noChangeAspect="1"/>
+            </wp:cNvGraphicFramePr>
+            <a:graphic xmlns:a="http://schemas.openxmlformats.org/drawingml/2006/main">
+              <a:graphicData uri="http://schemas.openxmlformats.org/drawingml/2006/picture">
+                <pic:pic xmlns:pic="http://schemas.openxmlformats.org/drawingml/2006/picture">
+                  <pic:nvPicPr>
+                    <pic:cNvPr id="0" name=""/>
+                    <pic:cNvPicPr>
+                      <a:picLocks noChangeAspect="1" noChangeArrowheads="1"/>
+                    </pic:cNvPicPr>
+                  </pic:nvPicPr>
+                  <pic:blipFill>
+                    <a:blip r:embed="rId23"/>
+                    <a:srcRect/>
+                    <a:stretch>
+                      <a:fillRect/>
+                    </a:stretch>
+                  </pic:blipFill>
+                  <pic:spPr bwMode="auto">
+                    <a:xfrm>
+                      <a:off x="0" y="0"/>
+                      <a:ext cx="5581650" cy="4714875"/>
+                    </a:xfrm>
+                    <a:prstGeom prst="rect">
+                      <a:avLst/>
+                    </a:prstGeom>
+                  </pic:spPr>
+                </pic:pic>
+              </a:graphicData>
+            </a:graphic>
+          </wp:inline>
+        </w:drawing>
+      </w:r>
+    </w:p>
+    <w:p>
+      <w:pPr>
+        <w:spacing w:before="60" w:after="200"/>
+        <w:jc w:val="center"/>
+      </w:pPr>
+      <w:r>
+        <w:rPr>
+          <w:b/>
+          <w:bCs/>
+          <w:i/>
+          <w:iCs/>
+          <w:sz w:val="24"/>
+          <w:szCs w:val="24"/>
+        </w:rPr>
+        <w:t xml:space="preserve">Hình 5.13. </w:t>
+      </w:r>
+      <w:r>
+        <w:rPr>
+          <w:i/>
+          <w:iCs/>
+          <w:sz w:val="24"/>
+          <w:szCs w:val="24"/>
+        </w:rPr>
+        <w:t>Quản lý tài khoản (tài khoản vừa tạo đã bị khóa)</w:t>
+      </w:r>
+    </w:p>
+    <w:p>
+      <w:pPr>
+        <w:keepNext/>
+        <w:spacing w:before="120"/>
+        <w:jc w:val="center"/>
+      </w:pPr>
+      <w:r>
+        <w:rPr>
+          <w:noProof/>
+        </w:rPr>
+        <w:drawing>
+          <wp:inline distT="0" distB="0" distL="0" distR="0" wp14:anchorId="6CE70195" wp14:editId="7534A56A">
+            <wp:extent cx="5581650" cy="3752850"/>
+            <wp:effectExtent l="0" t="0" r="0" b="0"/>
+            <wp:docPr id="229543028" name="Picture 229543028"/>
+            <wp:cNvGraphicFramePr>
+              <a:graphicFrameLocks xmlns:a="http://schemas.openxmlformats.org/drawingml/2006/main" noChangeAspect="1"/>
+            </wp:cNvGraphicFramePr>
+            <a:graphic xmlns:a="http://schemas.openxmlformats.org/drawingml/2006/main">
+              <a:graphicData uri="http://schemas.openxmlformats.org/drawingml/2006/picture">
+                <pic:pic xmlns:pic="http://schemas.openxmlformats.org/drawingml/2006/picture">
+                  <pic:nvPicPr>
+                    <pic:cNvPr id="0" name=""/>
+                    <pic:cNvPicPr>
+                      <a:picLocks noChangeAspect="1" noChangeArrowheads="1"/>
+                    </pic:cNvPicPr>
+                  </pic:nvPicPr>
+                  <pic:blipFill>
+                    <a:blip r:embed="rId24"/>
+                    <a:srcRect/>
+                    <a:stretch>
+                      <a:fillRect/>
+                    </a:stretch>
+                  </pic:blipFill>
+                  <pic:spPr bwMode="auto">
+                    <a:xfrm>
+                      <a:off x="0" y="0"/>
+                      <a:ext cx="5581650" cy="3752850"/>
+                    </a:xfrm>
+                    <a:prstGeom prst="rect">
+                      <a:avLst/>
+                    </a:prstGeom>
+                  </pic:spPr>
+                </pic:pic>
+              </a:graphicData>
+            </a:graphic>
+          </wp:inline>
+        </w:drawing>
+      </w:r>
+    </w:p>
+    <w:p>
+      <w:pPr>
+        <w:spacing w:before="60" w:after="200"/>
+        <w:jc w:val="center"/>
+      </w:pPr>
+      <w:r>
+        <w:rPr>
+          <w:b/>
+          <w:bCs/>
+          <w:i/>
+          <w:iCs/>
+          <w:sz w:val="24"/>
+          <w:szCs w:val="24"/>
+        </w:rPr>
+        <w:t xml:space="preserve">Hình 5.14. </w:t>
+      </w:r>
+      <w:r>
+        <w:rPr>
+          <w:i/>
+          <w:iCs/>
+          <w:sz w:val="24"/>
+          <w:szCs w:val="24"/>
+        </w:rPr>
+        <w:t>Nhật ký truy cập lọc theo hành động</w:t>
+      </w:r>
+    </w:p>
+    <w:p>
+      <w:pPr>
+        <w:pStyle w:val="Heading2"/>
+        <w:keepNext/>
+        <w:spacing w:before="240" w:after="120"/>
+      </w:pPr>
+      <w:bookmarkStart w:id="42" w:name="_Toc244174659"/>
       <w:r>
         <w:t>5.5. Thông báo và cập nhật thời gian thực</w:t>
       </w:r>
@@ -18204,9 +18395,8 @@
         <w:spacing w:after="240"/>
         <w:jc w:val="center"/>
       </w:pPr>
-      <w:bookmarkStart w:id="43" w:name="_Toc243078209"/>
-      <w:r>
-        <w:lastRenderedPageBreak/>
+      <w:bookmarkStart w:id="43" w:name="_Toc244174660"/>
+      <w:r>
         <w:t>CHƯƠNG 6. KIỂM THỬ VÀ ĐÁNH GIÁ</w:t>
       </w:r>
       <w:bookmarkEnd w:id="43"/>
@@ -18227,7 +18417,7 @@
         <w:keepNext/>
         <w:spacing w:before="240" w:after="120"/>
       </w:pPr>
-      <w:bookmarkStart w:id="44" w:name="_Toc243078210"/>
+      <w:bookmarkStart w:id="44" w:name="_Toc244174661"/>
       <w:r>
         <w:t>6.1. Chiến lược kiểm thử</w:t>
       </w:r>
@@ -18512,7 +18702,7 @@
                 <w:sz w:val="22"/>
                 <w:szCs w:val="22"/>
               </w:rPr>
-              <w:t>Quy tắc chuyển trạng thái, sinh/băm mã, khóa nhập sai, phân quyền, giới hạn tần suất, gửi push và thử lại</w:t>
+              <w:t>Quy tắc chuyển trạng thái, so khớp họ tên bỏ dấu, chuẩn hóa SĐT, khóa nhập sai, phân quyền, giới hạn tần suất, gửi push và thử lại</w:t>
             </w:r>
           </w:p>
         </w:tc>
@@ -18541,7 +18731,7 @@
                 <w:sz w:val="22"/>
                 <w:szCs w:val="22"/>
               </w:rPr>
-              <w:t>53 test</w:t>
+              <w:t>55 test</w:t>
             </w:r>
           </w:p>
         </w:tc>
@@ -18636,7 +18826,7 @@
                 <w:sz w:val="22"/>
                 <w:szCs w:val="22"/>
               </w:rPr>
-              <w:t>Toàn bộ API với PostgreSQL thật: xác thực, ca, trạng thái, liên kết, thông báo, SSE, quản trị</w:t>
+              <w:t>Toàn bộ API với PostgreSQL thật: đăng nhập nhân viên, người nhà vào xem, ca, trạng thái, thông báo, SSE, quản trị</w:t>
             </w:r>
           </w:p>
         </w:tc>
@@ -18665,7 +18855,7 @@
                 <w:sz w:val="22"/>
                 <w:szCs w:val="22"/>
               </w:rPr>
-              <w:t>57 test</w:t>
+              <w:t>56 test</w:t>
             </w:r>
           </w:p>
         </w:tc>
@@ -18789,7 +18979,7 @@
                 <w:sz w:val="22"/>
                 <w:szCs w:val="22"/>
               </w:rPr>
-              <w:t>20 kịch bản</w:t>
+              <w:t>22 kịch bản</w:t>
             </w:r>
           </w:p>
         </w:tc>
@@ -19008,7 +19198,7 @@
                 <w:sz w:val="22"/>
                 <w:szCs w:val="22"/>
               </w:rPr>
-              <w:t>Triển khai, sao lưu/khôi phục, các nhánh lỗi của script</w:t>
+              <w:t>Triển khai, sao lưu/khôi phục, các nhánh lỗi của script, thông báo đẩy trên iPhone thật</w:t>
             </w:r>
           </w:p>
         </w:tc>
@@ -19037,7 +19227,7 @@
                 <w:sz w:val="22"/>
                 <w:szCs w:val="22"/>
               </w:rPr>
-              <w:t>4 kịch bản</w:t>
+              <w:t>5 kịch bản</w:t>
             </w:r>
           </w:p>
         </w:tc>
@@ -19054,7 +19244,7 @@
         <w:keepNext/>
         <w:spacing w:before="240" w:after="120"/>
       </w:pPr>
-      <w:bookmarkStart w:id="45" w:name="_Toc243078211"/>
+      <w:bookmarkStart w:id="45" w:name="_Toc244174662"/>
       <w:r>
         <w:t>6.2. Kết quả tổng hợp</w:t>
       </w:r>
@@ -19074,20 +19264,20 @@
           <w:b/>
           <w:bCs/>
         </w:rPr>
-        <w:t>48 test case</w:t>
-      </w:r>
-      <w:r>
-        <w:t xml:space="preserve"> được đặc tả trong file Excel kết quả kiểm thử: </w:t>
+        <w:t>54 test case</w:t>
+      </w:r>
+      <w:r>
+        <w:t xml:space="preserve"> được đặc tả trong file Excel kết quả kiểm thử, </w:t>
       </w:r>
       <w:r>
         <w:rPr>
           <w:b/>
           <w:bCs/>
         </w:rPr>
-        <w:t>47 đạt</w:t>
-      </w:r>
-      <w:r>
-        <w:t>, 1 chưa thực hiện (TC-31: thông báo đẩy FCM trên điện thoại thật, cần dự án Firebase). Mỗi test case đạt đều có ảnh minh chứng trong thư mục docs/kiem-thu/anh. Độ bao phủ mã của API khi chạy gộp unit và e2e (báo cáo chi tiết từng file: ảnh KQ-03-coverage.png):</w:t>
+        <w:t>cả 54 đều đạt</w:t>
+      </w:r>
+      <w:r>
+        <w:t>. TC-31 (thông báo đẩy FCM tới iPhone thật khi đang tắt màn hình) được kiểm thử thủ công ngày 29/10/2026 với dự án Firebase của nhóm. Mỗi test case đạt đều có ảnh minh chứng trong thư mục docs/kiem-thu/anh. Độ bao phủ mã của API khi chạy gộp unit và e2e (báo cáo chi tiết từng file: ảnh KQ-03-coverage.png):</w:t>
       </w:r>
     </w:p>
     <w:p>
@@ -19307,7 +19497,7 @@
                 <w:sz w:val="22"/>
                 <w:szCs w:val="22"/>
               </w:rPr>
-              <w:t>94,17% (937/995)</w:t>
+              <w:t>94,48% (925/979)</w:t>
             </w:r>
           </w:p>
         </w:tc>
@@ -19402,7 +19592,7 @@
                 <w:sz w:val="22"/>
                 <w:szCs w:val="22"/>
               </w:rPr>
-              <w:t>95,03% (823/866)</w:t>
+              <w:t>95,09% (814/856)</w:t>
             </w:r>
           </w:p>
         </w:tc>
@@ -19497,7 +19687,7 @@
                 <w:sz w:val="22"/>
                 <w:szCs w:val="22"/>
               </w:rPr>
-              <w:t>92,63% (176/190)</w:t>
+              <w:t>91,2% (166/182)</w:t>
             </w:r>
           </w:p>
         </w:tc>
@@ -19592,7 +19782,7 @@
                 <w:sz w:val="22"/>
                 <w:szCs w:val="22"/>
               </w:rPr>
-              <w:t>76,54% (509/665)</w:t>
+              <w:t>77,23% (519/672)</w:t>
             </w:r>
           </w:p>
         </w:tc>
@@ -19638,9 +19828,8 @@
         <w:keepNext/>
         <w:spacing w:before="240" w:after="120"/>
       </w:pPr>
-      <w:bookmarkStart w:id="46" w:name="_Toc243078212"/>
-      <w:r>
-        <w:lastRenderedPageBreak/>
+      <w:bookmarkStart w:id="46" w:name="_Toc244174663"/>
+      <w:r>
         <w:t>6.3. Kết quả các test case tiêu biểu</w:t>
       </w:r>
       <w:bookmarkEnd w:id="46"/>
@@ -20143,7 +20332,7 @@
                 <w:sz w:val="22"/>
                 <w:szCs w:val="22"/>
               </w:rPr>
-              <w:t>Người nhà nhập mã hợp lệ</w:t>
+              <w:t>Người nhà nhập đúng SĐT, họ tên, tên bệnh nhân</w:t>
             </w:r>
           </w:p>
         </w:tc>
@@ -20172,7 +20361,7 @@
                 <w:sz w:val="22"/>
                 <w:szCs w:val="22"/>
               </w:rPr>
-              <w:t>Liên kết, thấy bệnh nhân trong danh sách</w:t>
+              <w:t>Vào xem, thấy bệnh nhân trong danh sách</w:t>
             </w:r>
           </w:p>
         </w:tc>
@@ -20267,7 +20456,7 @@
                 <w:sz w:val="22"/>
                 <w:szCs w:val="22"/>
               </w:rPr>
-              <w:t>Mã hết hạn / đã thu hồi / đã dùng</w:t>
+              <w:t>Sai tên bệnh nhân / họ tên / SĐT chưa đăng ký</w:t>
             </w:r>
           </w:p>
         </w:tc>
@@ -20296,7 +20485,7 @@
                 <w:sz w:val="22"/>
                 <w:szCs w:val="22"/>
               </w:rPr>
-              <w:t>Báo lỗi, không tạo liên kết</w:t>
+              <w:t>Báo lỗi, không vào được</w:t>
             </w:r>
           </w:p>
         </w:tc>
@@ -20391,7 +20580,7 @@
                 <w:sz w:val="22"/>
                 <w:szCs w:val="22"/>
               </w:rPr>
-              <w:t>Nhập sai mã nhiều lần</w:t>
+              <w:t>Nhập sai nhiều lần</w:t>
             </w:r>
           </w:p>
         </w:tc>
@@ -20420,7 +20609,7 @@
                 <w:sz w:val="22"/>
                 <w:szCs w:val="22"/>
               </w:rPr>
-              <w:t>Tạm khóa nhập mã</w:t>
+              <w:t>Tạm khóa theo số điện thoại</w:t>
             </w:r>
           </w:p>
         </w:tc>
@@ -21090,12 +21279,11 @@
         <w:rPr>
           <w:noProof/>
         </w:rPr>
-        <w:lastRenderedPageBreak/>
         <w:drawing>
-          <wp:inline distT="0" distB="0" distL="0" distR="0" wp14:anchorId="6396FBAC" wp14:editId="3241EB7F">
-            <wp:extent cx="2343150" cy="5067300"/>
+          <wp:inline distT="0" distB="0" distL="0" distR="0" wp14:anchorId="7FBAD01C" wp14:editId="3CCEC512">
+            <wp:extent cx="2343150" cy="5372100"/>
             <wp:effectExtent l="0" t="0" r="0" b="0"/>
-            <wp:docPr id="1915611770" name="Picture 1915611770"/>
+            <wp:docPr id="2064551083" name="Picture 2064551083"/>
             <wp:cNvGraphicFramePr>
               <a:graphicFrameLocks xmlns:a="http://schemas.openxmlformats.org/drawingml/2006/main" noChangeAspect="1"/>
             </wp:cNvGraphicFramePr>
@@ -21109,7 +21297,7 @@
                     </pic:cNvPicPr>
                   </pic:nvPicPr>
                   <pic:blipFill>
-                    <a:blip r:embed="rId22"/>
+                    <a:blip r:embed="rId25"/>
                     <a:srcRect/>
                     <a:stretch>
                       <a:fillRect/>
@@ -21118,7 +21306,7 @@
                   <pic:spPr bwMode="auto">
                     <a:xfrm>
                       <a:off x="0" y="0"/>
-                      <a:ext cx="2343150" cy="5067300"/>
+                      <a:ext cx="2343150" cy="5372100"/>
                     </a:xfrm>
                     <a:prstGeom prst="rect">
                       <a:avLst/>
@@ -21154,7 +21342,7 @@
           <w:sz w:val="24"/>
           <w:szCs w:val="24"/>
         </w:rPr>
-        <w:t>TC-05: nhập sai mã nhiều lần bị tạm khóa</w:t>
+        <w:t>TC-05: nhập sai nhiều lần bị tạm khóa</w:t>
       </w:r>
     </w:p>
     <w:p>
@@ -21163,7 +21351,7 @@
         <w:keepNext/>
         <w:spacing w:before="240" w:after="120"/>
       </w:pPr>
-      <w:bookmarkStart w:id="47" w:name="_Toc243078213"/>
+      <w:bookmarkStart w:id="47" w:name="_Toc244174664"/>
       <w:r>
         <w:t>6.4. Kiểm thử hiệu năng</w:t>
       </w:r>
@@ -21176,7 +21364,7 @@
         <w:jc w:val="both"/>
       </w:pPr>
       <w:r>
-        <w:t>Kịch bản k6 tạo một ca, N tài khoản người nhà (mỗi người được cấp mã và liên kết riêng), cho N người cùng mở màn hình theo dõi và tải lại mỗi giây, trong khi nhân viên đổi lần lượt 4 trạng thái. Chỉ số “thông báo tới người nhà” là giới hạn trên vì người nhà trong kịch bản poll mỗi giây; ứng dụng thật nhận qua SSE nên nhanh hơn (đo trên trình duyệt: 113 ms).</w:t>
+        <w:t>Kịch bản k6 tạo một ca, N người nhà (mỗi người được nhân viên đăng ký rồi vào xem bằng SĐT + họ tên + tên bệnh nhân), cho N người cùng mở màn hình theo dõi và tải lại mỗi giây, trong khi nhân viên đổi lần lượt 4 trạng thái. Chỉ số “thông báo tới người nhà” là giới hạn trên vì người nhà trong kịch bản poll mỗi giây; ứng dụng thật nhận qua SSE nên nhanh hơn (đo trên trình duyệt: 113 ms).</w:t>
       </w:r>
     </w:p>
     <w:p>
@@ -21896,7 +22084,6 @@
                 <w:sz w:val="22"/>
                 <w:szCs w:val="22"/>
               </w:rPr>
-              <w:lastRenderedPageBreak/>
               <w:t>Người nhận đủ 4 thông báo</w:t>
             </w:r>
           </w:p>
@@ -22006,10 +22193,10 @@
           <w:noProof/>
         </w:rPr>
         <w:drawing>
-          <wp:inline distT="0" distB="0" distL="0" distR="0" wp14:anchorId="25F44433" wp14:editId="26E922EF">
+          <wp:inline distT="0" distB="0" distL="0" distR="0" wp14:anchorId="636B29F7" wp14:editId="2135CE30">
             <wp:extent cx="5038725" cy="1228725"/>
             <wp:effectExtent l="0" t="0" r="0" b="0"/>
-            <wp:docPr id="31658429" name="Picture 31658429"/>
+            <wp:docPr id="119864809" name="Picture 119864809"/>
             <wp:cNvGraphicFramePr>
               <a:graphicFrameLocks xmlns:a="http://schemas.openxmlformats.org/drawingml/2006/main" noChangeAspect="1"/>
             </wp:cNvGraphicFramePr>
@@ -22023,7 +22210,7 @@
                     </pic:cNvPicPr>
                   </pic:nvPicPr>
                   <pic:blipFill>
-                    <a:blip r:embed="rId23"/>
+                    <a:blip r:embed="rId26"/>
                     <a:srcRect/>
                     <a:stretch>
                       <a:fillRect/>
@@ -22087,7 +22274,7 @@
         <w:keepNext/>
         <w:spacing w:before="240" w:after="120"/>
       </w:pPr>
-      <w:bookmarkStart w:id="48" w:name="_Toc243078214"/>
+      <w:bookmarkStart w:id="48" w:name="_Toc244174665"/>
       <w:r>
         <w:t>6.5. Lỗi phát hiện và xử lý</w:t>
       </w:r>
@@ -22100,7 +22287,7 @@
         <w:jc w:val="both"/>
       </w:pPr>
       <w:r>
-        <w:t>Trong quá trình kiểm thử, nhóm ghi nhận 16 lỗi vào Bug log; tất cả đã được sửa và có test hồi quy.</w:t>
+        <w:t>Trong quá trình kiểm thử, nhóm ghi nhận 17 lỗi vào Bug log; tất cả đã được sửa và có test hồi quy.</w:t>
       </w:r>
     </w:p>
     <w:p>
@@ -22477,7 +22664,7 @@
                 <w:sz w:val="22"/>
                 <w:szCs w:val="22"/>
               </w:rPr>
-              <w:t>Liên kết được với ca đã hoàn tất</w:t>
+              <w:t>Liên kết được với ca đã hoàn tất (nay: không đăng ký người nhà cho ca đã kết thúc)</w:t>
             </w:r>
           </w:p>
         </w:tc>
@@ -22973,7 +23160,7 @@
                 <w:sz w:val="22"/>
                 <w:szCs w:val="22"/>
               </w:rPr>
-              <w:t>Hết phiên khi mở link QR làm mất mã</w:t>
+              <w:t>Hết phiên khi mở link QR làm mất mã (luồng mã/QR đã được thay ngày 17/10)</w:t>
             </w:r>
           </w:p>
         </w:tc>
@@ -23812,7 +23999,6 @@
                 <w:sz w:val="22"/>
                 <w:szCs w:val="22"/>
               </w:rPr>
-              <w:lastRenderedPageBreak/>
               <w:t>BUG-13</w:t>
             </w:r>
           </w:p>
@@ -24277,6 +24463,130 @@
           </w:p>
         </w:tc>
       </w:tr>
+      <w:tr>
+        <w:tblPrEx>
+          <w:tblCellMar>
+            <w:top w:w="0" w:type="dxa"/>
+            <w:bottom w:w="0" w:type="dxa"/>
+          </w:tblCellMar>
+        </w:tblPrEx>
+        <w:tc>
+          <w:tcPr>
+            <w:tcW w:w="1026" w:type="dxa"/>
+            <w:tcBorders>
+              <w:top w:val="single" w:sz="4" w:space="0" w:color="8A94A6"/>
+              <w:left w:val="single" w:sz="4" w:space="0" w:color="8A94A6"/>
+              <w:bottom w:val="single" w:sz="4" w:space="0" w:color="8A94A6"/>
+              <w:right w:val="single" w:sz="4" w:space="0" w:color="8A94A6"/>
+            </w:tcBorders>
+            <w:tcMar>
+              <w:top w:w="40" w:type="dxa"/>
+              <w:left w:w="80" w:type="dxa"/>
+              <w:bottom w:w="40" w:type="dxa"/>
+              <w:right w:w="80" w:type="dxa"/>
+            </w:tcMar>
+          </w:tcPr>
+          <w:p>
+            <w:pPr>
+              <w:spacing w:line="276" w:lineRule="auto"/>
+            </w:pPr>
+            <w:r>
+              <w:rPr>
+                <w:sz w:val="22"/>
+                <w:szCs w:val="22"/>
+              </w:rPr>
+              <w:t>BUG-17</w:t>
+            </w:r>
+          </w:p>
+        </w:tc>
+        <w:tc>
+          <w:tcPr>
+            <w:tcW w:w="4449" w:type="dxa"/>
+            <w:tcBorders>
+              <w:top w:val="single" w:sz="4" w:space="0" w:color="8A94A6"/>
+              <w:left w:val="single" w:sz="4" w:space="0" w:color="8A94A6"/>
+              <w:bottom w:val="single" w:sz="4" w:space="0" w:color="8A94A6"/>
+              <w:right w:val="single" w:sz="4" w:space="0" w:color="8A94A6"/>
+            </w:tcBorders>
+            <w:tcMar>
+              <w:top w:w="40" w:type="dxa"/>
+              <w:left w:w="80" w:type="dxa"/>
+              <w:bottom w:w="40" w:type="dxa"/>
+              <w:right w:w="80" w:type="dxa"/>
+            </w:tcMar>
+          </w:tcPr>
+          <w:p>
+            <w:pPr>
+              <w:spacing w:line="276" w:lineRule="auto"/>
+            </w:pPr>
+            <w:r>
+              <w:rPr>
+                <w:sz w:val="22"/>
+                <w:szCs w:val="22"/>
+              </w:rPr>
+              <w:t>Người nhà thoát app rồi mở lại từ màn hình chính bị bắt nhập lại thông tin</w:t>
+            </w:r>
+          </w:p>
+        </w:tc>
+        <w:tc>
+          <w:tcPr>
+            <w:tcW w:w="1369" w:type="dxa"/>
+            <w:tcBorders>
+              <w:top w:val="single" w:sz="4" w:space="0" w:color="8A94A6"/>
+              <w:left w:val="single" w:sz="4" w:space="0" w:color="8A94A6"/>
+              <w:bottom w:val="single" w:sz="4" w:space="0" w:color="8A94A6"/>
+              <w:right w:val="single" w:sz="4" w:space="0" w:color="8A94A6"/>
+            </w:tcBorders>
+            <w:tcMar>
+              <w:top w:w="40" w:type="dxa"/>
+              <w:left w:w="80" w:type="dxa"/>
+              <w:bottom w:w="40" w:type="dxa"/>
+              <w:right w:w="80" w:type="dxa"/>
+            </w:tcMar>
+          </w:tcPr>
+          <w:p>
+            <w:pPr>
+              <w:spacing w:line="276" w:lineRule="auto"/>
+            </w:pPr>
+            <w:r>
+              <w:rPr>
+                <w:sz w:val="22"/>
+                <w:szCs w:val="22"/>
+              </w:rPr>
+              <w:t>Cao</w:t>
+            </w:r>
+          </w:p>
+        </w:tc>
+        <w:tc>
+          <w:tcPr>
+            <w:tcW w:w="2227" w:type="dxa"/>
+            <w:tcBorders>
+              <w:top w:val="single" w:sz="4" w:space="0" w:color="8A94A6"/>
+              <w:left w:val="single" w:sz="4" w:space="0" w:color="8A94A6"/>
+              <w:bottom w:val="single" w:sz="4" w:space="0" w:color="8A94A6"/>
+              <w:right w:val="single" w:sz="4" w:space="0" w:color="8A94A6"/>
+            </w:tcBorders>
+            <w:tcMar>
+              <w:top w:w="40" w:type="dxa"/>
+              <w:left w:w="80" w:type="dxa"/>
+              <w:bottom w:w="40" w:type="dxa"/>
+              <w:right w:w="80" w:type="dxa"/>
+            </w:tcMar>
+          </w:tcPr>
+          <w:p>
+            <w:pPr>
+              <w:spacing w:line="276" w:lineRule="auto"/>
+            </w:pPr>
+            <w:r>
+              <w:rPr>
+                <w:sz w:val="22"/>
+                <w:szCs w:val="22"/>
+              </w:rPr>
+              <w:t>Thử trên iPhone thật</w:t>
+            </w:r>
+          </w:p>
+        </w:tc>
+      </w:tr>
     </w:tbl>
     <w:p>
       <w:pPr>
@@ -24309,7 +24619,7 @@
         <w:keepNext/>
         <w:spacing w:before="240" w:after="120"/>
       </w:pPr>
-      <w:bookmarkStart w:id="49" w:name="_Toc243078215"/>
+      <w:bookmarkStart w:id="49" w:name="_Toc244174666"/>
       <w:r>
         <w:t>6.6. Hạn chế đã biết</w:t>
       </w:r>
@@ -24326,7 +24636,7 @@
         <w:jc w:val="both"/>
       </w:pPr>
       <w:r>
-        <w:t>Chưa thử thông báo đẩy FCM trên điện thoại thật vì chưa có dự án Firebase; thông báo trong ứng dụng (SSE) đã hoạt động.</w:t>
+        <w:t>iPhone không cho trang web rung máy; khi ứng dụng đang đóng, hệ điều hành chỉ phát âm thông báo mặc định một lần, chuông lặp chỉ có khi ứng dụng đang mở. Android rung dài và giữ thông báo tới khi người dùng tắt.</w:t>
       </w:r>
     </w:p>
     <w:p>
@@ -24373,14 +24683,27 @@
     </w:p>
     <w:p>
       <w:pPr>
+        <w:pStyle w:val="ListParagraph"/>
+        <w:numPr>
+          <w:ilvl w:val="0"/>
+          <w:numId w:val="2"/>
+        </w:numPr>
+        <w:spacing w:after="60" w:line="320" w:lineRule="auto"/>
+        <w:jc w:val="both"/>
+      </w:pPr>
+      <w:r>
+        <w:t>Người nhà vào xem không cần mật khẩu (theo yêu cầu): ai biết đúng số điện thoại, họ tên người nhà và họ tên bệnh nhân đã được đăng ký thì xem được. Rủi ro được giảm bằng việc chỉ người được nhân viên đăng ký mới vào được, khóa sau 5 lần sai, phiên hết khi ca kết thúc và nhật ký truy cập.</w:t>
+      </w:r>
+    </w:p>
+    <w:p>
+      <w:pPr>
         <w:pStyle w:val="Heading1"/>
         <w:pageBreakBefore/>
         <w:spacing w:after="240"/>
         <w:jc w:val="center"/>
       </w:pPr>
-      <w:bookmarkStart w:id="50" w:name="_Toc243078216"/>
-      <w:r>
-        <w:lastRenderedPageBreak/>
+      <w:bookmarkStart w:id="50" w:name="_Toc244174667"/>
+      <w:r>
         <w:t>CHƯƠNG 7. TRIỂN KHAI</w:t>
       </w:r>
       <w:bookmarkEnd w:id="50"/>
@@ -24391,7 +24714,7 @@
         <w:keepNext/>
         <w:spacing w:before="240" w:after="120"/>
       </w:pPr>
-      <w:bookmarkStart w:id="51" w:name="_Toc243078217"/>
+      <w:bookmarkStart w:id="51" w:name="_Toc244174668"/>
       <w:r>
         <w:t>7.1. Đóng gói bằng Docker</w:t>
       </w:r>
@@ -24877,10 +25200,10 @@
           <w:noProof/>
         </w:rPr>
         <w:drawing>
-          <wp:inline distT="0" distB="0" distL="0" distR="0" wp14:anchorId="58EDEC76" wp14:editId="3A954934">
+          <wp:inline distT="0" distB="0" distL="0" distR="0" wp14:anchorId="2833B8AB" wp14:editId="6340388F">
             <wp:extent cx="5038725" cy="1295400"/>
             <wp:effectExtent l="0" t="0" r="0" b="0"/>
-            <wp:docPr id="309494" name="Picture 309494"/>
+            <wp:docPr id="1759471764" name="Picture 1759471764"/>
             <wp:cNvGraphicFramePr>
               <a:graphicFrameLocks xmlns:a="http://schemas.openxmlformats.org/drawingml/2006/main" noChangeAspect="1"/>
             </wp:cNvGraphicFramePr>
@@ -24894,7 +25217,7 @@
                     </pic:cNvPicPr>
                   </pic:nvPicPr>
                   <pic:blipFill>
-                    <a:blip r:embed="rId24"/>
+                    <a:blip r:embed="rId27"/>
                     <a:srcRect/>
                     <a:stretch>
                       <a:fillRect/>
@@ -24948,7 +25271,7 @@
         <w:keepNext/>
         <w:spacing w:before="240" w:after="120"/>
       </w:pPr>
-      <w:bookmarkStart w:id="52" w:name="_Toc243078218"/>
+      <w:bookmarkStart w:id="52" w:name="_Toc244174669"/>
       <w:r>
         <w:t>7.2. Hướng dẫn chạy</w:t>
       </w:r>
@@ -25017,11 +25340,7 @@
         <w:jc w:val="both"/>
       </w:pPr>
       <w:r>
-        <w:t xml:space="preserve">Tài khoản demo: admin@example.com (quản trị viên), staff@example.com (nhân viên y tế), family@example.com (người nhà, đang theo dõi 2 ca có lịch sử và thông </w:t>
-      </w:r>
-      <w:r>
-        <w:lastRenderedPageBreak/>
-        <w:t>báo). Mật khẩu là giá trị SEED_PASSWORD trong file cấu hình, không ghi trong mã nguồn.</w:t>
+        <w:t>Tài khoản có sẵn: admin@benhvien.test (quản trị viên) và nhanvien1@benhvien.test, nhanvien2@benhvien.test, nhanvien3@benhvien.test (nhân viên y tế); mật khẩu là giá trị SEED_PASSWORD trong file cấu hình, không ghi trong mã nguồn. Người nhà không có tài khoản; dữ liệu demo có sẵn người nhà số 0901234567 – Nguyễn Thị Mai, vào xem bằng họ tên bệnh nhân Nguyễn Văn An hoặc Trần Thị Bích.</w:t>
       </w:r>
     </w:p>
     <w:p>
@@ -25030,7 +25349,7 @@
         <w:keepNext/>
         <w:spacing w:before="240" w:after="120"/>
       </w:pPr>
-      <w:bookmarkStart w:id="53" w:name="_Toc243078219"/>
+      <w:bookmarkStart w:id="53" w:name="_Toc244174670"/>
       <w:r>
         <w:t>7.3. Sao lưu và khôi phục</w:t>
       </w:r>
@@ -25057,10 +25376,10 @@
           <w:noProof/>
         </w:rPr>
         <w:drawing>
-          <wp:inline distT="0" distB="0" distL="0" distR="0" wp14:anchorId="0C261DAB" wp14:editId="2D4CF16E">
+          <wp:inline distT="0" distB="0" distL="0" distR="0" wp14:anchorId="31C6A7E2" wp14:editId="2D234C17">
             <wp:extent cx="5038725" cy="2447925"/>
             <wp:effectExtent l="0" t="0" r="0" b="0"/>
-            <wp:docPr id="1376887099" name="Picture 1376887099"/>
+            <wp:docPr id="659154627" name="Picture 659154627"/>
             <wp:cNvGraphicFramePr>
               <a:graphicFrameLocks xmlns:a="http://schemas.openxmlformats.org/drawingml/2006/main" noChangeAspect="1"/>
             </wp:cNvGraphicFramePr>
@@ -25074,7 +25393,7 @@
                     </pic:cNvPicPr>
                   </pic:nvPicPr>
                   <pic:blipFill>
-                    <a:blip r:embed="rId25"/>
+                    <a:blip r:embed="rId28"/>
                     <a:srcRect/>
                     <a:stretch>
                       <a:fillRect/>
@@ -25128,7 +25447,7 @@
         <w:keepNext/>
         <w:spacing w:before="240" w:after="120"/>
       </w:pPr>
-      <w:bookmarkStart w:id="54" w:name="_Toc243078220"/>
+      <w:bookmarkStart w:id="54" w:name="_Toc244174671"/>
       <w:r>
         <w:t>7.4. Phương án dự phòng khi báo cáo</w:t>
       </w:r>
@@ -25159,7 +25478,7 @@
         <w:jc w:val="both"/>
       </w:pPr>
       <w:r>
-        <w:t>Bộ 36 ảnh minh chứng và video demo dự phòng (nhóm quay từ luồng trình diễn của Playwright).</w:t>
+        <w:t>Bộ ảnh minh chứng và video demo dự phòng (nhóm quay từ luồng trình diễn của Playwright).</w:t>
       </w:r>
     </w:p>
     <w:p>
@@ -25183,9 +25502,8 @@
         <w:spacing w:after="240"/>
         <w:jc w:val="center"/>
       </w:pPr>
-      <w:bookmarkStart w:id="55" w:name="_Toc243078221"/>
-      <w:r>
-        <w:lastRenderedPageBreak/>
+      <w:bookmarkStart w:id="55" w:name="_Toc244174672"/>
+      <w:r>
         <w:t>CHƯƠNG 8. KẾT LUẬN VÀ HƯỚNG PHÁT TRIỂN</w:t>
       </w:r>
       <w:bookmarkEnd w:id="55"/>
@@ -25196,7 +25514,7 @@
         <w:keepNext/>
         <w:spacing w:before="240" w:after="120"/>
       </w:pPr>
-      <w:bookmarkStart w:id="56" w:name="_Toc243078222"/>
+      <w:bookmarkStart w:id="56" w:name="_Toc244174673"/>
       <w:r>
         <w:t>8.1. Kết quả đạt được</w:t>
       </w:r>
@@ -25227,7 +25545,7 @@
         <w:jc w:val="both"/>
       </w:pPr>
       <w:r>
-        <w:t>Chạy trọn vẹn buổi trình diễn theo tiêu chí MVP: tạo ca, cấp mã, liên kết, đổi đủ 5 trạng thái, người nhà nhận cập nhật ở mỗi bước.</w:t>
+        <w:t>Chạy trọn vẹn buổi trình diễn theo tiêu chí MVP: tạo ca, đăng ký người nhà, người nhà vào xem, đổi đủ 5 trạng thái, người nhà nhận cập nhật ở mỗi bước.</w:t>
       </w:r>
     </w:p>
     <w:p>
@@ -25255,7 +25573,7 @@
         <w:jc w:val="both"/>
       </w:pPr>
       <w:r>
-        <w:t>110 test tự động (coverage 94% statements) và 20 kịch bản giao diện; 47/48 test case đạt, 16 lỗi phát hiện đều đã sửa.</w:t>
+        <w:t>111 test tự động (coverage 94% statements) và 22 kịch bản giao diện; 54/54 test case đạt, 17 lỗi phát hiện đều đã sửa.</w:t>
       </w:r>
     </w:p>
     <w:p>
@@ -25278,7 +25596,7 @@
         <w:keepNext/>
         <w:spacing w:before="240" w:after="120"/>
       </w:pPr>
-      <w:bookmarkStart w:id="57" w:name="_Toc243078223"/>
+      <w:bookmarkStart w:id="57" w:name="_Toc244174674"/>
       <w:r>
         <w:t>8.2. Hạn chế</w:t>
       </w:r>
@@ -25295,7 +25613,7 @@
         <w:jc w:val="both"/>
       </w:pPr>
       <w:r>
-        <w:t>Chưa kiểm thử thông báo đẩy trên điện thoại thật (cần dự án Firebase).</w:t>
+        <w:t>Trên iPhone, chuông báo kết thúc chỉ reo lặp khi ứng dụng đang mở; khi ứng dụng đóng chỉ có âm thông báo mặc định của máy.</w:t>
       </w:r>
     </w:p>
     <w:p>
@@ -25332,7 +25650,7 @@
         <w:keepNext/>
         <w:spacing w:before="240" w:after="120"/>
       </w:pPr>
-      <w:bookmarkStart w:id="58" w:name="_Toc243078224"/>
+      <w:bookmarkStart w:id="58" w:name="_Toc244174675"/>
       <w:r>
         <w:t>8.3. Hướng phát triển</w:t>
       </w:r>
@@ -25429,9 +25747,8 @@
         <w:spacing w:after="240"/>
         <w:jc w:val="center"/>
       </w:pPr>
-      <w:bookmarkStart w:id="59" w:name="_Toc243078225"/>
-      <w:r>
-        <w:lastRenderedPageBreak/>
+      <w:bookmarkStart w:id="59" w:name="_Toc244174676"/>
+      <w:r>
         <w:t>TÀI LIỆU THAM KHẢO</w:t>
       </w:r>
       <w:bookmarkEnd w:id="59"/>
@@ -25531,9 +25848,8 @@
         <w:spacing w:after="240"/>
         <w:jc w:val="center"/>
       </w:pPr>
-      <w:bookmarkStart w:id="60" w:name="_Toc243078226"/>
-      <w:r>
-        <w:lastRenderedPageBreak/>
+      <w:bookmarkStart w:id="60" w:name="_Toc244174677"/>
+      <w:r>
         <w:t>PHỤ LỤC</w:t>
       </w:r>
       <w:bookmarkEnd w:id="60"/>
@@ -25633,7 +25949,7 @@
       </w:r>
     </w:p>
     <w:sectPr>
-      <w:footerReference w:type="default" r:id="rId26"/>
+      <w:footerReference w:type="default" r:id="rId29"/>
       <w:pgSz w:w="11906" w:h="16838"/>
       <w:pgMar w:top="1417" w:right="1134" w:bottom="1417" w:left="1701" w:header="708" w:footer="708" w:gutter="0"/>
       <w:cols w:space="720"/>
@@ -25730,96 +26046,10 @@
 <file path=word/numbering.xml><?xml version="1.0" encoding="utf-8"?>
 <w:numbering xmlns:wpc="http://schemas.microsoft.com/office/word/2010/wordprocessingCanvas" xmlns:cx="http://schemas.microsoft.com/office/drawing/2014/chartex" xmlns:cx1="http://schemas.microsoft.com/office/drawing/2015/9/8/chartex" xmlns:cx2="http://schemas.microsoft.com/office/drawing/2015/10/21/chartex" xmlns:cx3="http://schemas.microsoft.com/office/drawing/2016/5/9/chartex" xmlns:cx4="http://schemas.microsoft.com/office/drawing/2016/5/10/chartex" xmlns:cx5="http://schemas.microsoft.com/office/drawing/2016/5/11/chartex" xmlns:cx6="http://schemas.microsoft.com/office/drawing/2016/5/12/chartex" xmlns:cx7="http://schemas.microsoft.com/office/drawing/2016/5/13/chartex" xmlns:cx8="http://schemas.microsoft.com/office/drawing/2016/5/14/chartex" xmlns:mc="http://schemas.openxmlformats.org/markup-compatibility/2006" xmlns:aink="http://schemas.microsoft.com/office/drawing/2016/ink" xmlns:am3d="http://schemas.microsoft.com/office/drawing/2017/model3d" xmlns:o="urn:schemas-microsoft-com:office:office" xmlns:oel="http://schemas.microsoft.com/office/2019/extlst" xmlns:r="http://schemas.openxmlformats.org/officeDocument/2006/relationships" xmlns:m="http://schemas.openxmlformats.org/officeDocument/2006/math" xmlns:v="urn:schemas-microsoft-com:vml" xmlns:wp14="http://schemas.microsoft.com/office/word/2010/wordprocessingDrawing" xmlns:wp="http://schemas.openxmlformats.org/drawingml/2006/wordprocessingDrawing" xmlns:w10="urn:schemas-microsoft-com:office:word" xmlns:w="http://schemas.openxmlformats.org/wordprocessingml/2006/main" xmlns:w14="http://schemas.microsoft.com/office/word/2010/wordml" xmlns:w15="http://schemas.microsoft.com/office/word/2012/wordml" xmlns:w16cex="http://schemas.microsoft.com/office/word/2018/wordml/cex" xmlns:w16cid="http://schemas.microsoft.com/office/word/2016/wordml/cid" xmlns:w16="http://schemas.microsoft.com/office/word/2018/wordml" xmlns:w16du="http://schemas.microsoft.com/office/word/2023/wordml/word16du" xmlns:w16sdtdh="http://schemas.microsoft.com/office/word/2020/wordml/sdtdatahash" xmlns:w16sdtfl="http://schemas.microsoft.com/office/word/2024/wordml/sdtformatlock" xmlns:w16se="http://schemas.microsoft.com/office/word/2015/wordml/symex" xmlns:wpg="http://schemas.microsoft.com/office/word/2010/wordprocessingGroup" xmlns:wpi="http://schemas.microsoft.com/office/word/2010/wordprocessingInk" xmlns:wne="http://schemas.microsoft.com/office/word/2006/wordml" xmlns:wps="http://schemas.microsoft.com/office/word/2010/wordprocessingShape" mc:Ignorable="w14 w15 w16se w16cid w16 w16cex w16sdtdh w16sdtfl w16du wp14">
   <w:abstractNum w:abstractNumId="0" w15:restartNumberingAfterBreak="0">
-    <w:nsid w:val="22927D1A"/>
+    <w:nsid w:val="30DF28EA"/>
     <w:multiLevelType w:val="hybridMultilevel"/>
-    <w:tmpl w:val="1F8C8A22"/>
-    <w:lvl w:ilvl="0" w:tplc="B39CFBEC">
-      <w:start w:val="1"/>
-      <w:numFmt w:val="bullet"/>
-      <w:lvlText w:val="●"/>
-      <w:lvlJc w:val="left"/>
-      <w:pPr>
-        <w:ind w:left="720" w:hanging="360"/>
-      </w:pPr>
-    </w:lvl>
-    <w:lvl w:ilvl="1" w:tplc="598479B0">
-      <w:start w:val="1"/>
-      <w:numFmt w:val="bullet"/>
-      <w:lvlText w:val="○"/>
-      <w:lvlJc w:val="left"/>
-      <w:pPr>
-        <w:ind w:left="1440" w:hanging="360"/>
-      </w:pPr>
-    </w:lvl>
-    <w:lvl w:ilvl="2" w:tplc="F260E234">
-      <w:start w:val="1"/>
-      <w:numFmt w:val="bullet"/>
-      <w:lvlText w:val="■"/>
-      <w:lvlJc w:val="left"/>
-      <w:pPr>
-        <w:ind w:left="2160" w:hanging="360"/>
-      </w:pPr>
-    </w:lvl>
-    <w:lvl w:ilvl="3" w:tplc="82FC7626">
-      <w:start w:val="1"/>
-      <w:numFmt w:val="bullet"/>
-      <w:lvlText w:val="●"/>
-      <w:lvlJc w:val="left"/>
-      <w:pPr>
-        <w:ind w:left="2880" w:hanging="360"/>
-      </w:pPr>
-    </w:lvl>
-    <w:lvl w:ilvl="4" w:tplc="F7449B08">
-      <w:start w:val="1"/>
-      <w:numFmt w:val="bullet"/>
-      <w:lvlText w:val="○"/>
-      <w:lvlJc w:val="left"/>
-      <w:pPr>
-        <w:ind w:left="3600" w:hanging="360"/>
-      </w:pPr>
-    </w:lvl>
-    <w:lvl w:ilvl="5" w:tplc="25209094">
-      <w:start w:val="1"/>
-      <w:numFmt w:val="bullet"/>
-      <w:lvlText w:val="■"/>
-      <w:lvlJc w:val="left"/>
-      <w:pPr>
-        <w:ind w:left="4320" w:hanging="360"/>
-      </w:pPr>
-    </w:lvl>
-    <w:lvl w:ilvl="6" w:tplc="FDDEDA46">
-      <w:start w:val="1"/>
-      <w:numFmt w:val="bullet"/>
-      <w:lvlText w:val="●"/>
-      <w:lvlJc w:val="left"/>
-      <w:pPr>
-        <w:ind w:left="5040" w:hanging="360"/>
-      </w:pPr>
-    </w:lvl>
-    <w:lvl w:ilvl="7" w:tplc="3788E474">
-      <w:start w:val="1"/>
-      <w:numFmt w:val="bullet"/>
-      <w:lvlText w:val="●"/>
-      <w:lvlJc w:val="left"/>
-      <w:pPr>
-        <w:ind w:left="5760" w:hanging="360"/>
-      </w:pPr>
-    </w:lvl>
-    <w:lvl w:ilvl="8" w:tplc="CA0CDA6C">
-      <w:start w:val="1"/>
-      <w:numFmt w:val="bullet"/>
-      <w:lvlText w:val="●"/>
-      <w:lvlJc w:val="left"/>
-      <w:pPr>
-        <w:ind w:left="6480" w:hanging="360"/>
-      </w:pPr>
-    </w:lvl>
-  </w:abstractNum>
-  <w:abstractNum w:abstractNumId="1" w15:restartNumberingAfterBreak="0">
-    <w:nsid w:val="5C045D40"/>
-    <w:multiLevelType w:val="hybridMultilevel"/>
-    <w:tmpl w:val="5DD2CAD4"/>
-    <w:lvl w:ilvl="0" w:tplc="BDD40868">
+    <w:tmpl w:val="953C9566"/>
+    <w:lvl w:ilvl="0" w:tplc="0CA0A77E">
       <w:start w:val="1"/>
       <w:numFmt w:val="bullet"/>
       <w:lvlText w:val="–"/>
@@ -25828,55 +26058,141 @@
         <w:ind w:left="720" w:hanging="360"/>
       </w:pPr>
     </w:lvl>
-    <w:lvl w:ilvl="1" w:tplc="D1789914">
+    <w:lvl w:ilvl="1" w:tplc="085853EE">
       <w:numFmt w:val="decimal"/>
       <w:lvlText w:val=""/>
       <w:lvlJc w:val="left"/>
     </w:lvl>
-    <w:lvl w:ilvl="2" w:tplc="350A1CD4">
+    <w:lvl w:ilvl="2" w:tplc="6BB81088">
       <w:numFmt w:val="decimal"/>
       <w:lvlText w:val=""/>
       <w:lvlJc w:val="left"/>
     </w:lvl>
-    <w:lvl w:ilvl="3" w:tplc="58460F8E">
+    <w:lvl w:ilvl="3" w:tplc="711CAE9E">
       <w:numFmt w:val="decimal"/>
       <w:lvlText w:val=""/>
       <w:lvlJc w:val="left"/>
     </w:lvl>
-    <w:lvl w:ilvl="4" w:tplc="2C287260">
+    <w:lvl w:ilvl="4" w:tplc="625859B6">
       <w:numFmt w:val="decimal"/>
       <w:lvlText w:val=""/>
       <w:lvlJc w:val="left"/>
     </w:lvl>
-    <w:lvl w:ilvl="5" w:tplc="4E5A4F1E">
+    <w:lvl w:ilvl="5" w:tplc="2114586C">
       <w:numFmt w:val="decimal"/>
       <w:lvlText w:val=""/>
       <w:lvlJc w:val="left"/>
     </w:lvl>
-    <w:lvl w:ilvl="6" w:tplc="8E98E4B2">
+    <w:lvl w:ilvl="6" w:tplc="AAA28F90">
       <w:numFmt w:val="decimal"/>
       <w:lvlText w:val=""/>
       <w:lvlJc w:val="left"/>
     </w:lvl>
-    <w:lvl w:ilvl="7" w:tplc="02BE9DC8">
+    <w:lvl w:ilvl="7" w:tplc="04849416">
       <w:numFmt w:val="decimal"/>
       <w:lvlText w:val=""/>
       <w:lvlJc w:val="left"/>
     </w:lvl>
-    <w:lvl w:ilvl="8" w:tplc="AABC8980">
+    <w:lvl w:ilvl="8" w:tplc="B47817AC">
       <w:numFmt w:val="decimal"/>
       <w:lvlText w:val=""/>
       <w:lvlJc w:val="left"/>
     </w:lvl>
   </w:abstractNum>
-  <w:num w:numId="1" w16cid:durableId="1307860587">
-    <w:abstractNumId w:val="0"/>
+  <w:abstractNum w:abstractNumId="1" w15:restartNumberingAfterBreak="0">
+    <w:nsid w:val="30FA2B51"/>
+    <w:multiLevelType w:val="hybridMultilevel"/>
+    <w:tmpl w:val="4A8070C4"/>
+    <w:lvl w:ilvl="0" w:tplc="9ADEDF26">
+      <w:start w:val="1"/>
+      <w:numFmt w:val="bullet"/>
+      <w:lvlText w:val="●"/>
+      <w:lvlJc w:val="left"/>
+      <w:pPr>
+        <w:ind w:left="720" w:hanging="360"/>
+      </w:pPr>
+    </w:lvl>
+    <w:lvl w:ilvl="1" w:tplc="62DC0E38">
+      <w:start w:val="1"/>
+      <w:numFmt w:val="bullet"/>
+      <w:lvlText w:val="○"/>
+      <w:lvlJc w:val="left"/>
+      <w:pPr>
+        <w:ind w:left="1440" w:hanging="360"/>
+      </w:pPr>
+    </w:lvl>
+    <w:lvl w:ilvl="2" w:tplc="D502419A">
+      <w:start w:val="1"/>
+      <w:numFmt w:val="bullet"/>
+      <w:lvlText w:val="■"/>
+      <w:lvlJc w:val="left"/>
+      <w:pPr>
+        <w:ind w:left="2160" w:hanging="360"/>
+      </w:pPr>
+    </w:lvl>
+    <w:lvl w:ilvl="3" w:tplc="317A9D40">
+      <w:start w:val="1"/>
+      <w:numFmt w:val="bullet"/>
+      <w:lvlText w:val="●"/>
+      <w:lvlJc w:val="left"/>
+      <w:pPr>
+        <w:ind w:left="2880" w:hanging="360"/>
+      </w:pPr>
+    </w:lvl>
+    <w:lvl w:ilvl="4" w:tplc="29F29172">
+      <w:start w:val="1"/>
+      <w:numFmt w:val="bullet"/>
+      <w:lvlText w:val="○"/>
+      <w:lvlJc w:val="left"/>
+      <w:pPr>
+        <w:ind w:left="3600" w:hanging="360"/>
+      </w:pPr>
+    </w:lvl>
+    <w:lvl w:ilvl="5" w:tplc="41AA6CE4">
+      <w:start w:val="1"/>
+      <w:numFmt w:val="bullet"/>
+      <w:lvlText w:val="■"/>
+      <w:lvlJc w:val="left"/>
+      <w:pPr>
+        <w:ind w:left="4320" w:hanging="360"/>
+      </w:pPr>
+    </w:lvl>
+    <w:lvl w:ilvl="6" w:tplc="D83C07CC">
+      <w:start w:val="1"/>
+      <w:numFmt w:val="bullet"/>
+      <w:lvlText w:val="●"/>
+      <w:lvlJc w:val="left"/>
+      <w:pPr>
+        <w:ind w:left="5040" w:hanging="360"/>
+      </w:pPr>
+    </w:lvl>
+    <w:lvl w:ilvl="7" w:tplc="84506A56">
+      <w:start w:val="1"/>
+      <w:numFmt w:val="bullet"/>
+      <w:lvlText w:val="●"/>
+      <w:lvlJc w:val="left"/>
+      <w:pPr>
+        <w:ind w:left="5760" w:hanging="360"/>
+      </w:pPr>
+    </w:lvl>
+    <w:lvl w:ilvl="8" w:tplc="E5D821F2">
+      <w:start w:val="1"/>
+      <w:numFmt w:val="bullet"/>
+      <w:lvlText w:val="●"/>
+      <w:lvlJc w:val="left"/>
+      <w:pPr>
+        <w:ind w:left="6480" w:hanging="360"/>
+      </w:pPr>
+    </w:lvl>
+  </w:abstractNum>
+  <w:num w:numId="1" w16cid:durableId="1132093022">
+    <w:abstractNumId w:val="1"/>
     <w:lvlOverride w:ilvl="0">
       <w:startOverride w:val="1"/>
     </w:lvlOverride>
   </w:num>
-  <w:num w:numId="2" w16cid:durableId="1003163341">
-    <w:abstractNumId w:val="1"/>
+  <w:num w:numId="2" w16cid:durableId="1390305565">
+    <w:abstractNumId w:val="0"/>
     <w:lvlOverride w:ilvl="0">
       <w:startOverride w:val="1"/>
     </w:lvlOverride>
@@ -26459,7 +26775,7 @@
     <w:autoRedefine/>
     <w:uiPriority w:val="39"/>
     <w:unhideWhenUsed/>
-    <w:rsid w:val="0009291E"/>
+    <w:rsid w:val="00BE390D"/>
     <w:pPr>
       <w:spacing w:after="100"/>
     </w:pPr>
@@ -26471,7 +26787,7 @@
     <w:autoRedefine/>
     <w:uiPriority w:val="39"/>
     <w:unhideWhenUsed/>
-    <w:rsid w:val="0009291E"/>
+    <w:rsid w:val="00BE390D"/>
     <w:pPr>
       <w:spacing w:after="100"/>
       <w:ind w:left="260"/>
@@ -26484,7 +26800,7 @@
     <w:autoRedefine/>
     <w:uiPriority w:val="39"/>
     <w:unhideWhenUsed/>
-    <w:rsid w:val="0009291E"/>
+    <w:rsid w:val="00BE390D"/>
     <w:pPr>
       <w:spacing w:after="100"/>
       <w:ind w:left="520"/>

</xml_diff>

<commit_message>
docs: thêm BUG-18, TC-55 và cập nhật số liệu kiểm thử (55/55 TC đạt)
</commit_message>
<xml_diff>
--- a/docs/bao-cao/Bao-cao-CDTN2.docx
+++ b/docs/bao-cao/Bao-cao-CDTN2.docx
@@ -185,7 +185,7 @@
         <w:spacing w:after="240"/>
         <w:jc w:val="center"/>
       </w:pPr>
-      <w:bookmarkStart w:id="0" w:name="_Toc244174617"/>
+      <w:bookmarkStart w:id="0" w:name="_Toc244324958"/>
       <w:r>
         <w:t>LỜI CẢM ƠN</w:t>
       </w:r>
@@ -231,7 +231,7 @@
         <w:spacing w:after="240"/>
         <w:jc w:val="center"/>
       </w:pPr>
-      <w:bookmarkStart w:id="1" w:name="_Toc244174618"/>
+      <w:bookmarkStart w:id="1" w:name="_Toc244324959"/>
       <w:r>
         <w:t>MỤC LỤC</w:t>
       </w:r>
@@ -240,7 +240,7 @@
     <w:sdt>
       <w:sdtPr>
         <w:alias w:val="Mục lục"/>
-        <w:id w:val="549574736"/>
+        <w:id w:val="1324246878"/>
       </w:sdtPr>
       <w:sdtEndPr/>
       <w:sdtContent>
@@ -268,7 +268,7 @@
           <w:r>
             <w:fldChar w:fldCharType="separate"/>
           </w:r>
-          <w:hyperlink w:anchor="_Toc244174617" w:history="1">
+          <w:hyperlink w:anchor="_Toc244324958" w:history="1">
             <w:r>
               <w:rPr>
                 <w:rStyle w:val="Hyperlink"/>
@@ -292,7 +292,7 @@
               <w:rPr>
                 <w:noProof/>
               </w:rPr>
-              <w:instrText xml:space="preserve"> PAGEREF _Toc244174617 \h </w:instrText>
+              <w:instrText xml:space="preserve"> PAGEREF _Toc244324958 \h </w:instrText>
             </w:r>
             <w:r>
               <w:rPr>
@@ -334,7 +334,7 @@
               <w14:ligatures w14:val="standardContextual"/>
             </w:rPr>
           </w:pPr>
-          <w:hyperlink w:anchor="_Toc244174618" w:history="1">
+          <w:hyperlink w:anchor="_Toc244324959" w:history="1">
             <w:r>
               <w:rPr>
                 <w:rStyle w:val="Hyperlink"/>
@@ -358,7 +358,7 @@
               <w:rPr>
                 <w:noProof/>
               </w:rPr>
-              <w:instrText xml:space="preserve"> PAGEREF _Toc244174618 \h </w:instrText>
+              <w:instrText xml:space="preserve"> PAGEREF _Toc244324959 \h </w:instrText>
             </w:r>
             <w:r>
               <w:rPr>
@@ -400,7 +400,7 @@
               <w14:ligatures w14:val="standardContextual"/>
             </w:rPr>
           </w:pPr>
-          <w:hyperlink w:anchor="_Toc244174619" w:history="1">
+          <w:hyperlink w:anchor="_Toc244324960" w:history="1">
             <w:r>
               <w:rPr>
                 <w:rStyle w:val="Hyperlink"/>
@@ -424,7 +424,7 @@
               <w:rPr>
                 <w:noProof/>
               </w:rPr>
-              <w:instrText xml:space="preserve"> PAGEREF _Toc244174619 \h </w:instrText>
+              <w:instrText xml:space="preserve"> PAGEREF _Toc244324960 \h </w:instrText>
             </w:r>
             <w:r>
               <w:rPr>
@@ -466,7 +466,7 @@
               <w14:ligatures w14:val="standardContextual"/>
             </w:rPr>
           </w:pPr>
-          <w:hyperlink w:anchor="_Toc244174620" w:history="1">
+          <w:hyperlink w:anchor="_Toc244324961" w:history="1">
             <w:r>
               <w:rPr>
                 <w:rStyle w:val="Hyperlink"/>
@@ -490,7 +490,7 @@
               <w:rPr>
                 <w:noProof/>
               </w:rPr>
-              <w:instrText xml:space="preserve"> PAGEREF _Toc244174620 \h </w:instrText>
+              <w:instrText xml:space="preserve"> PAGEREF _Toc244324961 \h </w:instrText>
             </w:r>
             <w:r>
               <w:rPr>
@@ -532,7 +532,7 @@
               <w14:ligatures w14:val="standardContextual"/>
             </w:rPr>
           </w:pPr>
-          <w:hyperlink w:anchor="_Toc244174621" w:history="1">
+          <w:hyperlink w:anchor="_Toc244324962" w:history="1">
             <w:r>
               <w:rPr>
                 <w:rStyle w:val="Hyperlink"/>
@@ -556,7 +556,7 @@
               <w:rPr>
                 <w:noProof/>
               </w:rPr>
-              <w:instrText xml:space="preserve"> PAGEREF _Toc244174621 \h </w:instrText>
+              <w:instrText xml:space="preserve"> PAGEREF _Toc244324962 \h </w:instrText>
             </w:r>
             <w:r>
               <w:rPr>
@@ -598,7 +598,7 @@
               <w14:ligatures w14:val="standardContextual"/>
             </w:rPr>
           </w:pPr>
-          <w:hyperlink w:anchor="_Toc244174622" w:history="1">
+          <w:hyperlink w:anchor="_Toc244324963" w:history="1">
             <w:r>
               <w:rPr>
                 <w:rStyle w:val="Hyperlink"/>
@@ -622,7 +622,7 @@
               <w:rPr>
                 <w:noProof/>
               </w:rPr>
-              <w:instrText xml:space="preserve"> PAGEREF _Toc244174622 \h </w:instrText>
+              <w:instrText xml:space="preserve"> PAGEREF _Toc244324963 \h </w:instrText>
             </w:r>
             <w:r>
               <w:rPr>
@@ -664,7 +664,7 @@
               <w14:ligatures w14:val="standardContextual"/>
             </w:rPr>
           </w:pPr>
-          <w:hyperlink w:anchor="_Toc244174623" w:history="1">
+          <w:hyperlink w:anchor="_Toc244324964" w:history="1">
             <w:r>
               <w:rPr>
                 <w:rStyle w:val="Hyperlink"/>
@@ -688,7 +688,7 @@
               <w:rPr>
                 <w:noProof/>
               </w:rPr>
-              <w:instrText xml:space="preserve"> PAGEREF _Toc244174623 \h </w:instrText>
+              <w:instrText xml:space="preserve"> PAGEREF _Toc244324964 \h </w:instrText>
             </w:r>
             <w:r>
               <w:rPr>
@@ -730,7 +730,7 @@
               <w14:ligatures w14:val="standardContextual"/>
             </w:rPr>
           </w:pPr>
-          <w:hyperlink w:anchor="_Toc244174624" w:history="1">
+          <w:hyperlink w:anchor="_Toc244324965" w:history="1">
             <w:r>
               <w:rPr>
                 <w:rStyle w:val="Hyperlink"/>
@@ -754,7 +754,7 @@
               <w:rPr>
                 <w:noProof/>
               </w:rPr>
-              <w:instrText xml:space="preserve"> PAGEREF _Toc244174624 \h </w:instrText>
+              <w:instrText xml:space="preserve"> PAGEREF _Toc244324965 \h </w:instrText>
             </w:r>
             <w:r>
               <w:rPr>
@@ -796,7 +796,7 @@
               <w14:ligatures w14:val="standardContextual"/>
             </w:rPr>
           </w:pPr>
-          <w:hyperlink w:anchor="_Toc244174625" w:history="1">
+          <w:hyperlink w:anchor="_Toc244324966" w:history="1">
             <w:r>
               <w:rPr>
                 <w:rStyle w:val="Hyperlink"/>
@@ -820,7 +820,7 @@
               <w:rPr>
                 <w:noProof/>
               </w:rPr>
-              <w:instrText xml:space="preserve"> PAGEREF _Toc244174625 \h </w:instrText>
+              <w:instrText xml:space="preserve"> PAGEREF _Toc244324966 \h </w:instrText>
             </w:r>
             <w:r>
               <w:rPr>
@@ -862,7 +862,7 @@
               <w14:ligatures w14:val="standardContextual"/>
             </w:rPr>
           </w:pPr>
-          <w:hyperlink w:anchor="_Toc244174626" w:history="1">
+          <w:hyperlink w:anchor="_Toc244324967" w:history="1">
             <w:r>
               <w:rPr>
                 <w:rStyle w:val="Hyperlink"/>
@@ -886,7 +886,7 @@
               <w:rPr>
                 <w:noProof/>
               </w:rPr>
-              <w:instrText xml:space="preserve"> PAGEREF _Toc244174626 \h </w:instrText>
+              <w:instrText xml:space="preserve"> PAGEREF _Toc244324967 \h </w:instrText>
             </w:r>
             <w:r>
               <w:rPr>
@@ -928,7 +928,7 @@
               <w14:ligatures w14:val="standardContextual"/>
             </w:rPr>
           </w:pPr>
-          <w:hyperlink w:anchor="_Toc244174627" w:history="1">
+          <w:hyperlink w:anchor="_Toc244324968" w:history="1">
             <w:r>
               <w:rPr>
                 <w:rStyle w:val="Hyperlink"/>
@@ -952,7 +952,7 @@
               <w:rPr>
                 <w:noProof/>
               </w:rPr>
-              <w:instrText xml:space="preserve"> PAGEREF _Toc244174627 \h </w:instrText>
+              <w:instrText xml:space="preserve"> PAGEREF _Toc244324968 \h </w:instrText>
             </w:r>
             <w:r>
               <w:rPr>
@@ -994,7 +994,7 @@
               <w14:ligatures w14:val="standardContextual"/>
             </w:rPr>
           </w:pPr>
-          <w:hyperlink w:anchor="_Toc244174628" w:history="1">
+          <w:hyperlink w:anchor="_Toc244324969" w:history="1">
             <w:r>
               <w:rPr>
                 <w:rStyle w:val="Hyperlink"/>
@@ -1018,7 +1018,7 @@
               <w:rPr>
                 <w:noProof/>
               </w:rPr>
-              <w:instrText xml:space="preserve"> PAGEREF _Toc244174628 \h </w:instrText>
+              <w:instrText xml:space="preserve"> PAGEREF _Toc244324969 \h </w:instrText>
             </w:r>
             <w:r>
               <w:rPr>
@@ -1060,7 +1060,7 @@
               <w14:ligatures w14:val="standardContextual"/>
             </w:rPr>
           </w:pPr>
-          <w:hyperlink w:anchor="_Toc244174629" w:history="1">
+          <w:hyperlink w:anchor="_Toc244324970" w:history="1">
             <w:r>
               <w:rPr>
                 <w:rStyle w:val="Hyperlink"/>
@@ -1084,7 +1084,7 @@
               <w:rPr>
                 <w:noProof/>
               </w:rPr>
-              <w:instrText xml:space="preserve"> PAGEREF _Toc244174629 \h </w:instrText>
+              <w:instrText xml:space="preserve"> PAGEREF _Toc244324970 \h </w:instrText>
             </w:r>
             <w:r>
               <w:rPr>
@@ -1126,7 +1126,7 @@
               <w14:ligatures w14:val="standardContextual"/>
             </w:rPr>
           </w:pPr>
-          <w:hyperlink w:anchor="_Toc244174630" w:history="1">
+          <w:hyperlink w:anchor="_Toc244324971" w:history="1">
             <w:r>
               <w:rPr>
                 <w:rStyle w:val="Hyperlink"/>
@@ -1150,7 +1150,7 @@
               <w:rPr>
                 <w:noProof/>
               </w:rPr>
-              <w:instrText xml:space="preserve"> PAGEREF _Toc244174630 \h </w:instrText>
+              <w:instrText xml:space="preserve"> PAGEREF _Toc244324971 \h </w:instrText>
             </w:r>
             <w:r>
               <w:rPr>
@@ -1192,7 +1192,7 @@
               <w14:ligatures w14:val="standardContextual"/>
             </w:rPr>
           </w:pPr>
-          <w:hyperlink w:anchor="_Toc244174631" w:history="1">
+          <w:hyperlink w:anchor="_Toc244324972" w:history="1">
             <w:r>
               <w:rPr>
                 <w:rStyle w:val="Hyperlink"/>
@@ -1216,7 +1216,7 @@
               <w:rPr>
                 <w:noProof/>
               </w:rPr>
-              <w:instrText xml:space="preserve"> PAGEREF _Toc244174631 \h </w:instrText>
+              <w:instrText xml:space="preserve"> PAGEREF _Toc244324972 \h </w:instrText>
             </w:r>
             <w:r>
               <w:rPr>
@@ -1258,7 +1258,7 @@
               <w14:ligatures w14:val="standardContextual"/>
             </w:rPr>
           </w:pPr>
-          <w:hyperlink w:anchor="_Toc244174632" w:history="1">
+          <w:hyperlink w:anchor="_Toc244324973" w:history="1">
             <w:r>
               <w:rPr>
                 <w:rStyle w:val="Hyperlink"/>
@@ -1282,7 +1282,7 @@
               <w:rPr>
                 <w:noProof/>
               </w:rPr>
-              <w:instrText xml:space="preserve"> PAGEREF _Toc244174632 \h </w:instrText>
+              <w:instrText xml:space="preserve"> PAGEREF _Toc244324973 \h </w:instrText>
             </w:r>
             <w:r>
               <w:rPr>
@@ -1324,7 +1324,7 @@
               <w14:ligatures w14:val="standardContextual"/>
             </w:rPr>
           </w:pPr>
-          <w:hyperlink w:anchor="_Toc244174633" w:history="1">
+          <w:hyperlink w:anchor="_Toc244324974" w:history="1">
             <w:r>
               <w:rPr>
                 <w:rStyle w:val="Hyperlink"/>
@@ -1348,7 +1348,7 @@
               <w:rPr>
                 <w:noProof/>
               </w:rPr>
-              <w:instrText xml:space="preserve"> PAGEREF _Toc244174633 \h </w:instrText>
+              <w:instrText xml:space="preserve"> PAGEREF _Toc244324974 \h </w:instrText>
             </w:r>
             <w:r>
               <w:rPr>
@@ -1390,7 +1390,7 @@
               <w14:ligatures w14:val="standardContextual"/>
             </w:rPr>
           </w:pPr>
-          <w:hyperlink w:anchor="_Toc244174634" w:history="1">
+          <w:hyperlink w:anchor="_Toc244324975" w:history="1">
             <w:r>
               <w:rPr>
                 <w:rStyle w:val="Hyperlink"/>
@@ -1414,7 +1414,7 @@
               <w:rPr>
                 <w:noProof/>
               </w:rPr>
-              <w:instrText xml:space="preserve"> PAGEREF _Toc244174634 \h </w:instrText>
+              <w:instrText xml:space="preserve"> PAGEREF _Toc244324975 \h </w:instrText>
             </w:r>
             <w:r>
               <w:rPr>
@@ -1456,7 +1456,7 @@
               <w14:ligatures w14:val="standardContextual"/>
             </w:rPr>
           </w:pPr>
-          <w:hyperlink w:anchor="_Toc244174635" w:history="1">
+          <w:hyperlink w:anchor="_Toc244324976" w:history="1">
             <w:r>
               <w:rPr>
                 <w:rStyle w:val="Hyperlink"/>
@@ -1480,7 +1480,7 @@
               <w:rPr>
                 <w:noProof/>
               </w:rPr>
-              <w:instrText xml:space="preserve"> PAGEREF _Toc244174635 \h </w:instrText>
+              <w:instrText xml:space="preserve"> PAGEREF _Toc244324976 \h </w:instrText>
             </w:r>
             <w:r>
               <w:rPr>
@@ -1522,7 +1522,7 @@
               <w14:ligatures w14:val="standardContextual"/>
             </w:rPr>
           </w:pPr>
-          <w:hyperlink w:anchor="_Toc244174636" w:history="1">
+          <w:hyperlink w:anchor="_Toc244324977" w:history="1">
             <w:r>
               <w:rPr>
                 <w:rStyle w:val="Hyperlink"/>
@@ -1546,7 +1546,7 @@
               <w:rPr>
                 <w:noProof/>
               </w:rPr>
-              <w:instrText xml:space="preserve"> PAGEREF _Toc244174636 \h </w:instrText>
+              <w:instrText xml:space="preserve"> PAGEREF _Toc244324977 \h </w:instrText>
             </w:r>
             <w:r>
               <w:rPr>
@@ -1588,7 +1588,7 @@
               <w14:ligatures w14:val="standardContextual"/>
             </w:rPr>
           </w:pPr>
-          <w:hyperlink w:anchor="_Toc244174637" w:history="1">
+          <w:hyperlink w:anchor="_Toc244324978" w:history="1">
             <w:r>
               <w:rPr>
                 <w:rStyle w:val="Hyperlink"/>
@@ -1612,7 +1612,7 @@
               <w:rPr>
                 <w:noProof/>
               </w:rPr>
-              <w:instrText xml:space="preserve"> PAGEREF _Toc244174637 \h </w:instrText>
+              <w:instrText xml:space="preserve"> PAGEREF _Toc244324978 \h </w:instrText>
             </w:r>
             <w:r>
               <w:rPr>
@@ -1654,7 +1654,7 @@
               <w14:ligatures w14:val="standardContextual"/>
             </w:rPr>
           </w:pPr>
-          <w:hyperlink w:anchor="_Toc244174638" w:history="1">
+          <w:hyperlink w:anchor="_Toc244324979" w:history="1">
             <w:r>
               <w:rPr>
                 <w:rStyle w:val="Hyperlink"/>
@@ -1678,7 +1678,7 @@
               <w:rPr>
                 <w:noProof/>
               </w:rPr>
-              <w:instrText xml:space="preserve"> PAGEREF _Toc244174638 \h </w:instrText>
+              <w:instrText xml:space="preserve"> PAGEREF _Toc244324979 \h </w:instrText>
             </w:r>
             <w:r>
               <w:rPr>
@@ -1720,7 +1720,7 @@
               <w14:ligatures w14:val="standardContextual"/>
             </w:rPr>
           </w:pPr>
-          <w:hyperlink w:anchor="_Toc244174639" w:history="1">
+          <w:hyperlink w:anchor="_Toc244324980" w:history="1">
             <w:r>
               <w:rPr>
                 <w:rStyle w:val="Hyperlink"/>
@@ -1744,7 +1744,7 @@
               <w:rPr>
                 <w:noProof/>
               </w:rPr>
-              <w:instrText xml:space="preserve"> PAGEREF _Toc244174639 \h </w:instrText>
+              <w:instrText xml:space="preserve"> PAGEREF _Toc244324980 \h </w:instrText>
             </w:r>
             <w:r>
               <w:rPr>
@@ -1786,7 +1786,7 @@
               <w14:ligatures w14:val="standardContextual"/>
             </w:rPr>
           </w:pPr>
-          <w:hyperlink w:anchor="_Toc244174640" w:history="1">
+          <w:hyperlink w:anchor="_Toc244324981" w:history="1">
             <w:r>
               <w:rPr>
                 <w:rStyle w:val="Hyperlink"/>
@@ -1810,7 +1810,7 @@
               <w:rPr>
                 <w:noProof/>
               </w:rPr>
-              <w:instrText xml:space="preserve"> PAGEREF _Toc244174640 \h </w:instrText>
+              <w:instrText xml:space="preserve"> PAGEREF _Toc244324981 \h </w:instrText>
             </w:r>
             <w:r>
               <w:rPr>
@@ -1852,7 +1852,7 @@
               <w14:ligatures w14:val="standardContextual"/>
             </w:rPr>
           </w:pPr>
-          <w:hyperlink w:anchor="_Toc244174641" w:history="1">
+          <w:hyperlink w:anchor="_Toc244324982" w:history="1">
             <w:r>
               <w:rPr>
                 <w:rStyle w:val="Hyperlink"/>
@@ -1876,7 +1876,7 @@
               <w:rPr>
                 <w:noProof/>
               </w:rPr>
-              <w:instrText xml:space="preserve"> PAGEREF _Toc244174641 \h </w:instrText>
+              <w:instrText xml:space="preserve"> PAGEREF _Toc244324982 \h </w:instrText>
             </w:r>
             <w:r>
               <w:rPr>
@@ -1918,7 +1918,7 @@
               <w14:ligatures w14:val="standardContextual"/>
             </w:rPr>
           </w:pPr>
-          <w:hyperlink w:anchor="_Toc244174642" w:history="1">
+          <w:hyperlink w:anchor="_Toc244324983" w:history="1">
             <w:r>
               <w:rPr>
                 <w:rStyle w:val="Hyperlink"/>
@@ -1942,7 +1942,7 @@
               <w:rPr>
                 <w:noProof/>
               </w:rPr>
-              <w:instrText xml:space="preserve"> PAGEREF _Toc244174642 \h </w:instrText>
+              <w:instrText xml:space="preserve"> PAGEREF _Toc244324983 \h </w:instrText>
             </w:r>
             <w:r>
               <w:rPr>
@@ -1984,7 +1984,7 @@
               <w14:ligatures w14:val="standardContextual"/>
             </w:rPr>
           </w:pPr>
-          <w:hyperlink w:anchor="_Toc244174643" w:history="1">
+          <w:hyperlink w:anchor="_Toc244324984" w:history="1">
             <w:r>
               <w:rPr>
                 <w:rStyle w:val="Hyperlink"/>
@@ -2008,7 +2008,7 @@
               <w:rPr>
                 <w:noProof/>
               </w:rPr>
-              <w:instrText xml:space="preserve"> PAGEREF _Toc244174643 \h </w:instrText>
+              <w:instrText xml:space="preserve"> PAGEREF _Toc244324984 \h </w:instrText>
             </w:r>
             <w:r>
               <w:rPr>
@@ -2050,7 +2050,7 @@
               <w14:ligatures w14:val="standardContextual"/>
             </w:rPr>
           </w:pPr>
-          <w:hyperlink w:anchor="_Toc244174644" w:history="1">
+          <w:hyperlink w:anchor="_Toc244324985" w:history="1">
             <w:r>
               <w:rPr>
                 <w:rStyle w:val="Hyperlink"/>
@@ -2074,7 +2074,7 @@
               <w:rPr>
                 <w:noProof/>
               </w:rPr>
-              <w:instrText xml:space="preserve"> PAGEREF _Toc244174644 \h </w:instrText>
+              <w:instrText xml:space="preserve"> PAGEREF _Toc244324985 \h </w:instrText>
             </w:r>
             <w:r>
               <w:rPr>
@@ -2116,7 +2116,7 @@
               <w14:ligatures w14:val="standardContextual"/>
             </w:rPr>
           </w:pPr>
-          <w:hyperlink w:anchor="_Toc244174645" w:history="1">
+          <w:hyperlink w:anchor="_Toc244324986" w:history="1">
             <w:r>
               <w:rPr>
                 <w:rStyle w:val="Hyperlink"/>
@@ -2140,7 +2140,7 @@
               <w:rPr>
                 <w:noProof/>
               </w:rPr>
-              <w:instrText xml:space="preserve"> PAGEREF _Toc244174645 \h </w:instrText>
+              <w:instrText xml:space="preserve"> PAGEREF _Toc244324986 \h </w:instrText>
             </w:r>
             <w:r>
               <w:rPr>
@@ -2182,7 +2182,7 @@
               <w14:ligatures w14:val="standardContextual"/>
             </w:rPr>
           </w:pPr>
-          <w:hyperlink w:anchor="_Toc244174646" w:history="1">
+          <w:hyperlink w:anchor="_Toc244324987" w:history="1">
             <w:r>
               <w:rPr>
                 <w:rStyle w:val="Hyperlink"/>
@@ -2206,7 +2206,7 @@
               <w:rPr>
                 <w:noProof/>
               </w:rPr>
-              <w:instrText xml:space="preserve"> PAGEREF _Toc244174646 \h </w:instrText>
+              <w:instrText xml:space="preserve"> PAGEREF _Toc244324987 \h </w:instrText>
             </w:r>
             <w:r>
               <w:rPr>
@@ -2248,7 +2248,7 @@
               <w14:ligatures w14:val="standardContextual"/>
             </w:rPr>
           </w:pPr>
-          <w:hyperlink w:anchor="_Toc244174647" w:history="1">
+          <w:hyperlink w:anchor="_Toc244324988" w:history="1">
             <w:r>
               <w:rPr>
                 <w:rStyle w:val="Hyperlink"/>
@@ -2272,7 +2272,7 @@
               <w:rPr>
                 <w:noProof/>
               </w:rPr>
-              <w:instrText xml:space="preserve"> PAGEREF _Toc244174647 \h </w:instrText>
+              <w:instrText xml:space="preserve"> PAGEREF _Toc244324988 \h </w:instrText>
             </w:r>
             <w:r>
               <w:rPr>
@@ -2314,7 +2314,7 @@
               <w14:ligatures w14:val="standardContextual"/>
             </w:rPr>
           </w:pPr>
-          <w:hyperlink w:anchor="_Toc244174648" w:history="1">
+          <w:hyperlink w:anchor="_Toc244324989" w:history="1">
             <w:r>
               <w:rPr>
                 <w:rStyle w:val="Hyperlink"/>
@@ -2338,7 +2338,7 @@
               <w:rPr>
                 <w:noProof/>
               </w:rPr>
-              <w:instrText xml:space="preserve"> PAGEREF _Toc244174648 \h </w:instrText>
+              <w:instrText xml:space="preserve"> PAGEREF _Toc244324989 \h </w:instrText>
             </w:r>
             <w:r>
               <w:rPr>
@@ -2380,7 +2380,7 @@
               <w14:ligatures w14:val="standardContextual"/>
             </w:rPr>
           </w:pPr>
-          <w:hyperlink w:anchor="_Toc244174649" w:history="1">
+          <w:hyperlink w:anchor="_Toc244324990" w:history="1">
             <w:r>
               <w:rPr>
                 <w:rStyle w:val="Hyperlink"/>
@@ -2404,7 +2404,7 @@
               <w:rPr>
                 <w:noProof/>
               </w:rPr>
-              <w:instrText xml:space="preserve"> PAGEREF _Toc244174649 \h </w:instrText>
+              <w:instrText xml:space="preserve"> PAGEREF _Toc244324990 \h </w:instrText>
             </w:r>
             <w:r>
               <w:rPr>
@@ -2446,7 +2446,7 @@
               <w14:ligatures w14:val="standardContextual"/>
             </w:rPr>
           </w:pPr>
-          <w:hyperlink w:anchor="_Toc244174650" w:history="1">
+          <w:hyperlink w:anchor="_Toc244324991" w:history="1">
             <w:r>
               <w:rPr>
                 <w:rStyle w:val="Hyperlink"/>
@@ -2470,7 +2470,7 @@
               <w:rPr>
                 <w:noProof/>
               </w:rPr>
-              <w:instrText xml:space="preserve"> PAGEREF _Toc244174650 \h </w:instrText>
+              <w:instrText xml:space="preserve"> PAGEREF _Toc244324991 \h </w:instrText>
             </w:r>
             <w:r>
               <w:rPr>
@@ -2512,7 +2512,7 @@
               <w14:ligatures w14:val="standardContextual"/>
             </w:rPr>
           </w:pPr>
-          <w:hyperlink w:anchor="_Toc244174651" w:history="1">
+          <w:hyperlink w:anchor="_Toc244324992" w:history="1">
             <w:r>
               <w:rPr>
                 <w:rStyle w:val="Hyperlink"/>
@@ -2536,7 +2536,7 @@
               <w:rPr>
                 <w:noProof/>
               </w:rPr>
-              <w:instrText xml:space="preserve"> PAGEREF _Toc244174651 \h </w:instrText>
+              <w:instrText xml:space="preserve"> PAGEREF _Toc244324992 \h </w:instrText>
             </w:r>
             <w:r>
               <w:rPr>
@@ -2578,7 +2578,7 @@
               <w14:ligatures w14:val="standardContextual"/>
             </w:rPr>
           </w:pPr>
-          <w:hyperlink w:anchor="_Toc244174652" w:history="1">
+          <w:hyperlink w:anchor="_Toc244324993" w:history="1">
             <w:r>
               <w:rPr>
                 <w:rStyle w:val="Hyperlink"/>
@@ -2602,7 +2602,7 @@
               <w:rPr>
                 <w:noProof/>
               </w:rPr>
-              <w:instrText xml:space="preserve"> PAGEREF _Toc244174652 \h </w:instrText>
+              <w:instrText xml:space="preserve"> PAGEREF _Toc244324993 \h </w:instrText>
             </w:r>
             <w:r>
               <w:rPr>
@@ -2644,7 +2644,7 @@
               <w14:ligatures w14:val="standardContextual"/>
             </w:rPr>
           </w:pPr>
-          <w:hyperlink w:anchor="_Toc244174653" w:history="1">
+          <w:hyperlink w:anchor="_Toc244324994" w:history="1">
             <w:r>
               <w:rPr>
                 <w:rStyle w:val="Hyperlink"/>
@@ -2668,7 +2668,7 @@
               <w:rPr>
                 <w:noProof/>
               </w:rPr>
-              <w:instrText xml:space="preserve"> PAGEREF _Toc244174653 \h </w:instrText>
+              <w:instrText xml:space="preserve"> PAGEREF _Toc244324994 \h </w:instrText>
             </w:r>
             <w:r>
               <w:rPr>
@@ -2710,7 +2710,7 @@
               <w14:ligatures w14:val="standardContextual"/>
             </w:rPr>
           </w:pPr>
-          <w:hyperlink w:anchor="_Toc244174654" w:history="1">
+          <w:hyperlink w:anchor="_Toc244324995" w:history="1">
             <w:r>
               <w:rPr>
                 <w:rStyle w:val="Hyperlink"/>
@@ -2734,7 +2734,7 @@
               <w:rPr>
                 <w:noProof/>
               </w:rPr>
-              <w:instrText xml:space="preserve"> PAGEREF _Toc244174654 \h </w:instrText>
+              <w:instrText xml:space="preserve"> PAGEREF _Toc244324995 \h </w:instrText>
             </w:r>
             <w:r>
               <w:rPr>
@@ -2776,7 +2776,7 @@
               <w14:ligatures w14:val="standardContextual"/>
             </w:rPr>
           </w:pPr>
-          <w:hyperlink w:anchor="_Toc244174655" w:history="1">
+          <w:hyperlink w:anchor="_Toc244324996" w:history="1">
             <w:r>
               <w:rPr>
                 <w:rStyle w:val="Hyperlink"/>
@@ -2800,7 +2800,7 @@
               <w:rPr>
                 <w:noProof/>
               </w:rPr>
-              <w:instrText xml:space="preserve"> PAGEREF _Toc244174655 \h </w:instrText>
+              <w:instrText xml:space="preserve"> PAGEREF _Toc244324996 \h </w:instrText>
             </w:r>
             <w:r>
               <w:rPr>
@@ -2842,7 +2842,7 @@
               <w14:ligatures w14:val="standardContextual"/>
             </w:rPr>
           </w:pPr>
-          <w:hyperlink w:anchor="_Toc244174656" w:history="1">
+          <w:hyperlink w:anchor="_Toc244324997" w:history="1">
             <w:r>
               <w:rPr>
                 <w:rStyle w:val="Hyperlink"/>
@@ -2866,7 +2866,7 @@
               <w:rPr>
                 <w:noProof/>
               </w:rPr>
-              <w:instrText xml:space="preserve"> PAGEREF _Toc244174656 \h </w:instrText>
+              <w:instrText xml:space="preserve"> PAGEREF _Toc244324997 \h </w:instrText>
             </w:r>
             <w:r>
               <w:rPr>
@@ -2908,7 +2908,7 @@
               <w14:ligatures w14:val="standardContextual"/>
             </w:rPr>
           </w:pPr>
-          <w:hyperlink w:anchor="_Toc244174657" w:history="1">
+          <w:hyperlink w:anchor="_Toc244324998" w:history="1">
             <w:r>
               <w:rPr>
                 <w:rStyle w:val="Hyperlink"/>
@@ -2932,7 +2932,7 @@
               <w:rPr>
                 <w:noProof/>
               </w:rPr>
-              <w:instrText xml:space="preserve"> PAGEREF _Toc244174657 \h </w:instrText>
+              <w:instrText xml:space="preserve"> PAGEREF _Toc244324998 \h </w:instrText>
             </w:r>
             <w:r>
               <w:rPr>
@@ -2974,7 +2974,7 @@
               <w14:ligatures w14:val="standardContextual"/>
             </w:rPr>
           </w:pPr>
-          <w:hyperlink w:anchor="_Toc244174658" w:history="1">
+          <w:hyperlink w:anchor="_Toc244324999" w:history="1">
             <w:r>
               <w:rPr>
                 <w:rStyle w:val="Hyperlink"/>
@@ -2998,7 +2998,7 @@
               <w:rPr>
                 <w:noProof/>
               </w:rPr>
-              <w:instrText xml:space="preserve"> PAGEREF _Toc244174658 \h </w:instrText>
+              <w:instrText xml:space="preserve"> PAGEREF _Toc244324999 \h </w:instrText>
             </w:r>
             <w:r>
               <w:rPr>
@@ -3040,7 +3040,7 @@
               <w14:ligatures w14:val="standardContextual"/>
             </w:rPr>
           </w:pPr>
-          <w:hyperlink w:anchor="_Toc244174659" w:history="1">
+          <w:hyperlink w:anchor="_Toc244325000" w:history="1">
             <w:r>
               <w:rPr>
                 <w:rStyle w:val="Hyperlink"/>
@@ -3064,7 +3064,7 @@
               <w:rPr>
                 <w:noProof/>
               </w:rPr>
-              <w:instrText xml:space="preserve"> PAGEREF _Toc244174659 \h </w:instrText>
+              <w:instrText xml:space="preserve"> PAGEREF _Toc244325000 \h </w:instrText>
             </w:r>
             <w:r>
               <w:rPr>
@@ -3106,7 +3106,7 @@
               <w14:ligatures w14:val="standardContextual"/>
             </w:rPr>
           </w:pPr>
-          <w:hyperlink w:anchor="_Toc244174660" w:history="1">
+          <w:hyperlink w:anchor="_Toc244325001" w:history="1">
             <w:r>
               <w:rPr>
                 <w:rStyle w:val="Hyperlink"/>
@@ -3130,7 +3130,7 @@
               <w:rPr>
                 <w:noProof/>
               </w:rPr>
-              <w:instrText xml:space="preserve"> PAGEREF _Toc244174660 \h </w:instrText>
+              <w:instrText xml:space="preserve"> PAGEREF _Toc244325001 \h </w:instrText>
             </w:r>
             <w:r>
               <w:rPr>
@@ -3172,7 +3172,7 @@
               <w14:ligatures w14:val="standardContextual"/>
             </w:rPr>
           </w:pPr>
-          <w:hyperlink w:anchor="_Toc244174661" w:history="1">
+          <w:hyperlink w:anchor="_Toc244325002" w:history="1">
             <w:r>
               <w:rPr>
                 <w:rStyle w:val="Hyperlink"/>
@@ -3196,7 +3196,7 @@
               <w:rPr>
                 <w:noProof/>
               </w:rPr>
-              <w:instrText xml:space="preserve"> PAGEREF _Toc244174661 \h </w:instrText>
+              <w:instrText xml:space="preserve"> PAGEREF _Toc244325002 \h </w:instrText>
             </w:r>
             <w:r>
               <w:rPr>
@@ -3238,7 +3238,7 @@
               <w14:ligatures w14:val="standardContextual"/>
             </w:rPr>
           </w:pPr>
-          <w:hyperlink w:anchor="_Toc244174662" w:history="1">
+          <w:hyperlink w:anchor="_Toc244325003" w:history="1">
             <w:r>
               <w:rPr>
                 <w:rStyle w:val="Hyperlink"/>
@@ -3262,7 +3262,7 @@
               <w:rPr>
                 <w:noProof/>
               </w:rPr>
-              <w:instrText xml:space="preserve"> PAGEREF _Toc244174662 \h </w:instrText>
+              <w:instrText xml:space="preserve"> PAGEREF _Toc244325003 \h </w:instrText>
             </w:r>
             <w:r>
               <w:rPr>
@@ -3304,7 +3304,7 @@
               <w14:ligatures w14:val="standardContextual"/>
             </w:rPr>
           </w:pPr>
-          <w:hyperlink w:anchor="_Toc244174663" w:history="1">
+          <w:hyperlink w:anchor="_Toc244325004" w:history="1">
             <w:r>
               <w:rPr>
                 <w:rStyle w:val="Hyperlink"/>
@@ -3328,7 +3328,7 @@
               <w:rPr>
                 <w:noProof/>
               </w:rPr>
-              <w:instrText xml:space="preserve"> PAGEREF _Toc244174663 \h </w:instrText>
+              <w:instrText xml:space="preserve"> PAGEREF _Toc244325004 \h </w:instrText>
             </w:r>
             <w:r>
               <w:rPr>
@@ -3370,7 +3370,7 @@
               <w14:ligatures w14:val="standardContextual"/>
             </w:rPr>
           </w:pPr>
-          <w:hyperlink w:anchor="_Toc244174664" w:history="1">
+          <w:hyperlink w:anchor="_Toc244325005" w:history="1">
             <w:r>
               <w:rPr>
                 <w:rStyle w:val="Hyperlink"/>
@@ -3394,7 +3394,7 @@
               <w:rPr>
                 <w:noProof/>
               </w:rPr>
-              <w:instrText xml:space="preserve"> PAGEREF _Toc244174664 \h </w:instrText>
+              <w:instrText xml:space="preserve"> PAGEREF _Toc244325005 \h </w:instrText>
             </w:r>
             <w:r>
               <w:rPr>
@@ -3436,7 +3436,7 @@
               <w14:ligatures w14:val="standardContextual"/>
             </w:rPr>
           </w:pPr>
-          <w:hyperlink w:anchor="_Toc244174665" w:history="1">
+          <w:hyperlink w:anchor="_Toc244325006" w:history="1">
             <w:r>
               <w:rPr>
                 <w:rStyle w:val="Hyperlink"/>
@@ -3460,7 +3460,7 @@
               <w:rPr>
                 <w:noProof/>
               </w:rPr>
-              <w:instrText xml:space="preserve"> PAGEREF _Toc244174665 \h </w:instrText>
+              <w:instrText xml:space="preserve"> PAGEREF _Toc244325006 \h </w:instrText>
             </w:r>
             <w:r>
               <w:rPr>
@@ -3502,7 +3502,7 @@
               <w14:ligatures w14:val="standardContextual"/>
             </w:rPr>
           </w:pPr>
-          <w:hyperlink w:anchor="_Toc244174666" w:history="1">
+          <w:hyperlink w:anchor="_Toc244325007" w:history="1">
             <w:r>
               <w:rPr>
                 <w:rStyle w:val="Hyperlink"/>
@@ -3526,7 +3526,7 @@
               <w:rPr>
                 <w:noProof/>
               </w:rPr>
-              <w:instrText xml:space="preserve"> PAGEREF _Toc244174666 \h </w:instrText>
+              <w:instrText xml:space="preserve"> PAGEREF _Toc244325007 \h </w:instrText>
             </w:r>
             <w:r>
               <w:rPr>
@@ -3568,7 +3568,7 @@
               <w14:ligatures w14:val="standardContextual"/>
             </w:rPr>
           </w:pPr>
-          <w:hyperlink w:anchor="_Toc244174667" w:history="1">
+          <w:hyperlink w:anchor="_Toc244325008" w:history="1">
             <w:r>
               <w:rPr>
                 <w:rStyle w:val="Hyperlink"/>
@@ -3592,7 +3592,7 @@
               <w:rPr>
                 <w:noProof/>
               </w:rPr>
-              <w:instrText xml:space="preserve"> PAGEREF _Toc244174667 \h </w:instrText>
+              <w:instrText xml:space="preserve"> PAGEREF _Toc244325008 \h </w:instrText>
             </w:r>
             <w:r>
               <w:rPr>
@@ -3634,7 +3634,7 @@
               <w14:ligatures w14:val="standardContextual"/>
             </w:rPr>
           </w:pPr>
-          <w:hyperlink w:anchor="_Toc244174668" w:history="1">
+          <w:hyperlink w:anchor="_Toc244325009" w:history="1">
             <w:r>
               <w:rPr>
                 <w:rStyle w:val="Hyperlink"/>
@@ -3658,7 +3658,7 @@
               <w:rPr>
                 <w:noProof/>
               </w:rPr>
-              <w:instrText xml:space="preserve"> PAGEREF _Toc244174668 \h </w:instrText>
+              <w:instrText xml:space="preserve"> PAGEREF _Toc244325009 \h </w:instrText>
             </w:r>
             <w:r>
               <w:rPr>
@@ -3700,7 +3700,7 @@
               <w14:ligatures w14:val="standardContextual"/>
             </w:rPr>
           </w:pPr>
-          <w:hyperlink w:anchor="_Toc244174669" w:history="1">
+          <w:hyperlink w:anchor="_Toc244325010" w:history="1">
             <w:r>
               <w:rPr>
                 <w:rStyle w:val="Hyperlink"/>
@@ -3724,7 +3724,7 @@
               <w:rPr>
                 <w:noProof/>
               </w:rPr>
-              <w:instrText xml:space="preserve"> PAGEREF _Toc244174669 \h </w:instrText>
+              <w:instrText xml:space="preserve"> PAGEREF _Toc244325010 \h </w:instrText>
             </w:r>
             <w:r>
               <w:rPr>
@@ -3766,7 +3766,7 @@
               <w14:ligatures w14:val="standardContextual"/>
             </w:rPr>
           </w:pPr>
-          <w:hyperlink w:anchor="_Toc244174670" w:history="1">
+          <w:hyperlink w:anchor="_Toc244325011" w:history="1">
             <w:r>
               <w:rPr>
                 <w:rStyle w:val="Hyperlink"/>
@@ -3790,7 +3790,7 @@
               <w:rPr>
                 <w:noProof/>
               </w:rPr>
-              <w:instrText xml:space="preserve"> PAGEREF _Toc244174670 \h </w:instrText>
+              <w:instrText xml:space="preserve"> PAGEREF _Toc244325011 \h </w:instrText>
             </w:r>
             <w:r>
               <w:rPr>
@@ -3832,7 +3832,7 @@
               <w14:ligatures w14:val="standardContextual"/>
             </w:rPr>
           </w:pPr>
-          <w:hyperlink w:anchor="_Toc244174671" w:history="1">
+          <w:hyperlink w:anchor="_Toc244325012" w:history="1">
             <w:r>
               <w:rPr>
                 <w:rStyle w:val="Hyperlink"/>
@@ -3856,7 +3856,7 @@
               <w:rPr>
                 <w:noProof/>
               </w:rPr>
-              <w:instrText xml:space="preserve"> PAGEREF _Toc244174671 \h </w:instrText>
+              <w:instrText xml:space="preserve"> PAGEREF _Toc244325012 \h </w:instrText>
             </w:r>
             <w:r>
               <w:rPr>
@@ -3898,7 +3898,7 @@
               <w14:ligatures w14:val="standardContextual"/>
             </w:rPr>
           </w:pPr>
-          <w:hyperlink w:anchor="_Toc244174672" w:history="1">
+          <w:hyperlink w:anchor="_Toc244325013" w:history="1">
             <w:r>
               <w:rPr>
                 <w:rStyle w:val="Hyperlink"/>
@@ -3922,7 +3922,7 @@
               <w:rPr>
                 <w:noProof/>
               </w:rPr>
-              <w:instrText xml:space="preserve"> PAGEREF _Toc244174672 \h </w:instrText>
+              <w:instrText xml:space="preserve"> PAGEREF _Toc244325013 \h </w:instrText>
             </w:r>
             <w:r>
               <w:rPr>
@@ -3964,7 +3964,7 @@
               <w14:ligatures w14:val="standardContextual"/>
             </w:rPr>
           </w:pPr>
-          <w:hyperlink w:anchor="_Toc244174673" w:history="1">
+          <w:hyperlink w:anchor="_Toc244325014" w:history="1">
             <w:r>
               <w:rPr>
                 <w:rStyle w:val="Hyperlink"/>
@@ -3988,7 +3988,7 @@
               <w:rPr>
                 <w:noProof/>
               </w:rPr>
-              <w:instrText xml:space="preserve"> PAGEREF _Toc244174673 \h </w:instrText>
+              <w:instrText xml:space="preserve"> PAGEREF _Toc244325014 \h </w:instrText>
             </w:r>
             <w:r>
               <w:rPr>
@@ -4030,7 +4030,7 @@
               <w14:ligatures w14:val="standardContextual"/>
             </w:rPr>
           </w:pPr>
-          <w:hyperlink w:anchor="_Toc244174674" w:history="1">
+          <w:hyperlink w:anchor="_Toc244325015" w:history="1">
             <w:r>
               <w:rPr>
                 <w:rStyle w:val="Hyperlink"/>
@@ -4054,7 +4054,7 @@
               <w:rPr>
                 <w:noProof/>
               </w:rPr>
-              <w:instrText xml:space="preserve"> PAGEREF _Toc244174674 \h </w:instrText>
+              <w:instrText xml:space="preserve"> PAGEREF _Toc244325015 \h </w:instrText>
             </w:r>
             <w:r>
               <w:rPr>
@@ -4096,7 +4096,7 @@
               <w14:ligatures w14:val="standardContextual"/>
             </w:rPr>
           </w:pPr>
-          <w:hyperlink w:anchor="_Toc244174675" w:history="1">
+          <w:hyperlink w:anchor="_Toc244325016" w:history="1">
             <w:r>
               <w:rPr>
                 <w:rStyle w:val="Hyperlink"/>
@@ -4120,7 +4120,7 @@
               <w:rPr>
                 <w:noProof/>
               </w:rPr>
-              <w:instrText xml:space="preserve"> PAGEREF _Toc244174675 \h </w:instrText>
+              <w:instrText xml:space="preserve"> PAGEREF _Toc244325016 \h </w:instrText>
             </w:r>
             <w:r>
               <w:rPr>
@@ -4162,7 +4162,7 @@
               <w14:ligatures w14:val="standardContextual"/>
             </w:rPr>
           </w:pPr>
-          <w:hyperlink w:anchor="_Toc244174676" w:history="1">
+          <w:hyperlink w:anchor="_Toc244325017" w:history="1">
             <w:r>
               <w:rPr>
                 <w:rStyle w:val="Hyperlink"/>
@@ -4186,7 +4186,7 @@
               <w:rPr>
                 <w:noProof/>
               </w:rPr>
-              <w:instrText xml:space="preserve"> PAGEREF _Toc244174676 \h </w:instrText>
+              <w:instrText xml:space="preserve"> PAGEREF _Toc244325017 \h </w:instrText>
             </w:r>
             <w:r>
               <w:rPr>
@@ -4228,7 +4228,7 @@
               <w14:ligatures w14:val="standardContextual"/>
             </w:rPr>
           </w:pPr>
-          <w:hyperlink w:anchor="_Toc244174677" w:history="1">
+          <w:hyperlink w:anchor="_Toc244325018" w:history="1">
             <w:r>
               <w:rPr>
                 <w:rStyle w:val="Hyperlink"/>
@@ -4252,7 +4252,7 @@
               <w:rPr>
                 <w:noProof/>
               </w:rPr>
-              <w:instrText xml:space="preserve"> PAGEREF _Toc244174677 \h </w:instrText>
+              <w:instrText xml:space="preserve"> PAGEREF _Toc244325018 \h </w:instrText>
             </w:r>
             <w:r>
               <w:rPr>
@@ -4293,7 +4293,7 @@
         <w:spacing w:after="240"/>
         <w:jc w:val="center"/>
       </w:pPr>
-      <w:bookmarkStart w:id="2" w:name="_Toc244174619"/>
+      <w:bookmarkStart w:id="2" w:name="_Toc244324960"/>
       <w:r>
         <w:t>DANH MỤC TỪ VIẾT TẮT</w:t>
       </w:r>
@@ -4537,7 +4537,7 @@
         <w:spacing w:after="240"/>
         <w:jc w:val="center"/>
       </w:pPr>
-      <w:bookmarkStart w:id="3" w:name="_Toc244174620"/>
+      <w:bookmarkStart w:id="3" w:name="_Toc244324961"/>
       <w:r>
         <w:t>CHƯƠNG 1. MỞ ĐẦU</w:t>
       </w:r>
@@ -4549,7 +4549,7 @@
         <w:keepNext/>
         <w:spacing w:before="240" w:after="120"/>
       </w:pPr>
-      <w:bookmarkStart w:id="4" w:name="_Toc244174621"/>
+      <w:bookmarkStart w:id="4" w:name="_Toc244324962"/>
       <w:r>
         <w:t>1.1. Lý do chọn đề tài</w:t>
       </w:r>
@@ -4591,7 +4591,7 @@
         <w:keepNext/>
         <w:spacing w:before="240" w:after="120"/>
       </w:pPr>
-      <w:bookmarkStart w:id="5" w:name="_Toc244174622"/>
+      <w:bookmarkStart w:id="5" w:name="_Toc244324963"/>
       <w:r>
         <w:t>1.2. Mục tiêu</w:t>
       </w:r>
@@ -4708,7 +4708,7 @@
         <w:keepNext/>
         <w:spacing w:before="240" w:after="120"/>
       </w:pPr>
-      <w:bookmarkStart w:id="6" w:name="_Toc244174623"/>
+      <w:bookmarkStart w:id="6" w:name="_Toc244324964"/>
       <w:r>
         <w:t>1.3. Phạm vi</w:t>
       </w:r>
@@ -5265,7 +5265,7 @@
         <w:keepNext/>
         <w:spacing w:before="240" w:after="120"/>
       </w:pPr>
-      <w:bookmarkStart w:id="7" w:name="_Toc244174624"/>
+      <w:bookmarkStart w:id="7" w:name="_Toc244324965"/>
       <w:r>
         <w:t>1.4. Đối tượng sử dụng</w:t>
       </w:r>
@@ -5340,7 +5340,7 @@
         <w:keepNext/>
         <w:spacing w:before="240" w:after="120"/>
       </w:pPr>
-      <w:bookmarkStart w:id="8" w:name="_Toc244174625"/>
+      <w:bookmarkStart w:id="8" w:name="_Toc244324966"/>
       <w:r>
         <w:t>1.5. Phương pháp thực hiện</w:t>
       </w:r>
@@ -5432,7 +5432,7 @@
         <w:keepNext/>
         <w:spacing w:before="240" w:after="120"/>
       </w:pPr>
-      <w:bookmarkStart w:id="9" w:name="_Toc244174626"/>
+      <w:bookmarkStart w:id="9" w:name="_Toc244324967"/>
       <w:r>
         <w:t>1.6. Bố cục báo cáo</w:t>
       </w:r>
@@ -5455,7 +5455,7 @@
         <w:spacing w:after="240"/>
         <w:jc w:val="center"/>
       </w:pPr>
-      <w:bookmarkStart w:id="10" w:name="_Toc244174627"/>
+      <w:bookmarkStart w:id="10" w:name="_Toc244324968"/>
       <w:r>
         <w:t>CHƯƠNG 2. PHÂN TÍCH YÊU CẦU</w:t>
       </w:r>
@@ -5477,7 +5477,7 @@
         <w:keepNext/>
         <w:spacing w:before="240" w:after="120"/>
       </w:pPr>
-      <w:bookmarkStart w:id="11" w:name="_Toc244174628"/>
+      <w:bookmarkStart w:id="11" w:name="_Toc244324969"/>
       <w:r>
         <w:t>2.1. Tác nhân và ma trận quyền</w:t>
       </w:r>
@@ -6676,7 +6676,7 @@
         <w:keepNext/>
         <w:spacing w:before="240" w:after="120"/>
       </w:pPr>
-      <w:bookmarkStart w:id="12" w:name="_Toc244174629"/>
+      <w:bookmarkStart w:id="12" w:name="_Toc244324970"/>
       <w:r>
         <w:t>2.2. Vòng đời trạng thái ca phẫu thuật</w:t>
       </w:r>
@@ -6703,7 +6703,7 @@
           <w:noProof/>
         </w:rPr>
         <w:drawing>
-          <wp:inline distT="0" distB="0" distL="0" distR="0" wp14:anchorId="409C4821" wp14:editId="4687E464">
+          <wp:inline distT="0" distB="0" distL="0" distR="0" wp14:anchorId="322A2E14" wp14:editId="17367149">
             <wp:extent cx="5038725" cy="3333750"/>
             <wp:effectExtent l="0" t="0" r="0" b="0"/>
             <wp:docPr id="1" name="Picture 1"/>
@@ -6774,7 +6774,7 @@
         <w:keepNext/>
         <w:spacing w:before="240" w:after="120"/>
       </w:pPr>
-      <w:bookmarkStart w:id="13" w:name="_Toc244174630"/>
+      <w:bookmarkStart w:id="13" w:name="_Toc244324971"/>
       <w:r>
         <w:t>2.3. Yêu cầu chức năng</w:t>
       </w:r>
@@ -8717,7 +8717,7 @@
         <w:keepNext/>
         <w:spacing w:before="240" w:after="120"/>
       </w:pPr>
-      <w:bookmarkStart w:id="14" w:name="_Toc244174631"/>
+      <w:bookmarkStart w:id="14" w:name="_Toc244324972"/>
       <w:r>
         <w:t>2.4. Yêu cầu phi chức năng</w:t>
       </w:r>
@@ -10164,7 +10164,7 @@
         <w:keepNext/>
         <w:spacing w:before="240" w:after="120"/>
       </w:pPr>
-      <w:bookmarkStart w:id="15" w:name="_Toc244174632"/>
+      <w:bookmarkStart w:id="15" w:name="_Toc244324973"/>
       <w:r>
         <w:t>2.5. Quy tắc nghiệp vụ</w:t>
       </w:r>
@@ -10281,7 +10281,7 @@
         <w:keepNext/>
         <w:spacing w:before="240" w:after="120"/>
       </w:pPr>
-      <w:bookmarkStart w:id="16" w:name="_Toc244174633"/>
+      <w:bookmarkStart w:id="16" w:name="_Toc244324974"/>
       <w:r>
         <w:t>2.6. Use case chính</w:t>
       </w:r>
@@ -10293,7 +10293,7 @@
         <w:keepNext/>
         <w:spacing w:before="180" w:after="80"/>
       </w:pPr>
-      <w:bookmarkStart w:id="17" w:name="_Toc244174634"/>
+      <w:bookmarkStart w:id="17" w:name="_Toc244324975"/>
       <w:r>
         <w:t>UC-01. Đăng ký người nhà được theo dõi</w:t>
       </w:r>
@@ -10315,7 +10315,7 @@
         <w:keepNext/>
         <w:spacing w:before="180" w:after="80"/>
       </w:pPr>
-      <w:bookmarkStart w:id="18" w:name="_Toc244174635"/>
+      <w:bookmarkStart w:id="18" w:name="_Toc244324976"/>
       <w:r>
         <w:t>UC-02. Người nhà vào xem</w:t>
       </w:r>
@@ -10337,7 +10337,7 @@
         <w:keepNext/>
         <w:spacing w:before="180" w:after="80"/>
       </w:pPr>
-      <w:bookmarkStart w:id="19" w:name="_Toc244174636"/>
+      <w:bookmarkStart w:id="19" w:name="_Toc244324977"/>
       <w:r>
         <w:t>UC-03. Cập nhật trạng thái ca phẫu thuật</w:t>
       </w:r>
@@ -10359,7 +10359,7 @@
         <w:keepNext/>
         <w:spacing w:before="180" w:after="80"/>
       </w:pPr>
-      <w:bookmarkStart w:id="20" w:name="_Toc244174637"/>
+      <w:bookmarkStart w:id="20" w:name="_Toc244324978"/>
       <w:r>
         <w:t>UC-04. Theo dõi trạng thái và nhận thông báo</w:t>
       </w:r>
@@ -10382,7 +10382,7 @@
         <w:spacing w:after="240"/>
         <w:jc w:val="center"/>
       </w:pPr>
-      <w:bookmarkStart w:id="21" w:name="_Toc244174638"/>
+      <w:bookmarkStart w:id="21" w:name="_Toc244324979"/>
       <w:r>
         <w:t>CHƯƠNG 3. KẾ HOẠCH DỰ ÁN</w:t>
       </w:r>
@@ -10394,7 +10394,7 @@
         <w:keepNext/>
         <w:spacing w:before="240" w:after="120"/>
       </w:pPr>
-      <w:bookmarkStart w:id="22" w:name="_Toc244174639"/>
+      <w:bookmarkStart w:id="22" w:name="_Toc244324980"/>
       <w:r>
         <w:t>3.1. Mô hình quản lý</w:t>
       </w:r>
@@ -10500,7 +10500,7 @@
         <w:keepNext/>
         <w:spacing w:before="240" w:after="120"/>
       </w:pPr>
-      <w:bookmarkStart w:id="23" w:name="_Toc244174640"/>
+      <w:bookmarkStart w:id="23" w:name="_Toc244324981"/>
       <w:r>
         <w:t>3.2. Kế hoạch sprint</w:t>
       </w:r>
@@ -11327,7 +11327,7 @@
         <w:keepNext/>
         <w:spacing w:before="240" w:after="120"/>
       </w:pPr>
-      <w:bookmarkStart w:id="24" w:name="_Toc244174641"/>
+      <w:bookmarkStart w:id="24" w:name="_Toc244324982"/>
       <w:r>
         <w:t>3.3. Phân công</w:t>
       </w:r>
@@ -11881,7 +11881,7 @@
         <w:keepNext/>
         <w:spacing w:before="240" w:after="120"/>
       </w:pPr>
-      <w:bookmarkStart w:id="25" w:name="_Toc244174642"/>
+      <w:bookmarkStart w:id="25" w:name="_Toc244324983"/>
       <w:r>
         <w:t>3.4. Rủi ro và hướng xử lý</w:t>
       </w:r>
@@ -12531,7 +12531,7 @@
         <w:spacing w:after="240"/>
         <w:jc w:val="center"/>
       </w:pPr>
-      <w:bookmarkStart w:id="26" w:name="_Toc244174643"/>
+      <w:bookmarkStart w:id="26" w:name="_Toc244324984"/>
       <w:r>
         <w:t>CHƯƠNG 4. THIẾT KẾ HỆ THỐNG</w:t>
       </w:r>
@@ -12543,7 +12543,7 @@
         <w:keepNext/>
         <w:spacing w:before="240" w:after="120"/>
       </w:pPr>
-      <w:bookmarkStart w:id="27" w:name="_Toc244174644"/>
+      <w:bookmarkStart w:id="27" w:name="_Toc244324985"/>
       <w:r>
         <w:t>4.1. Kiến trúc tổng thể</w:t>
       </w:r>
@@ -12580,10 +12580,10 @@
           <w:noProof/>
         </w:rPr>
         <w:drawing>
-          <wp:inline distT="0" distB="0" distL="0" distR="0" wp14:anchorId="6651B854" wp14:editId="68194CD9">
+          <wp:inline distT="0" distB="0" distL="0" distR="0" wp14:anchorId="1EA4C3F4" wp14:editId="31FE3797">
             <wp:extent cx="5581650" cy="2447925"/>
             <wp:effectExtent l="0" t="0" r="0" b="0"/>
-            <wp:docPr id="815868866" name="Picture 815868866"/>
+            <wp:docPr id="977769613" name="Picture 977769613"/>
             <wp:cNvGraphicFramePr>
               <a:graphicFrameLocks xmlns:a="http://schemas.openxmlformats.org/drawingml/2006/main" noChangeAspect="1"/>
             </wp:cNvGraphicFramePr>
@@ -12651,7 +12651,7 @@
         <w:keepNext/>
         <w:spacing w:before="240" w:after="120"/>
       </w:pPr>
-      <w:bookmarkStart w:id="28" w:name="_Toc244174645"/>
+      <w:bookmarkStart w:id="28" w:name="_Toc244324986"/>
       <w:r>
         <w:t>4.2. Lựa chọn công nghệ</w:t>
       </w:r>
@@ -13585,7 +13585,7 @@
         <w:keepNext/>
         <w:spacing w:before="240" w:after="120"/>
       </w:pPr>
-      <w:bookmarkStart w:id="29" w:name="_Toc244174646"/>
+      <w:bookmarkStart w:id="29" w:name="_Toc244324987"/>
       <w:r>
         <w:t>4.3. Tổ chức mã nguồn</w:t>
       </w:r>
@@ -13711,7 +13711,7 @@
         <w:keepNext/>
         <w:spacing w:before="240" w:after="120"/>
       </w:pPr>
-      <w:bookmarkStart w:id="30" w:name="_Toc244174647"/>
+      <w:bookmarkStart w:id="30" w:name="_Toc244324988"/>
       <w:r>
         <w:t>4.4. Thiết kế cơ sở dữ liệu</w:t>
       </w:r>
@@ -13738,10 +13738,10 @@
           <w:noProof/>
         </w:rPr>
         <w:drawing>
-          <wp:inline distT="0" distB="0" distL="0" distR="0" wp14:anchorId="2DA614F9" wp14:editId="577F5CC3">
+          <wp:inline distT="0" distB="0" distL="0" distR="0" wp14:anchorId="00A76E6E" wp14:editId="32442BE2">
             <wp:extent cx="5581650" cy="2771775"/>
             <wp:effectExtent l="0" t="0" r="0" b="0"/>
-            <wp:docPr id="1369081909" name="Picture 1369081909"/>
+            <wp:docPr id="2016474759" name="Picture 2016474759"/>
             <wp:cNvGraphicFramePr>
               <a:graphicFrameLocks xmlns:a="http://schemas.openxmlformats.org/drawingml/2006/main" noChangeAspect="1"/>
             </wp:cNvGraphicFramePr>
@@ -14921,7 +14921,7 @@
         <w:keepNext/>
         <w:spacing w:before="240" w:after="120"/>
       </w:pPr>
-      <w:bookmarkStart w:id="31" w:name="_Toc244174648"/>
+      <w:bookmarkStart w:id="31" w:name="_Toc244324989"/>
       <w:r>
         <w:t>4.5. Thiết kế API</w:t>
       </w:r>
@@ -16245,7 +16245,7 @@
         <w:keepNext/>
         <w:spacing w:before="240" w:after="120"/>
       </w:pPr>
-      <w:bookmarkStart w:id="32" w:name="_Toc244174649"/>
+      <w:bookmarkStart w:id="32" w:name="_Toc244324990"/>
       <w:r>
         <w:t>4.6. Luồng gửi thông báo</w:t>
       </w:r>
@@ -16272,10 +16272,10 @@
           <w:noProof/>
         </w:rPr>
         <w:drawing>
-          <wp:inline distT="0" distB="0" distL="0" distR="0" wp14:anchorId="4C16898B" wp14:editId="17A77822">
+          <wp:inline distT="0" distB="0" distL="0" distR="0" wp14:anchorId="7C54403C" wp14:editId="47313FE9">
             <wp:extent cx="5581650" cy="2657475"/>
             <wp:effectExtent l="0" t="0" r="0" b="0"/>
-            <wp:docPr id="905761092" name="Picture 905761092"/>
+            <wp:docPr id="1374626076" name="Picture 1374626076"/>
             <wp:cNvGraphicFramePr>
               <a:graphicFrameLocks xmlns:a="http://schemas.openxmlformats.org/drawingml/2006/main" noChangeAspect="1"/>
             </wp:cNvGraphicFramePr>
@@ -16343,7 +16343,7 @@
         <w:keepNext/>
         <w:spacing w:before="240" w:after="120"/>
       </w:pPr>
-      <w:bookmarkStart w:id="33" w:name="_Toc244174650"/>
+      <w:bookmarkStart w:id="33" w:name="_Toc244324991"/>
       <w:r>
         <w:t>4.7. Thiết kế bảo mật và quyền riêng tư</w:t>
       </w:r>
@@ -17079,7 +17079,7 @@
         <w:spacing w:after="240"/>
         <w:jc w:val="center"/>
       </w:pPr>
-      <w:bookmarkStart w:id="34" w:name="_Toc244174651"/>
+      <w:bookmarkStart w:id="34" w:name="_Toc244324992"/>
       <w:r>
         <w:t>CHƯƠNG 5. XÂY DỰNG SẢN PHẨM</w:t>
       </w:r>
@@ -17101,7 +17101,7 @@
         <w:keepNext/>
         <w:spacing w:before="240" w:after="120"/>
       </w:pPr>
-      <w:bookmarkStart w:id="35" w:name="_Toc244174652"/>
+      <w:bookmarkStart w:id="35" w:name="_Toc244324993"/>
       <w:r>
         <w:t>5.1. Trang chủ và đăng nhập</w:t>
       </w:r>
@@ -17128,10 +17128,10 @@
           <w:noProof/>
         </w:rPr>
         <w:drawing>
-          <wp:inline distT="0" distB="0" distL="0" distR="0" wp14:anchorId="0EB873A4" wp14:editId="55391266">
+          <wp:inline distT="0" distB="0" distL="0" distR="0" wp14:anchorId="476DA47C" wp14:editId="544C16E4">
             <wp:extent cx="4324350" cy="3629025"/>
             <wp:effectExtent l="0" t="0" r="0" b="0"/>
-            <wp:docPr id="74332817" name="Picture 74332817"/>
+            <wp:docPr id="826808761" name="Picture 826808761"/>
             <wp:cNvGraphicFramePr>
               <a:graphicFrameLocks xmlns:a="http://schemas.openxmlformats.org/drawingml/2006/main" noChangeAspect="1"/>
             </wp:cNvGraphicFramePr>
@@ -17199,7 +17199,7 @@
         <w:keepNext/>
         <w:spacing w:before="240" w:after="120"/>
       </w:pPr>
-      <w:bookmarkStart w:id="36" w:name="_Toc244174653"/>
+      <w:bookmarkStart w:id="36" w:name="_Toc244324994"/>
       <w:r>
         <w:t>5.2. Chức năng của nhân viên y tế</w:t>
       </w:r>
@@ -17211,7 +17211,7 @@
         <w:keepNext/>
         <w:spacing w:before="180" w:after="80"/>
       </w:pPr>
-      <w:bookmarkStart w:id="37" w:name="_Toc244174654"/>
+      <w:bookmarkStart w:id="37" w:name="_Toc244324995"/>
       <w:r>
         <w:t>Danh sách ca và tạo ca</w:t>
       </w:r>
@@ -17238,10 +17238,10 @@
           <w:noProof/>
         </w:rPr>
         <w:drawing>
-          <wp:inline distT="0" distB="0" distL="0" distR="0" wp14:anchorId="0983B943" wp14:editId="1D66E987">
+          <wp:inline distT="0" distB="0" distL="0" distR="0" wp14:anchorId="06170D9C" wp14:editId="3D71D8E9">
             <wp:extent cx="5581650" cy="3752850"/>
             <wp:effectExtent l="0" t="0" r="0" b="0"/>
-            <wp:docPr id="2106151516" name="Picture 2106151516"/>
+            <wp:docPr id="1954977369" name="Picture 1954977369"/>
             <wp:cNvGraphicFramePr>
               <a:graphicFrameLocks xmlns:a="http://schemas.openxmlformats.org/drawingml/2006/main" noChangeAspect="1"/>
             </wp:cNvGraphicFramePr>
@@ -17309,7 +17309,7 @@
         <w:keepNext/>
         <w:spacing w:before="180" w:after="80"/>
       </w:pPr>
-      <w:bookmarkStart w:id="38" w:name="_Toc244174655"/>
+      <w:bookmarkStart w:id="38" w:name="_Toc244324996"/>
       <w:r>
         <w:t>Cập nhật trạng thái</w:t>
       </w:r>
@@ -17336,10 +17336,10 @@
           <w:noProof/>
         </w:rPr>
         <w:drawing>
-          <wp:inline distT="0" distB="0" distL="0" distR="0" wp14:anchorId="10199DA3" wp14:editId="41C13588">
+          <wp:inline distT="0" distB="0" distL="0" distR="0" wp14:anchorId="539B482C" wp14:editId="072C9E8C">
             <wp:extent cx="4324350" cy="5572125"/>
             <wp:effectExtent l="0" t="0" r="0" b="0"/>
-            <wp:docPr id="99191572" name="Picture 99191572"/>
+            <wp:docPr id="1142778104" name="Picture 1142778104"/>
             <wp:cNvGraphicFramePr>
               <a:graphicFrameLocks xmlns:a="http://schemas.openxmlformats.org/drawingml/2006/main" noChangeAspect="1"/>
             </wp:cNvGraphicFramePr>
@@ -17407,7 +17407,7 @@
         <w:keepNext/>
         <w:spacing w:before="180" w:after="80"/>
       </w:pPr>
-      <w:bookmarkStart w:id="39" w:name="_Toc244174656"/>
+      <w:bookmarkStart w:id="39" w:name="_Toc244324997"/>
       <w:r>
         <w:t>Đăng ký người nhà được theo dõi</w:t>
       </w:r>
@@ -17434,10 +17434,10 @@
           <w:noProof/>
         </w:rPr>
         <w:drawing>
-          <wp:inline distT="0" distB="0" distL="0" distR="0" wp14:anchorId="2C2F688A" wp14:editId="31CA5093">
+          <wp:inline distT="0" distB="0" distL="0" distR="0" wp14:anchorId="55CB1D2D" wp14:editId="6C2B29A7">
             <wp:extent cx="4324350" cy="5676900"/>
             <wp:effectExtent l="0" t="0" r="0" b="0"/>
-            <wp:docPr id="1921934048" name="Picture 1921934048"/>
+            <wp:docPr id="1662507669" name="Picture 1662507669"/>
             <wp:cNvGraphicFramePr>
               <a:graphicFrameLocks xmlns:a="http://schemas.openxmlformats.org/drawingml/2006/main" noChangeAspect="1"/>
             </wp:cNvGraphicFramePr>
@@ -17505,7 +17505,7 @@
         <w:keepNext/>
         <w:spacing w:before="240" w:after="120"/>
       </w:pPr>
-      <w:bookmarkStart w:id="40" w:name="_Toc244174657"/>
+      <w:bookmarkStart w:id="40" w:name="_Toc244324998"/>
       <w:r>
         <w:t>5.3. Ứng dụng của người nhà</w:t>
       </w:r>
@@ -17532,10 +17532,10 @@
           <w:noProof/>
         </w:rPr>
         <w:drawing>
-          <wp:inline distT="0" distB="0" distL="0" distR="0" wp14:anchorId="3981D418" wp14:editId="44B27B81">
+          <wp:inline distT="0" distB="0" distL="0" distR="0" wp14:anchorId="4EE9D17F" wp14:editId="7B16C947">
             <wp:extent cx="2343150" cy="5067300"/>
             <wp:effectExtent l="0" t="0" r="0" b="0"/>
-            <wp:docPr id="1775861573" name="Picture 1775861573"/>
+            <wp:docPr id="1162639255" name="Picture 1162639255"/>
             <wp:cNvGraphicFramePr>
               <a:graphicFrameLocks xmlns:a="http://schemas.openxmlformats.org/drawingml/2006/main" noChangeAspect="1"/>
             </wp:cNvGraphicFramePr>
@@ -17608,10 +17608,10 @@
           <w:noProof/>
         </w:rPr>
         <w:drawing>
-          <wp:inline distT="0" distB="0" distL="0" distR="0" wp14:anchorId="0E38D517" wp14:editId="355382F0">
+          <wp:inline distT="0" distB="0" distL="0" distR="0" wp14:anchorId="3434A852" wp14:editId="632A319F">
             <wp:extent cx="2343150" cy="7010400"/>
             <wp:effectExtent l="0" t="0" r="0" b="0"/>
-            <wp:docPr id="1880339110" name="Picture 1880339110"/>
+            <wp:docPr id="824262759" name="Picture 824262759"/>
             <wp:cNvGraphicFramePr>
               <a:graphicFrameLocks xmlns:a="http://schemas.openxmlformats.org/drawingml/2006/main" noChangeAspect="1"/>
             </wp:cNvGraphicFramePr>
@@ -17684,10 +17684,10 @@
           <w:noProof/>
         </w:rPr>
         <w:drawing>
-          <wp:inline distT="0" distB="0" distL="0" distR="0" wp14:anchorId="5FD2F1C6" wp14:editId="3A9228CC">
+          <wp:inline distT="0" distB="0" distL="0" distR="0" wp14:anchorId="64BE86D0" wp14:editId="7C46C289">
             <wp:extent cx="2343150" cy="5067300"/>
             <wp:effectExtent l="0" t="0" r="0" b="0"/>
-            <wp:docPr id="1469038681" name="Picture 1469038681"/>
+            <wp:docPr id="969986321" name="Picture 969986321"/>
             <wp:cNvGraphicFramePr>
               <a:graphicFrameLocks xmlns:a="http://schemas.openxmlformats.org/drawingml/2006/main" noChangeAspect="1"/>
             </wp:cNvGraphicFramePr>
@@ -17760,10 +17760,10 @@
           <w:noProof/>
         </w:rPr>
         <w:drawing>
-          <wp:inline distT="0" distB="0" distL="0" distR="0" wp14:anchorId="1433FB38" wp14:editId="29395668">
+          <wp:inline distT="0" distB="0" distL="0" distR="0" wp14:anchorId="41A1EDF7" wp14:editId="7C3301A8">
             <wp:extent cx="2343150" cy="5067300"/>
             <wp:effectExtent l="0" t="0" r="0" b="0"/>
-            <wp:docPr id="1181807354" name="Picture 1181807354"/>
+            <wp:docPr id="1530178460" name="Picture 1530178460"/>
             <wp:cNvGraphicFramePr>
               <a:graphicFrameLocks xmlns:a="http://schemas.openxmlformats.org/drawingml/2006/main" noChangeAspect="1"/>
             </wp:cNvGraphicFramePr>
@@ -17836,10 +17836,10 @@
           <w:noProof/>
         </w:rPr>
         <w:drawing>
-          <wp:inline distT="0" distB="0" distL="0" distR="0" wp14:anchorId="17B49D10" wp14:editId="06FA3B05">
+          <wp:inline distT="0" distB="0" distL="0" distR="0" wp14:anchorId="4BD37D92" wp14:editId="0B85277A">
             <wp:extent cx="2343150" cy="5067300"/>
             <wp:effectExtent l="0" t="0" r="0" b="0"/>
-            <wp:docPr id="292334328" name="Picture 292334328"/>
+            <wp:docPr id="2091970337" name="Picture 2091970337"/>
             <wp:cNvGraphicFramePr>
               <a:graphicFrameLocks xmlns:a="http://schemas.openxmlformats.org/drawingml/2006/main" noChangeAspect="1"/>
             </wp:cNvGraphicFramePr>
@@ -17922,10 +17922,10 @@
           <w:noProof/>
         </w:rPr>
         <w:drawing>
-          <wp:inline distT="0" distB="0" distL="0" distR="0" wp14:anchorId="48B6D7E0" wp14:editId="29849AE5">
+          <wp:inline distT="0" distB="0" distL="0" distR="0" wp14:anchorId="0E483A35" wp14:editId="03EDB04A">
             <wp:extent cx="2343150" cy="5067300"/>
             <wp:effectExtent l="0" t="0" r="0" b="0"/>
-            <wp:docPr id="251124989" name="Picture 251124989"/>
+            <wp:docPr id="1393661826" name="Picture 1393661826"/>
             <wp:cNvGraphicFramePr>
               <a:graphicFrameLocks xmlns:a="http://schemas.openxmlformats.org/drawingml/2006/main" noChangeAspect="1"/>
             </wp:cNvGraphicFramePr>
@@ -17998,10 +17998,10 @@
           <w:noProof/>
         </w:rPr>
         <w:drawing>
-          <wp:inline distT="0" distB="0" distL="0" distR="0" wp14:anchorId="5F3719F5" wp14:editId="5FEBB2E1">
+          <wp:inline distT="0" distB="0" distL="0" distR="0" wp14:anchorId="5090C0BA" wp14:editId="5C3E821A">
             <wp:extent cx="2343150" cy="5067300"/>
             <wp:effectExtent l="0" t="0" r="0" b="0"/>
-            <wp:docPr id="2121432387" name="Picture 2121432387"/>
+            <wp:docPr id="1972272826" name="Picture 1972272826"/>
             <wp:cNvGraphicFramePr>
               <a:graphicFrameLocks xmlns:a="http://schemas.openxmlformats.org/drawingml/2006/main" noChangeAspect="1"/>
             </wp:cNvGraphicFramePr>
@@ -18074,10 +18074,10 @@
           <w:noProof/>
         </w:rPr>
         <w:drawing>
-          <wp:inline distT="0" distB="0" distL="0" distR="0" wp14:anchorId="703A4AA3" wp14:editId="074E3472">
+          <wp:inline distT="0" distB="0" distL="0" distR="0" wp14:anchorId="6511F3D0" wp14:editId="7CC360A1">
             <wp:extent cx="2343150" cy="5067300"/>
             <wp:effectExtent l="0" t="0" r="0" b="0"/>
-            <wp:docPr id="416729527" name="Picture 416729527"/>
+            <wp:docPr id="1930435938" name="Picture 1930435938"/>
             <wp:cNvGraphicFramePr>
               <a:graphicFrameLocks xmlns:a="http://schemas.openxmlformats.org/drawingml/2006/main" noChangeAspect="1"/>
             </wp:cNvGraphicFramePr>
@@ -18145,7 +18145,7 @@
         <w:keepNext/>
         <w:spacing w:before="240" w:after="120"/>
       </w:pPr>
-      <w:bookmarkStart w:id="41" w:name="_Toc244174658"/>
+      <w:bookmarkStart w:id="41" w:name="_Toc244324999"/>
       <w:r>
         <w:t>5.4. Trang quản trị</w:t>
       </w:r>
@@ -18225,10 +18225,10 @@
           <w:noProof/>
         </w:rPr>
         <w:drawing>
-          <wp:inline distT="0" distB="0" distL="0" distR="0" wp14:anchorId="5E3EBC2C" wp14:editId="27C5DE1F">
+          <wp:inline distT="0" distB="0" distL="0" distR="0" wp14:anchorId="6E5EFA2B" wp14:editId="4CB04339">
             <wp:extent cx="5581650" cy="4714875"/>
             <wp:effectExtent l="0" t="0" r="0" b="0"/>
-            <wp:docPr id="1095091099" name="Picture 1095091099"/>
+            <wp:docPr id="947030993" name="Picture 947030993"/>
             <wp:cNvGraphicFramePr>
               <a:graphicFrameLocks xmlns:a="http://schemas.openxmlformats.org/drawingml/2006/main" noChangeAspect="1"/>
             </wp:cNvGraphicFramePr>
@@ -18301,10 +18301,10 @@
           <w:noProof/>
         </w:rPr>
         <w:drawing>
-          <wp:inline distT="0" distB="0" distL="0" distR="0" wp14:anchorId="6CE70195" wp14:editId="7534A56A">
+          <wp:inline distT="0" distB="0" distL="0" distR="0" wp14:anchorId="210FC870" wp14:editId="75892549">
             <wp:extent cx="5581650" cy="3752850"/>
             <wp:effectExtent l="0" t="0" r="0" b="0"/>
-            <wp:docPr id="229543028" name="Picture 229543028"/>
+            <wp:docPr id="1930787342" name="Picture 1930787342"/>
             <wp:cNvGraphicFramePr>
               <a:graphicFrameLocks xmlns:a="http://schemas.openxmlformats.org/drawingml/2006/main" noChangeAspect="1"/>
             </wp:cNvGraphicFramePr>
@@ -18372,7 +18372,7 @@
         <w:keepNext/>
         <w:spacing w:before="240" w:after="120"/>
       </w:pPr>
-      <w:bookmarkStart w:id="42" w:name="_Toc244174659"/>
+      <w:bookmarkStart w:id="42" w:name="_Toc244325000"/>
       <w:r>
         <w:t>5.5. Thông báo và cập nhật thời gian thực</w:t>
       </w:r>
@@ -18395,7 +18395,7 @@
         <w:spacing w:after="240"/>
         <w:jc w:val="center"/>
       </w:pPr>
-      <w:bookmarkStart w:id="43" w:name="_Toc244174660"/>
+      <w:bookmarkStart w:id="43" w:name="_Toc244325001"/>
       <w:r>
         <w:t>CHƯƠNG 6. KIỂM THỬ VÀ ĐÁNH GIÁ</w:t>
       </w:r>
@@ -18417,7 +18417,7 @@
         <w:keepNext/>
         <w:spacing w:before="240" w:after="120"/>
       </w:pPr>
-      <w:bookmarkStart w:id="44" w:name="_Toc244174661"/>
+      <w:bookmarkStart w:id="44" w:name="_Toc244325002"/>
       <w:r>
         <w:t>6.1. Chiến lược kiểm thử</w:t>
       </w:r>
@@ -18855,7 +18855,7 @@
                 <w:sz w:val="22"/>
                 <w:szCs w:val="22"/>
               </w:rPr>
-              <w:t>56 test</w:t>
+              <w:t>57 test</w:t>
             </w:r>
           </w:p>
         </w:tc>
@@ -19244,7 +19244,7 @@
         <w:keepNext/>
         <w:spacing w:before="240" w:after="120"/>
       </w:pPr>
-      <w:bookmarkStart w:id="45" w:name="_Toc244174662"/>
+      <w:bookmarkStart w:id="45" w:name="_Toc244325003"/>
       <w:r>
         <w:t>6.2. Kết quả tổng hợp</w:t>
       </w:r>
@@ -19264,7 +19264,7 @@
           <w:b/>
           <w:bCs/>
         </w:rPr>
-        <w:t>54 test case</w:t>
+        <w:t>55 test case</w:t>
       </w:r>
       <w:r>
         <w:t xml:space="preserve"> được đặc tả trong file Excel kết quả kiểm thử, </w:t>
@@ -19274,7 +19274,7 @@
           <w:b/>
           <w:bCs/>
         </w:rPr>
-        <w:t>cả 54 đều đạt</w:t>
+        <w:t>cả 55 đều đạt</w:t>
       </w:r>
       <w:r>
         <w:t>. TC-31 (thông báo đẩy FCM tới iPhone thật khi đang tắt màn hình) được kiểm thử thủ công ngày 29/10/2026 với dự án Firebase của nhóm. Mỗi test case đạt đều có ảnh minh chứng trong thư mục docs/kiem-thu/anh. Độ bao phủ mã của API khi chạy gộp unit và e2e (báo cáo chi tiết từng file: ảnh KQ-03-coverage.png):</w:t>
@@ -19828,7 +19828,7 @@
         <w:keepNext/>
         <w:spacing w:before="240" w:after="120"/>
       </w:pPr>
-      <w:bookmarkStart w:id="46" w:name="_Toc244174663"/>
+      <w:bookmarkStart w:id="46" w:name="_Toc244325004"/>
       <w:r>
         <w:t>6.3. Kết quả các test case tiêu biểu</w:t>
       </w:r>
@@ -21280,10 +21280,10 @@
           <w:noProof/>
         </w:rPr>
         <w:drawing>
-          <wp:inline distT="0" distB="0" distL="0" distR="0" wp14:anchorId="7FBAD01C" wp14:editId="3CCEC512">
+          <wp:inline distT="0" distB="0" distL="0" distR="0" wp14:anchorId="29684EFE" wp14:editId="21AB284A">
             <wp:extent cx="2343150" cy="5372100"/>
             <wp:effectExtent l="0" t="0" r="0" b="0"/>
-            <wp:docPr id="2064551083" name="Picture 2064551083"/>
+            <wp:docPr id="1043309145" name="Picture 1043309145"/>
             <wp:cNvGraphicFramePr>
               <a:graphicFrameLocks xmlns:a="http://schemas.openxmlformats.org/drawingml/2006/main" noChangeAspect="1"/>
             </wp:cNvGraphicFramePr>
@@ -21351,7 +21351,7 @@
         <w:keepNext/>
         <w:spacing w:before="240" w:after="120"/>
       </w:pPr>
-      <w:bookmarkStart w:id="47" w:name="_Toc244174664"/>
+      <w:bookmarkStart w:id="47" w:name="_Toc244325005"/>
       <w:r>
         <w:t>6.4. Kiểm thử hiệu năng</w:t>
       </w:r>
@@ -22193,10 +22193,10 @@
           <w:noProof/>
         </w:rPr>
         <w:drawing>
-          <wp:inline distT="0" distB="0" distL="0" distR="0" wp14:anchorId="636B29F7" wp14:editId="2135CE30">
+          <wp:inline distT="0" distB="0" distL="0" distR="0" wp14:anchorId="3E355355" wp14:editId="1ECAC36A">
             <wp:extent cx="5038725" cy="1228725"/>
             <wp:effectExtent l="0" t="0" r="0" b="0"/>
-            <wp:docPr id="119864809" name="Picture 119864809"/>
+            <wp:docPr id="211832114" name="Picture 211832114"/>
             <wp:cNvGraphicFramePr>
               <a:graphicFrameLocks xmlns:a="http://schemas.openxmlformats.org/drawingml/2006/main" noChangeAspect="1"/>
             </wp:cNvGraphicFramePr>
@@ -22274,7 +22274,7 @@
         <w:keepNext/>
         <w:spacing w:before="240" w:after="120"/>
       </w:pPr>
-      <w:bookmarkStart w:id="48" w:name="_Toc244174665"/>
+      <w:bookmarkStart w:id="48" w:name="_Toc244325006"/>
       <w:r>
         <w:t>6.5. Lỗi phát hiện và xử lý</w:t>
       </w:r>
@@ -22287,7 +22287,7 @@
         <w:jc w:val="both"/>
       </w:pPr>
       <w:r>
-        <w:t>Trong quá trình kiểm thử, nhóm ghi nhận 17 lỗi vào Bug log; tất cả đã được sửa và có test hồi quy.</w:t>
+        <w:t>Trong quá trình kiểm thử, nhóm ghi nhận 18 lỗi vào Bug log; tất cả đã được sửa và có test hồi quy.</w:t>
       </w:r>
     </w:p>
     <w:p>
@@ -24587,6 +24587,130 @@
           </w:p>
         </w:tc>
       </w:tr>
+      <w:tr>
+        <w:tblPrEx>
+          <w:tblCellMar>
+            <w:top w:w="0" w:type="dxa"/>
+            <w:bottom w:w="0" w:type="dxa"/>
+          </w:tblCellMar>
+        </w:tblPrEx>
+        <w:tc>
+          <w:tcPr>
+            <w:tcW w:w="1026" w:type="dxa"/>
+            <w:tcBorders>
+              <w:top w:val="single" w:sz="4" w:space="0" w:color="8A94A6"/>
+              <w:left w:val="single" w:sz="4" w:space="0" w:color="8A94A6"/>
+              <w:bottom w:val="single" w:sz="4" w:space="0" w:color="8A94A6"/>
+              <w:right w:val="single" w:sz="4" w:space="0" w:color="8A94A6"/>
+            </w:tcBorders>
+            <w:tcMar>
+              <w:top w:w="40" w:type="dxa"/>
+              <w:left w:w="80" w:type="dxa"/>
+              <w:bottom w:w="40" w:type="dxa"/>
+              <w:right w:w="80" w:type="dxa"/>
+            </w:tcMar>
+          </w:tcPr>
+          <w:p>
+            <w:pPr>
+              <w:spacing w:line="276" w:lineRule="auto"/>
+            </w:pPr>
+            <w:r>
+              <w:rPr>
+                <w:sz w:val="22"/>
+                <w:szCs w:val="22"/>
+              </w:rPr>
+              <w:t>BUG-18</w:t>
+            </w:r>
+          </w:p>
+        </w:tc>
+        <w:tc>
+          <w:tcPr>
+            <w:tcW w:w="4449" w:type="dxa"/>
+            <w:tcBorders>
+              <w:top w:val="single" w:sz="4" w:space="0" w:color="8A94A6"/>
+              <w:left w:val="single" w:sz="4" w:space="0" w:color="8A94A6"/>
+              <w:bottom w:val="single" w:sz="4" w:space="0" w:color="8A94A6"/>
+              <w:right w:val="single" w:sz="4" w:space="0" w:color="8A94A6"/>
+            </w:tcBorders>
+            <w:tcMar>
+              <w:top w:w="40" w:type="dxa"/>
+              <w:left w:w="80" w:type="dxa"/>
+              <w:bottom w:w="40" w:type="dxa"/>
+              <w:right w:w="80" w:type="dxa"/>
+            </w:tcMar>
+          </w:tcPr>
+          <w:p>
+            <w:pPr>
+              <w:spacing w:line="276" w:lineRule="auto"/>
+            </w:pPr>
+            <w:r>
+              <w:rPr>
+                <w:sz w:val="22"/>
+                <w:szCs w:val="22"/>
+              </w:rPr>
+              <w:t>Người nhà thứ hai trên cùng điện thoại không nhận thông báo đẩy</w:t>
+            </w:r>
+          </w:p>
+        </w:tc>
+        <w:tc>
+          <w:tcPr>
+            <w:tcW w:w="1369" w:type="dxa"/>
+            <w:tcBorders>
+              <w:top w:val="single" w:sz="4" w:space="0" w:color="8A94A6"/>
+              <w:left w:val="single" w:sz="4" w:space="0" w:color="8A94A6"/>
+              <w:bottom w:val="single" w:sz="4" w:space="0" w:color="8A94A6"/>
+              <w:right w:val="single" w:sz="4" w:space="0" w:color="8A94A6"/>
+            </w:tcBorders>
+            <w:tcMar>
+              <w:top w:w="40" w:type="dxa"/>
+              <w:left w:w="80" w:type="dxa"/>
+              <w:bottom w:w="40" w:type="dxa"/>
+              <w:right w:w="80" w:type="dxa"/>
+            </w:tcMar>
+          </w:tcPr>
+          <w:p>
+            <w:pPr>
+              <w:spacing w:line="276" w:lineRule="auto"/>
+            </w:pPr>
+            <w:r>
+              <w:rPr>
+                <w:sz w:val="22"/>
+                <w:szCs w:val="22"/>
+              </w:rPr>
+              <w:t>Cao</w:t>
+            </w:r>
+          </w:p>
+        </w:tc>
+        <w:tc>
+          <w:tcPr>
+            <w:tcW w:w="2227" w:type="dxa"/>
+            <w:tcBorders>
+              <w:top w:val="single" w:sz="4" w:space="0" w:color="8A94A6"/>
+              <w:left w:val="single" w:sz="4" w:space="0" w:color="8A94A6"/>
+              <w:bottom w:val="single" w:sz="4" w:space="0" w:color="8A94A6"/>
+              <w:right w:val="single" w:sz="4" w:space="0" w:color="8A94A6"/>
+            </w:tcBorders>
+            <w:tcMar>
+              <w:top w:w="40" w:type="dxa"/>
+              <w:left w:w="80" w:type="dxa"/>
+              <w:bottom w:w="40" w:type="dxa"/>
+              <w:right w:w="80" w:type="dxa"/>
+            </w:tcMar>
+          </w:tcPr>
+          <w:p>
+            <w:pPr>
+              <w:spacing w:line="276" w:lineRule="auto"/>
+            </w:pPr>
+            <w:r>
+              <w:rPr>
+                <w:sz w:val="22"/>
+                <w:szCs w:val="22"/>
+              </w:rPr>
+              <w:t>Thử trên iPhone thật</w:t>
+            </w:r>
+          </w:p>
+        </w:tc>
+      </w:tr>
     </w:tbl>
     <w:p>
       <w:pPr>
@@ -24619,7 +24743,7 @@
         <w:keepNext/>
         <w:spacing w:before="240" w:after="120"/>
       </w:pPr>
-      <w:bookmarkStart w:id="49" w:name="_Toc244174666"/>
+      <w:bookmarkStart w:id="49" w:name="_Toc244325007"/>
       <w:r>
         <w:t>6.6. Hạn chế đã biết</w:t>
       </w:r>
@@ -24702,7 +24826,7 @@
         <w:spacing w:after="240"/>
         <w:jc w:val="center"/>
       </w:pPr>
-      <w:bookmarkStart w:id="50" w:name="_Toc244174667"/>
+      <w:bookmarkStart w:id="50" w:name="_Toc244325008"/>
       <w:r>
         <w:t>CHƯƠNG 7. TRIỂN KHAI</w:t>
       </w:r>
@@ -24714,7 +24838,7 @@
         <w:keepNext/>
         <w:spacing w:before="240" w:after="120"/>
       </w:pPr>
-      <w:bookmarkStart w:id="51" w:name="_Toc244174668"/>
+      <w:bookmarkStart w:id="51" w:name="_Toc244325009"/>
       <w:r>
         <w:t>7.1. Đóng gói bằng Docker</w:t>
       </w:r>
@@ -25200,10 +25324,10 @@
           <w:noProof/>
         </w:rPr>
         <w:drawing>
-          <wp:inline distT="0" distB="0" distL="0" distR="0" wp14:anchorId="2833B8AB" wp14:editId="6340388F">
+          <wp:inline distT="0" distB="0" distL="0" distR="0" wp14:anchorId="63B783AF" wp14:editId="1243CA09">
             <wp:extent cx="5038725" cy="1295400"/>
             <wp:effectExtent l="0" t="0" r="0" b="0"/>
-            <wp:docPr id="1759471764" name="Picture 1759471764"/>
+            <wp:docPr id="1443247152" name="Picture 1443247152"/>
             <wp:cNvGraphicFramePr>
               <a:graphicFrameLocks xmlns:a="http://schemas.openxmlformats.org/drawingml/2006/main" noChangeAspect="1"/>
             </wp:cNvGraphicFramePr>
@@ -25271,7 +25395,7 @@
         <w:keepNext/>
         <w:spacing w:before="240" w:after="120"/>
       </w:pPr>
-      <w:bookmarkStart w:id="52" w:name="_Toc244174669"/>
+      <w:bookmarkStart w:id="52" w:name="_Toc244325010"/>
       <w:r>
         <w:t>7.2. Hướng dẫn chạy</w:t>
       </w:r>
@@ -25349,7 +25473,7 @@
         <w:keepNext/>
         <w:spacing w:before="240" w:after="120"/>
       </w:pPr>
-      <w:bookmarkStart w:id="53" w:name="_Toc244174670"/>
+      <w:bookmarkStart w:id="53" w:name="_Toc244325011"/>
       <w:r>
         <w:t>7.3. Sao lưu và khôi phục</w:t>
       </w:r>
@@ -25376,10 +25500,10 @@
           <w:noProof/>
         </w:rPr>
         <w:drawing>
-          <wp:inline distT="0" distB="0" distL="0" distR="0" wp14:anchorId="31C6A7E2" wp14:editId="2D234C17">
+          <wp:inline distT="0" distB="0" distL="0" distR="0" wp14:anchorId="4DAA7F9B" wp14:editId="20EE29F6">
             <wp:extent cx="5038725" cy="2447925"/>
             <wp:effectExtent l="0" t="0" r="0" b="0"/>
-            <wp:docPr id="659154627" name="Picture 659154627"/>
+            <wp:docPr id="1173850906" name="Picture 1173850906"/>
             <wp:cNvGraphicFramePr>
               <a:graphicFrameLocks xmlns:a="http://schemas.openxmlformats.org/drawingml/2006/main" noChangeAspect="1"/>
             </wp:cNvGraphicFramePr>
@@ -25447,7 +25571,7 @@
         <w:keepNext/>
         <w:spacing w:before="240" w:after="120"/>
       </w:pPr>
-      <w:bookmarkStart w:id="54" w:name="_Toc244174671"/>
+      <w:bookmarkStart w:id="54" w:name="_Toc244325012"/>
       <w:r>
         <w:t>7.4. Phương án dự phòng khi báo cáo</w:t>
       </w:r>
@@ -25502,7 +25626,7 @@
         <w:spacing w:after="240"/>
         <w:jc w:val="center"/>
       </w:pPr>
-      <w:bookmarkStart w:id="55" w:name="_Toc244174672"/>
+      <w:bookmarkStart w:id="55" w:name="_Toc244325013"/>
       <w:r>
         <w:t>CHƯƠNG 8. KẾT LUẬN VÀ HƯỚNG PHÁT TRIỂN</w:t>
       </w:r>
@@ -25514,7 +25638,7 @@
         <w:keepNext/>
         <w:spacing w:before="240" w:after="120"/>
       </w:pPr>
-      <w:bookmarkStart w:id="56" w:name="_Toc244174673"/>
+      <w:bookmarkStart w:id="56" w:name="_Toc244325014"/>
       <w:r>
         <w:t>8.1. Kết quả đạt được</w:t>
       </w:r>
@@ -25573,7 +25697,7 @@
         <w:jc w:val="both"/>
       </w:pPr>
       <w:r>
-        <w:t>111 test tự động (coverage 94% statements) và 22 kịch bản giao diện; 54/54 test case đạt, 17 lỗi phát hiện đều đã sửa.</w:t>
+        <w:t>112 test tự động (coverage 94% statements) và 22 kịch bản giao diện; 55/55 test case đạt, 18 lỗi phát hiện đều đã sửa.</w:t>
       </w:r>
     </w:p>
     <w:p>
@@ -25596,7 +25720,7 @@
         <w:keepNext/>
         <w:spacing w:before="240" w:after="120"/>
       </w:pPr>
-      <w:bookmarkStart w:id="57" w:name="_Toc244174674"/>
+      <w:bookmarkStart w:id="57" w:name="_Toc244325015"/>
       <w:r>
         <w:t>8.2. Hạn chế</w:t>
       </w:r>
@@ -25650,7 +25774,7 @@
         <w:keepNext/>
         <w:spacing w:before="240" w:after="120"/>
       </w:pPr>
-      <w:bookmarkStart w:id="58" w:name="_Toc244174675"/>
+      <w:bookmarkStart w:id="58" w:name="_Toc244325016"/>
       <w:r>
         <w:t>8.3. Hướng phát triển</w:t>
       </w:r>
@@ -25747,7 +25871,7 @@
         <w:spacing w:after="240"/>
         <w:jc w:val="center"/>
       </w:pPr>
-      <w:bookmarkStart w:id="59" w:name="_Toc244174676"/>
+      <w:bookmarkStart w:id="59" w:name="_Toc244325017"/>
       <w:r>
         <w:t>TÀI LIỆU THAM KHẢO</w:t>
       </w:r>
@@ -25848,7 +25972,7 @@
         <w:spacing w:after="240"/>
         <w:jc w:val="center"/>
       </w:pPr>
-      <w:bookmarkStart w:id="60" w:name="_Toc244174677"/>
+      <w:bookmarkStart w:id="60" w:name="_Toc244325018"/>
       <w:r>
         <w:t>PHỤ LỤC</w:t>
       </w:r>
@@ -26046,10 +26170,10 @@
 <file path=word/numbering.xml><?xml version="1.0" encoding="utf-8"?>
 <w:numbering xmlns:wpc="http://schemas.microsoft.com/office/word/2010/wordprocessingCanvas" xmlns:cx="http://schemas.microsoft.com/office/drawing/2014/chartex" xmlns:cx1="http://schemas.microsoft.com/office/drawing/2015/9/8/chartex" xmlns:cx2="http://schemas.microsoft.com/office/drawing/2015/10/21/chartex" xmlns:cx3="http://schemas.microsoft.com/office/drawing/2016/5/9/chartex" xmlns:cx4="http://schemas.microsoft.com/office/drawing/2016/5/10/chartex" xmlns:cx5="http://schemas.microsoft.com/office/drawing/2016/5/11/chartex" xmlns:cx6="http://schemas.microsoft.com/office/drawing/2016/5/12/chartex" xmlns:cx7="http://schemas.microsoft.com/office/drawing/2016/5/13/chartex" xmlns:cx8="http://schemas.microsoft.com/office/drawing/2016/5/14/chartex" xmlns:mc="http://schemas.openxmlformats.org/markup-compatibility/2006" xmlns:aink="http://schemas.microsoft.com/office/drawing/2016/ink" xmlns:am3d="http://schemas.microsoft.com/office/drawing/2017/model3d" xmlns:o="urn:schemas-microsoft-com:office:office" xmlns:oel="http://schemas.microsoft.com/office/2019/extlst" xmlns:r="http://schemas.openxmlformats.org/officeDocument/2006/relationships" xmlns:m="http://schemas.openxmlformats.org/officeDocument/2006/math" xmlns:v="urn:schemas-microsoft-com:vml" xmlns:wp14="http://schemas.microsoft.com/office/word/2010/wordprocessingDrawing" xmlns:wp="http://schemas.openxmlformats.org/drawingml/2006/wordprocessingDrawing" xmlns:w10="urn:schemas-microsoft-com:office:word" xmlns:w="http://schemas.openxmlformats.org/wordprocessingml/2006/main" xmlns:w14="http://schemas.microsoft.com/office/word/2010/wordml" xmlns:w15="http://schemas.microsoft.com/office/word/2012/wordml" xmlns:w16cex="http://schemas.microsoft.com/office/word/2018/wordml/cex" xmlns:w16cid="http://schemas.microsoft.com/office/word/2016/wordml/cid" xmlns:w16="http://schemas.microsoft.com/office/word/2018/wordml" xmlns:w16du="http://schemas.microsoft.com/office/word/2023/wordml/word16du" xmlns:w16sdtdh="http://schemas.microsoft.com/office/word/2020/wordml/sdtdatahash" xmlns:w16sdtfl="http://schemas.microsoft.com/office/word/2024/wordml/sdtformatlock" xmlns:w16se="http://schemas.microsoft.com/office/word/2015/wordml/symex" xmlns:wpg="http://schemas.microsoft.com/office/word/2010/wordprocessingGroup" xmlns:wpi="http://schemas.microsoft.com/office/word/2010/wordprocessingInk" xmlns:wne="http://schemas.microsoft.com/office/word/2006/wordml" xmlns:wps="http://schemas.microsoft.com/office/word/2010/wordprocessingShape" mc:Ignorable="w14 w15 w16se w16cid w16 w16cex w16sdtdh w16sdtfl w16du wp14">
   <w:abstractNum w:abstractNumId="0" w15:restartNumberingAfterBreak="0">
-    <w:nsid w:val="30DF28EA"/>
+    <w:nsid w:val="3CFF5253"/>
     <w:multiLevelType w:val="hybridMultilevel"/>
-    <w:tmpl w:val="953C9566"/>
-    <w:lvl w:ilvl="0" w:tplc="0CA0A77E">
+    <w:tmpl w:val="F566077A"/>
+    <w:lvl w:ilvl="0" w:tplc="2EFC0A04">
       <w:start w:val="1"/>
       <w:numFmt w:val="bullet"/>
       <w:lvlText w:val="–"/>
@@ -26058,52 +26182,52 @@
         <w:ind w:left="720" w:hanging="360"/>
       </w:pPr>
     </w:lvl>
-    <w:lvl w:ilvl="1" w:tplc="085853EE">
+    <w:lvl w:ilvl="1" w:tplc="977C09A0">
       <w:numFmt w:val="decimal"/>
       <w:lvlText w:val=""/>
       <w:lvlJc w:val="left"/>
     </w:lvl>
-    <w:lvl w:ilvl="2" w:tplc="6BB81088">
+    <w:lvl w:ilvl="2" w:tplc="BBA2A9C0">
       <w:numFmt w:val="decimal"/>
       <w:lvlText w:val=""/>
       <w:lvlJc w:val="left"/>
     </w:lvl>
-    <w:lvl w:ilvl="3" w:tplc="711CAE9E">
+    <w:lvl w:ilvl="3" w:tplc="D7FA0FA8">
       <w:numFmt w:val="decimal"/>
       <w:lvlText w:val=""/>
       <w:lvlJc w:val="left"/>
     </w:lvl>
-    <w:lvl w:ilvl="4" w:tplc="625859B6">
+    <w:lvl w:ilvl="4" w:tplc="1166D78A">
       <w:numFmt w:val="decimal"/>
       <w:lvlText w:val=""/>
       <w:lvlJc w:val="left"/>
     </w:lvl>
-    <w:lvl w:ilvl="5" w:tplc="2114586C">
+    <w:lvl w:ilvl="5" w:tplc="847055B4">
       <w:numFmt w:val="decimal"/>
       <w:lvlText w:val=""/>
       <w:lvlJc w:val="left"/>
     </w:lvl>
-    <w:lvl w:ilvl="6" w:tplc="AAA28F90">
+    <w:lvl w:ilvl="6" w:tplc="308CDF7A">
       <w:numFmt w:val="decimal"/>
       <w:lvlText w:val=""/>
       <w:lvlJc w:val="left"/>
     </w:lvl>
-    <w:lvl w:ilvl="7" w:tplc="04849416">
+    <w:lvl w:ilvl="7" w:tplc="0D40B0C2">
       <w:numFmt w:val="decimal"/>
       <w:lvlText w:val=""/>
       <w:lvlJc w:val="left"/>
     </w:lvl>
-    <w:lvl w:ilvl="8" w:tplc="B47817AC">
+    <w:lvl w:ilvl="8" w:tplc="7F2C5684">
       <w:numFmt w:val="decimal"/>
       <w:lvlText w:val=""/>
       <w:lvlJc w:val="left"/>
     </w:lvl>
   </w:abstractNum>
   <w:abstractNum w:abstractNumId="1" w15:restartNumberingAfterBreak="0">
-    <w:nsid w:val="30FA2B51"/>
+    <w:nsid w:val="795039A5"/>
     <w:multiLevelType w:val="hybridMultilevel"/>
-    <w:tmpl w:val="4A8070C4"/>
-    <w:lvl w:ilvl="0" w:tplc="9ADEDF26">
+    <w:tmpl w:val="04C2F508"/>
+    <w:lvl w:ilvl="0" w:tplc="CE2CE2CA">
       <w:start w:val="1"/>
       <w:numFmt w:val="bullet"/>
       <w:lvlText w:val="●"/>
@@ -26112,7 +26236,7 @@
         <w:ind w:left="720" w:hanging="360"/>
       </w:pPr>
     </w:lvl>
-    <w:lvl w:ilvl="1" w:tplc="62DC0E38">
+    <w:lvl w:ilvl="1" w:tplc="034E0194">
       <w:start w:val="1"/>
       <w:numFmt w:val="bullet"/>
       <w:lvlText w:val="○"/>
@@ -26121,7 +26245,7 @@
         <w:ind w:left="1440" w:hanging="360"/>
       </w:pPr>
     </w:lvl>
-    <w:lvl w:ilvl="2" w:tplc="D502419A">
+    <w:lvl w:ilvl="2" w:tplc="ED3E0032">
       <w:start w:val="1"/>
       <w:numFmt w:val="bullet"/>
       <w:lvlText w:val="■"/>
@@ -26130,7 +26254,7 @@
         <w:ind w:left="2160" w:hanging="360"/>
       </w:pPr>
     </w:lvl>
-    <w:lvl w:ilvl="3" w:tplc="317A9D40">
+    <w:lvl w:ilvl="3" w:tplc="F3521954">
       <w:start w:val="1"/>
       <w:numFmt w:val="bullet"/>
       <w:lvlText w:val="●"/>
@@ -26139,7 +26263,7 @@
         <w:ind w:left="2880" w:hanging="360"/>
       </w:pPr>
     </w:lvl>
-    <w:lvl w:ilvl="4" w:tplc="29F29172">
+    <w:lvl w:ilvl="4" w:tplc="2E584B1A">
       <w:start w:val="1"/>
       <w:numFmt w:val="bullet"/>
       <w:lvlText w:val="○"/>
@@ -26148,7 +26272,7 @@
         <w:ind w:left="3600" w:hanging="360"/>
       </w:pPr>
     </w:lvl>
-    <w:lvl w:ilvl="5" w:tplc="41AA6CE4">
+    <w:lvl w:ilvl="5" w:tplc="AB767158">
       <w:start w:val="1"/>
       <w:numFmt w:val="bullet"/>
       <w:lvlText w:val="■"/>
@@ -26157,7 +26281,7 @@
         <w:ind w:left="4320" w:hanging="360"/>
       </w:pPr>
     </w:lvl>
-    <w:lvl w:ilvl="6" w:tplc="D83C07CC">
+    <w:lvl w:ilvl="6" w:tplc="D4683880">
       <w:start w:val="1"/>
       <w:numFmt w:val="bullet"/>
       <w:lvlText w:val="●"/>
@@ -26166,7 +26290,7 @@
         <w:ind w:left="5040" w:hanging="360"/>
       </w:pPr>
     </w:lvl>
-    <w:lvl w:ilvl="7" w:tplc="84506A56">
+    <w:lvl w:ilvl="7" w:tplc="0FBE4D6A">
       <w:start w:val="1"/>
       <w:numFmt w:val="bullet"/>
       <w:lvlText w:val="●"/>
@@ -26175,7 +26299,7 @@
         <w:ind w:left="5760" w:hanging="360"/>
       </w:pPr>
     </w:lvl>
-    <w:lvl w:ilvl="8" w:tplc="E5D821F2">
+    <w:lvl w:ilvl="8" w:tplc="2C38C83E">
       <w:start w:val="1"/>
       <w:numFmt w:val="bullet"/>
       <w:lvlText w:val="●"/>
@@ -26185,13 +26309,13 @@
       </w:pPr>
     </w:lvl>
   </w:abstractNum>
-  <w:num w:numId="1" w16cid:durableId="1132093022">
+  <w:num w:numId="1" w16cid:durableId="655651012">
     <w:abstractNumId w:val="1"/>
     <w:lvlOverride w:ilvl="0">
       <w:startOverride w:val="1"/>
     </w:lvlOverride>
   </w:num>
-  <w:num w:numId="2" w16cid:durableId="1390305565">
+  <w:num w:numId="2" w16cid:durableId="35279337">
     <w:abstractNumId w:val="0"/>
     <w:lvlOverride w:ilvl="0">
       <w:startOverride w:val="1"/>
@@ -26775,7 +26899,7 @@
     <w:autoRedefine/>
     <w:uiPriority w:val="39"/>
     <w:unhideWhenUsed/>
-    <w:rsid w:val="00BE390D"/>
+    <w:rsid w:val="00923CA7"/>
     <w:pPr>
       <w:spacing w:after="100"/>
     </w:pPr>
@@ -26787,7 +26911,7 @@
     <w:autoRedefine/>
     <w:uiPriority w:val="39"/>
     <w:unhideWhenUsed/>
-    <w:rsid w:val="00BE390D"/>
+    <w:rsid w:val="00923CA7"/>
     <w:pPr>
       <w:spacing w:after="100"/>
       <w:ind w:left="260"/>
@@ -26800,7 +26924,7 @@
     <w:autoRedefine/>
     <w:uiPriority w:val="39"/>
     <w:unhideWhenUsed/>
-    <w:rsid w:val="00BE390D"/>
+    <w:rsid w:val="00923CA7"/>
     <w:pPr>
       <w:spacing w:after="100"/>
       <w:ind w:left="520"/>

</xml_diff>